<commit_message>
Strict methodology compliance: only tags/attributes named in the lab (remove script/canvas, area alt, img title, vlink, br clear, strong, heading align); report updated
</commit_message>
<xml_diff>
--- a/Отчет_ЛБ1_Суранбаев_Байтур.docx
+++ b/Отчет_ЛБ1_Суранбаев_Байтур.docx
@@ -738,7 +738,7 @@
         <w:t>html, head, title, body</w:t>
       </w:r>
       <w:r>
-        <w:t xml:space="preserve"> – основная структура документа: html – корневой элемент, head – служебная часть, title – заголовок окна браузера, body – содержимое страницы. Атрибуты body: bgcolor (цвет фона), background (фоновый рисунок), text (цвет текста), link, vlink (цвет ссылок).</w:t>
+        <w:t xml:space="preserve"> – основная структура документа: html – корневой элемент, head – служебная часть, title – заголовок окна браузера, body – содержимое страницы. Атрибуты body: bgcolor (цвет фона), background (фоновый рисунок), text (цвет текста), link (цвет ссылок).</w:t>
       </w:r>
     </w:p>
     <w:p>
@@ -798,7 +798,7 @@
         <w:t>br</w:t>
       </w:r>
       <w:r>
-        <w:t xml:space="preserve"> – перенос строки; br clear="all" отменяет обтекание картинки.</w:t>
+        <w:t xml:space="preserve"> – перенос строки (непарный тег).</w:t>
       </w:r>
     </w:p>
     <w:p>
@@ -810,10 +810,10 @@
         <w:rPr>
           <w:b/>
         </w:rPr>
-        <w:t>b, i, u, s, em, strong</w:t>
-      </w:r>
-      <w:r>
-        <w:t xml:space="preserve"> – выделение текста: жирный, курсив, подчёркнутый, зачёркнутый (физическое форматирование), логическое выделение (em, strong).</w:t>
+        <w:t>b, i, u, s, em</w:t>
+      </w:r>
+      <w:r>
+        <w:t xml:space="preserve"> – выделение текста: жирный, курсив, подчёркнутый, зачёркнутый (физическое форматирование), логическое выделение (em).</w:t>
       </w:r>
     </w:p>
     <w:p>
@@ -963,7 +963,7 @@
         <w:t>img</w:t>
       </w:r>
       <w:r>
-        <w:t xml:space="preserve"> – изображение: src – путь к файлу, width, height – размеры, alt – альтернативный текст, title – подсказка, align – выравнивание и обтекание текстом, hspace, vspace – отступы, border – рамка, usemap – ссылка на карту изображений.</w:t>
+        <w:t xml:space="preserve"> – изображение: src – путь к файлу, width, height – размеры, alt – альтернативный текст, align – выравнивание и обтекание текстом, hspace, vspace – отступы, border – рамка, usemap – ссылка на карту изображений.</w:t>
       </w:r>
     </w:p>
     <w:p>
@@ -978,7 +978,7 @@
         <w:t>map, area</w:t>
       </w:r>
       <w:r>
-        <w:t xml:space="preserve"> – карта изображений. map name – имя карты; area – активная область: shape (rect, circle, poly), coords – координаты, href – адрес перехода или nohref – без перехода, title, alt.</w:t>
+        <w:t xml:space="preserve"> – карта изображений. map name – имя карты; area – активная область: shape (rect, circle, poly), coords – координаты, href – адрес перехода или nohref – без перехода, title – всплывающая подсказка.</w:t>
       </w:r>
     </w:p>
     <w:p>
@@ -1154,7 +1154,7 @@
           <w:b w:val="0"/>
           <w:i w:val="0"/>
         </w:rPr>
-        <w:t>ФИО автора оформлено тегом font (face, size, color): подчёркивание снизу, тень текста и выравнивание справа.</w:t>
+        <w:t>ФИО автора оформлено тегом font: атрибутами face, size, color заданы шрифт, размер и цвет, а подчёркивание снизу, тень текста и выравнивание справа заданы атрибутом style этого же тега font (text-decoration, text-shadow, text-align), так как отдельных атрибутов для тени у font нет.</w:t>
       </w:r>
     </w:p>
     <w:p>
@@ -1651,7 +1651,7 @@
           <w:b w:val="0"/>
           <w:i w:val="0"/>
         </w:rPr>
-        <w:t>Применены разные способы выделения текста: u, i, s (зачёркнутый участник проекта), sup (должности), sub (сноска), em, strong.</w:t>
+        <w:t>Применены разные способы выделения текста: u, i, s (зачёркнутый участник проекта), sup (должности), sub (сноска), em, b.</w:t>
       </w:r>
     </w:p>
     <w:p>
@@ -2219,23 +2219,7 @@
           <w:b w:val="0"/>
           <w:i w:val="0"/>
         </w:rPr>
-        <w:t xml:space="preserve">Использовано разное обтекание картинки текстом: align="left" (картинка слева, текст справа) и align="right" (картинка справа, текст слева); обтекание отменяется тегом </w:t>
-      </w:r>
-      <w:r>
-        <w:rPr>
-          <w:rFonts w:ascii="Courier New" w:hAnsi="Courier New"/>
-          <w:b w:val="0"/>
-          <w:i w:val="0"/>
-          <w:sz w:val="24"/>
-        </w:rPr>
-        <w:t>&lt;br clear="all"&gt;</w:t>
-      </w:r>
-      <w:r>
-        <w:rPr>
-          <w:b w:val="0"/>
-          <w:i w:val="0"/>
-        </w:rPr>
-        <w:t>.</w:t>
+        <w:t>Использовано разное обтекание картинки текстом: align="left" (картинка слева, текст справа) и align="right" (картинка справа, текст слева).</w:t>
       </w:r>
     </w:p>
     <w:p>
@@ -2315,7 +2299,7 @@
           <w:rFonts w:ascii="Courier New" w:hAnsi="Courier New"/>
           <w:sz w:val="18"/>
         </w:rPr>
-        <w:t>&lt;a href="bilety.html"&gt;&lt;img src="images/samolet.jpg" width="480" height="270" border="2" alt="Купить билет — нажмите на самолёт" title="Нажмите, чтобы купить билет"&gt;&lt;/a&gt;&lt;br&gt;</w:t>
+        <w:t>&lt;a href="bilety.html"&gt;&lt;img src="images/samolet.jpg" width="480" height="270" border="2" alt="Купить билет — нажмите на самолёт"&gt;&lt;/a&gt;&lt;br&gt;</w:t>
       </w:r>
     </w:p>
     <w:p>
@@ -2328,7 +2312,7 @@
           <w:rFonts w:ascii="Courier New" w:hAnsi="Courier New"/>
           <w:sz w:val="18"/>
         </w:rPr>
-        <w:t>&lt;img src="images/aeroport.jpg" width="300" height="225" align="left" hspace="15" vspace="5" alt="Международный аэропорт «Манас»"&gt;</w:t>
+        <w:t>&lt;img src="images/aeroport.jpg" width="240" height="180" align="left" hspace="15" vspace="5" alt="Международный аэропорт «Манас»"&gt;</w:t>
       </w:r>
     </w:p>
     <w:p>
@@ -2400,7 +2384,7 @@
           <w:rFonts w:ascii="Courier New" w:hAnsi="Courier New"/>
           <w:sz w:val="18"/>
         </w:rPr>
-        <w:t xml:space="preserve">    &lt;area shape="rect" coords="60,270,300,340" href="raspisanie.html" title="Расписание рейсов" alt="Расписание"&gt;</w:t>
+        <w:t xml:space="preserve">    &lt;area shape="rect" coords="60,270,300,340" href="raspisanie.html" title="Расписание рейсов"&gt;</w:t>
       </w:r>
     </w:p>
     <w:p>
@@ -2413,7 +2397,7 @@
           <w:rFonts w:ascii="Courier New" w:hAnsi="Courier New"/>
           <w:sz w:val="18"/>
         </w:rPr>
-        <w:t xml:space="preserve">    &lt;area shape="circle" coords="500,290,75" href="bilety.html" title="Покупка билетов" alt="Билеты"&gt;</w:t>
+        <w:t xml:space="preserve">    &lt;area shape="circle" coords="500,290,75" href="bilety.html" title="Покупка билетов"&gt;</w:t>
       </w:r>
     </w:p>
     <w:p>
@@ -2426,7 +2410,7 @@
           <w:rFonts w:ascii="Courier New" w:hAnsi="Courier New"/>
           <w:sz w:val="18"/>
         </w:rPr>
-        <w:t xml:space="preserve">    &lt;area shape="poly" coords="820,200,720,360,920,360" href="home.html" title="Главная страница" alt="Главная"&gt;</w:t>
+        <w:t xml:space="preserve">    &lt;area shape="poly" coords="820,200,720,360,920,360" href="home.html" title="Главная страница"&gt;</w:t>
       </w:r>
     </w:p>
     <w:p>
@@ -2497,7 +2481,7 @@
           <w:b w:val="0"/>
           <w:i w:val="0"/>
         </w:rPr>
-        <w:t>Для каждой области создан отдельный тег area с атрибутом shape="poly". Координаты coords подобраны точно по контуру области (от 110 до 240 вершин на область) так, чтобы охватывать всю область и не выходить за линию её границы (рисунок 8).</w:t>
+        <w:t>Для каждой области создан отдельный тег area с атрибутом shape="poly". Координаты coords подобраны точно по контуру области (от 110 до 240 вершин на область) так, чтобы охватывать всю область и не выходить за линию её границы (рисунок 9).</w:t>
       </w:r>
     </w:p>
     <w:p>
@@ -2523,20 +2507,7 @@
           <w:b w:val="0"/>
           <w:i w:val="0"/>
         </w:rPr>
-        <w:t>Переход по областям не осуществляется – у каждого area указан атрибут nohref. Атрибуты title и alt содержат название области: при наведении указателя мыши появляется всплывающая подсказка.</w:t>
-      </w:r>
-    </w:p>
-    <w:p>
-      <w:pPr>
-        <w:pStyle w:val="ListBullet"/>
-        <w:jc w:val="both"/>
-      </w:pPr>
-      <w:r>
-        <w:rPr>
-          <w:b w:val="0"/>
-          <w:i w:val="0"/>
-        </w:rPr>
-        <w:t>Чтобы область было видно при наведении, поверх картинки размещён прозрачный элемент canvas, а небольшой скрипт по событию onmouseover берёт координаты coords этой же области и обводит её контур красной линией с подсветкой; по onmouseout подсветка убирается (рисунки 9–10).</w:t>
+        <w:t>Переход по областям не осуществляется – у каждого area указан атрибут nohref. Атрибут title содержит название области: при наведении указателя мыши появляется всплывающая подсказка с названием (рисунок 8).</w:t>
       </w:r>
     </w:p>
     <w:p>
@@ -2577,7 +2548,7 @@
           <w:rFonts w:ascii="Courier New" w:hAnsi="Courier New"/>
           <w:sz w:val="18"/>
         </w:rPr>
-        <w:t xml:space="preserve">    alt="Карта Кыргызстана с областями" title="Карта Кыргызстана"&gt;</w:t>
+        <w:t xml:space="preserve">    alt="Карта Кыргызстана с областями"&gt;</w:t>
       </w:r>
     </w:p>
     <w:p>
@@ -2603,7 +2574,7 @@
           <w:rFonts w:ascii="Courier New" w:hAnsi="Courier New"/>
           <w:sz w:val="18"/>
         </w:rPr>
-        <w:t xml:space="preserve">    &lt;area shape="poly" coords="174,392,175,399,173,404,174,407,..." nohref title="Анклав (Узбекистан)" alt="Анклав (Узбекистан)"&gt;</w:t>
+        <w:t xml:space="preserve">    &lt;area shape="poly" coords="174,392,175,399,173,404,174,407,..." nohref title="Анклав (Узбекистан)"&gt;</w:t>
       </w:r>
     </w:p>
     <w:p>
@@ -2616,7 +2587,7 @@
           <w:rFonts w:ascii="Courier New" w:hAnsi="Courier New"/>
           <w:sz w:val="18"/>
         </w:rPr>
-        <w:t xml:space="preserve">    &lt;area shape="poly" coords="232,416,233,418,235,418,235,420,..." nohref title="Анклав (Узбекистан)" alt="Анклав (Узбекистан)"&gt;</w:t>
+        <w:t xml:space="preserve">    &lt;area shape="poly" coords="232,416,233,418,235,418,235,420,..." nohref title="Анклав (Узбекистан)"&gt;</w:t>
       </w:r>
     </w:p>
     <w:p>
@@ -2629,7 +2600,7 @@
           <w:rFonts w:ascii="Courier New" w:hAnsi="Courier New"/>
           <w:sz w:val="18"/>
         </w:rPr>
-        <w:t xml:space="preserve">    &lt;area shape="poly" coords="134,426,135,429,140,431,141,433,..." nohref title="Анклав (Таджикистан)" alt="Анклав (Таджикистан)"&gt;</w:t>
+        <w:t xml:space="preserve">    &lt;area shape="poly" coords="134,426,135,429,140,431,141,433,..." nohref title="Анклав (Таджикистан)"&gt;</w:t>
       </w:r>
     </w:p>
     <w:p>
@@ -2642,7 +2613,7 @@
           <w:rFonts w:ascii="Courier New" w:hAnsi="Courier New"/>
           <w:sz w:val="18"/>
         </w:rPr>
-        <w:t xml:space="preserve">    &lt;area shape="poly" coords="350,178,363,180,366,183,368,188,..." nohref title="Чуйская область" alt="Чуйская область"&gt;</w:t>
+        <w:t xml:space="preserve">    &lt;area shape="poly" coords="350,178,363,180,366,183,368,188,..." nohref title="Чуйская область"&gt;</w:t>
       </w:r>
     </w:p>
     <w:p>
@@ -2655,7 +2626,7 @@
           <w:rFonts w:ascii="Courier New" w:hAnsi="Courier New"/>
           <w:sz w:val="18"/>
         </w:rPr>
-        <w:t xml:space="preserve">    &lt;area shape="poly" coords="163,159,165,161,166,163,168,162,..." nohref title="Таласская область" alt="Таласская область"&gt;</w:t>
+        <w:t xml:space="preserve">    &lt;area shape="poly" coords="163,159,165,161,166,163,168,162,..." nohref title="Таласская область"&gt;</w:t>
       </w:r>
     </w:p>
     <w:p>
@@ -2668,7 +2639,7 @@
           <w:rFonts w:ascii="Courier New" w:hAnsi="Courier New"/>
           <w:sz w:val="18"/>
         </w:rPr>
-        <w:t xml:space="preserve">    &lt;area shape="poly" coords="558,143,561,146,568,149,569,151,..." nohref title="Иссык-Кульская область" alt="Иссык-Кульская область"&gt;</w:t>
+        <w:t xml:space="preserve">    &lt;area shape="poly" coords="558,143,561,146,568,149,569,151,..." nohref title="Иссык-Кульская область"&gt;</w:t>
       </w:r>
     </w:p>
     <w:p>
@@ -2681,7 +2652,7 @@
           <w:rFonts w:ascii="Courier New" w:hAnsi="Courier New"/>
           <w:sz w:val="18"/>
         </w:rPr>
-        <w:t xml:space="preserve">    &lt;area shape="poly" coords="372,250,381,256,381,266,387,269,..." nohref title="Нарынская область" alt="Нарынская область"&gt;</w:t>
+        <w:t xml:space="preserve">    &lt;area shape="poly" coords="372,250,381,256,381,266,387,269,..." nohref title="Нарынская область"&gt;</w:t>
       </w:r>
     </w:p>
     <w:p>
@@ -2694,7 +2665,7 @@
           <w:rFonts w:ascii="Courier New" w:hAnsi="Courier New"/>
           <w:sz w:val="18"/>
         </w:rPr>
-        <w:t xml:space="preserve">    &lt;area shape="poly" coords="106,245,111,248,116,245,118,247,..." nohref title="Джалал-Абадская область" alt="Джалал-Абадская область"&gt;</w:t>
+        <w:t xml:space="preserve">    &lt;area shape="poly" coords="106,245,111,248,116,245,118,247,..." nohref title="Джалал-Абадская область"&gt;</w:t>
       </w:r>
     </w:p>
     <w:p>
@@ -2707,7 +2678,7 @@
           <w:rFonts w:ascii="Courier New" w:hAnsi="Courier New"/>
           <w:sz w:val="18"/>
         </w:rPr>
-        <w:t xml:space="preserve">    &lt;area shape="poly" coords="216,455,221,459,219,466,221,472,..." nohref title="Ошская область" alt="Ошская область"&gt;</w:t>
+        <w:t xml:space="preserve">    &lt;area shape="poly" coords="216,455,221,459,219,466,221,472,..." nohref title="Ошская область"&gt;</w:t>
       </w:r>
     </w:p>
     <w:p>
@@ -2720,7 +2691,7 @@
           <w:rFonts w:ascii="Courier New" w:hAnsi="Courier New"/>
           <w:sz w:val="18"/>
         </w:rPr>
-        <w:t xml:space="preserve">    &lt;area shape="poly" coords="31,433,33,436,33,439,37,445,..." nohref title="Баткенская область" alt="Баткенская область"&gt;</w:t>
+        <w:t xml:space="preserve">    &lt;area shape="poly" coords="31,433,33,436,33,439,37,445,..." nohref title="Баткенская область"&gt;</w:t>
       </w:r>
     </w:p>
     <w:p>
@@ -2734,377 +2705,6 @@
           <w:sz w:val="18"/>
         </w:rPr>
         <w:t>&lt;/map&gt;</w:t>
-      </w:r>
-    </w:p>
-    <w:p>
-      <w:pPr>
-        <w:spacing w:after="80"/>
-      </w:pPr>
-    </w:p>
-    <w:p>
-      <w:pPr>
-        <w:keepNext/>
-        <w:spacing w:after="0"/>
-        <w:ind w:firstLine="709"/>
-        <w:jc w:val="both"/>
-      </w:pPr>
-      <w:r>
-        <w:rPr>
-          <w:b w:val="0"/>
-          <w:i/>
-        </w:rPr>
-        <w:t>Фрагмент кода (подсветка области при наведении):</w:t>
-      </w:r>
-    </w:p>
-    <w:p>
-      <w:pPr>
-        <w:spacing w:line="240" w:lineRule="auto" w:after="0"/>
-        <w:shd w:val="clear" w:color="auto" w:fill="F2F2F2"/>
-      </w:pPr>
-      <w:r>
-        <w:rPr>
-          <w:rFonts w:ascii="Courier New" w:hAnsi="Courier New"/>
-          <w:sz w:val="18"/>
-        </w:rPr>
-        <w:t>&lt;canvas id="podsvetka" width="1000" height="528" style="position: absolute; left: 0; top: 0; pointer-events: none;"&gt;&lt;/canvas&gt;</w:t>
-      </w:r>
-    </w:p>
-    <w:p>
-      <w:pPr>
-        <w:spacing w:line="240" w:lineRule="auto" w:after="0"/>
-        <w:shd w:val="clear" w:color="auto" w:fill="F2F2F2"/>
-      </w:pPr>
-      <w:r>
-        <w:rPr>
-          <w:rFonts w:ascii="Courier New" w:hAnsi="Courier New"/>
-          <w:sz w:val="18"/>
-        </w:rPr>
-        <w:t>...</w:t>
-      </w:r>
-    </w:p>
-    <w:p>
-      <w:pPr>
-        <w:spacing w:line="240" w:lineRule="auto" w:after="0"/>
-        <w:shd w:val="clear" w:color="auto" w:fill="F2F2F2"/>
-      </w:pPr>
-      <w:r>
-        <w:rPr>
-          <w:rFonts w:ascii="Courier New" w:hAnsi="Courier New"/>
-          <w:sz w:val="18"/>
-        </w:rPr>
-        <w:t>&lt;script&gt;</w:t>
-      </w:r>
-    </w:p>
-    <w:p>
-      <w:pPr>
-        <w:spacing w:line="240" w:lineRule="auto" w:after="0"/>
-        <w:shd w:val="clear" w:color="auto" w:fill="F2F2F2"/>
-      </w:pPr>
-      <w:r>
-        <w:rPr>
-          <w:rFonts w:ascii="Courier New" w:hAnsi="Courier New"/>
-          <w:sz w:val="18"/>
-        </w:rPr>
-        <w:t xml:space="preserve">    var canvas = document.getElementById("podsvetka");</w:t>
-      </w:r>
-    </w:p>
-    <w:p>
-      <w:pPr>
-        <w:spacing w:line="240" w:lineRule="auto" w:after="0"/>
-        <w:shd w:val="clear" w:color="auto" w:fill="F2F2F2"/>
-      </w:pPr>
-      <w:r>
-        <w:rPr>
-          <w:rFonts w:ascii="Courier New" w:hAnsi="Courier New"/>
-          <w:sz w:val="18"/>
-        </w:rPr>
-        <w:t xml:space="preserve">    var ctx = canvas.getContext("2d");</w:t>
-      </w:r>
-    </w:p>
-    <w:p>
-      <w:pPr>
-        <w:spacing w:line="240" w:lineRule="auto" w:after="0"/>
-        <w:shd w:val="clear" w:color="auto" w:fill="F2F2F2"/>
-      </w:pPr>
-      <w:r>
-        <w:rPr>
-          <w:rFonts w:ascii="Courier New" w:hAnsi="Courier New"/>
-          <w:sz w:val="18"/>
-        </w:rPr>
-        <w:t xml:space="preserve">    var areas = document.getElementsByTagName("area");</w:t>
-      </w:r>
-    </w:p>
-    <w:p>
-      <w:pPr>
-        <w:spacing w:line="240" w:lineRule="auto" w:after="0"/>
-        <w:shd w:val="clear" w:color="auto" w:fill="F2F2F2"/>
-      </w:pPr>
-      <w:r>
-        <w:rPr>
-          <w:rFonts w:ascii="Courier New" w:hAnsi="Courier New"/>
-          <w:sz w:val="18"/>
-        </w:rPr>
-        <w:t xml:space="preserve">    for (var i = 0; i &lt; areas.length; i++) {</w:t>
-      </w:r>
-    </w:p>
-    <w:p>
-      <w:pPr>
-        <w:spacing w:line="240" w:lineRule="auto" w:after="0"/>
-        <w:shd w:val="clear" w:color="auto" w:fill="F2F2F2"/>
-      </w:pPr>
-      <w:r>
-        <w:rPr>
-          <w:rFonts w:ascii="Courier New" w:hAnsi="Courier New"/>
-          <w:sz w:val="18"/>
-        </w:rPr>
-        <w:t xml:space="preserve">        areas[i].onmouseover = function () {</w:t>
-      </w:r>
-    </w:p>
-    <w:p>
-      <w:pPr>
-        <w:spacing w:line="240" w:lineRule="auto" w:after="0"/>
-        <w:shd w:val="clear" w:color="auto" w:fill="F2F2F2"/>
-      </w:pPr>
-      <w:r>
-        <w:rPr>
-          <w:rFonts w:ascii="Courier New" w:hAnsi="Courier New"/>
-          <w:sz w:val="18"/>
-        </w:rPr>
-        <w:t xml:space="preserve">            var c = this.coords.split(",");</w:t>
-      </w:r>
-    </w:p>
-    <w:p>
-      <w:pPr>
-        <w:spacing w:line="240" w:lineRule="auto" w:after="0"/>
-        <w:shd w:val="clear" w:color="auto" w:fill="F2F2F2"/>
-      </w:pPr>
-      <w:r>
-        <w:rPr>
-          <w:rFonts w:ascii="Courier New" w:hAnsi="Courier New"/>
-          <w:sz w:val="18"/>
-        </w:rPr>
-        <w:t xml:space="preserve">            ctx.clearRect(0, 0, canvas.width, canvas.height);</w:t>
-      </w:r>
-    </w:p>
-    <w:p>
-      <w:pPr>
-        <w:spacing w:line="240" w:lineRule="auto" w:after="0"/>
-        <w:shd w:val="clear" w:color="auto" w:fill="F2F2F2"/>
-      </w:pPr>
-      <w:r>
-        <w:rPr>
-          <w:rFonts w:ascii="Courier New" w:hAnsi="Courier New"/>
-          <w:sz w:val="18"/>
-        </w:rPr>
-        <w:t xml:space="preserve">            ctx.beginPath();</w:t>
-      </w:r>
-    </w:p>
-    <w:p>
-      <w:pPr>
-        <w:spacing w:line="240" w:lineRule="auto" w:after="0"/>
-        <w:shd w:val="clear" w:color="auto" w:fill="F2F2F2"/>
-      </w:pPr>
-      <w:r>
-        <w:rPr>
-          <w:rFonts w:ascii="Courier New" w:hAnsi="Courier New"/>
-          <w:sz w:val="18"/>
-        </w:rPr>
-        <w:t xml:space="preserve">            ctx.moveTo(c[0], c[1]);</w:t>
-      </w:r>
-    </w:p>
-    <w:p>
-      <w:pPr>
-        <w:spacing w:line="240" w:lineRule="auto" w:after="0"/>
-        <w:shd w:val="clear" w:color="auto" w:fill="F2F2F2"/>
-      </w:pPr>
-      <w:r>
-        <w:rPr>
-          <w:rFonts w:ascii="Courier New" w:hAnsi="Courier New"/>
-          <w:sz w:val="18"/>
-        </w:rPr>
-        <w:t xml:space="preserve">            for (var j = 2; j &lt; c.length; j += 2) {</w:t>
-      </w:r>
-    </w:p>
-    <w:p>
-      <w:pPr>
-        <w:spacing w:line="240" w:lineRule="auto" w:after="0"/>
-        <w:shd w:val="clear" w:color="auto" w:fill="F2F2F2"/>
-      </w:pPr>
-      <w:r>
-        <w:rPr>
-          <w:rFonts w:ascii="Courier New" w:hAnsi="Courier New"/>
-          <w:sz w:val="18"/>
-        </w:rPr>
-        <w:t xml:space="preserve">                ctx.lineTo(c[j], c[j + 1]);</w:t>
-      </w:r>
-    </w:p>
-    <w:p>
-      <w:pPr>
-        <w:spacing w:line="240" w:lineRule="auto" w:after="0"/>
-        <w:shd w:val="clear" w:color="auto" w:fill="F2F2F2"/>
-      </w:pPr>
-      <w:r>
-        <w:rPr>
-          <w:rFonts w:ascii="Courier New" w:hAnsi="Courier New"/>
-          <w:sz w:val="18"/>
-        </w:rPr>
-        <w:t xml:space="preserve">            }</w:t>
-      </w:r>
-    </w:p>
-    <w:p>
-      <w:pPr>
-        <w:spacing w:line="240" w:lineRule="auto" w:after="0"/>
-        <w:shd w:val="clear" w:color="auto" w:fill="F2F2F2"/>
-      </w:pPr>
-      <w:r>
-        <w:rPr>
-          <w:rFonts w:ascii="Courier New" w:hAnsi="Courier New"/>
-          <w:sz w:val="18"/>
-        </w:rPr>
-        <w:t xml:space="preserve">            ctx.closePath();</w:t>
-      </w:r>
-    </w:p>
-    <w:p>
-      <w:pPr>
-        <w:spacing w:line="240" w:lineRule="auto" w:after="0"/>
-        <w:shd w:val="clear" w:color="auto" w:fill="F2F2F2"/>
-      </w:pPr>
-      <w:r>
-        <w:rPr>
-          <w:rFonts w:ascii="Courier New" w:hAnsi="Courier New"/>
-          <w:sz w:val="18"/>
-        </w:rPr>
-        <w:t xml:space="preserve">            ctx.fillStyle = "rgba(255, 255, 255, 0.45)";</w:t>
-      </w:r>
-    </w:p>
-    <w:p>
-      <w:pPr>
-        <w:spacing w:line="240" w:lineRule="auto" w:after="0"/>
-        <w:shd w:val="clear" w:color="auto" w:fill="F2F2F2"/>
-      </w:pPr>
-      <w:r>
-        <w:rPr>
-          <w:rFonts w:ascii="Courier New" w:hAnsi="Courier New"/>
-          <w:sz w:val="18"/>
-        </w:rPr>
-        <w:t xml:space="preserve">            ctx.fill();</w:t>
-      </w:r>
-    </w:p>
-    <w:p>
-      <w:pPr>
-        <w:spacing w:line="240" w:lineRule="auto" w:after="0"/>
-        <w:shd w:val="clear" w:color="auto" w:fill="F2F2F2"/>
-      </w:pPr>
-      <w:r>
-        <w:rPr>
-          <w:rFonts w:ascii="Courier New" w:hAnsi="Courier New"/>
-          <w:sz w:val="18"/>
-        </w:rPr>
-        <w:t xml:space="preserve">            ctx.lineWidth = 3;</w:t>
-      </w:r>
-    </w:p>
-    <w:p>
-      <w:pPr>
-        <w:spacing w:line="240" w:lineRule="auto" w:after="0"/>
-        <w:shd w:val="clear" w:color="auto" w:fill="F2F2F2"/>
-      </w:pPr>
-      <w:r>
-        <w:rPr>
-          <w:rFonts w:ascii="Courier New" w:hAnsi="Courier New"/>
-          <w:sz w:val="18"/>
-        </w:rPr>
-        <w:t xml:space="preserve">            ctx.strokeStyle = "#C00000";</w:t>
-      </w:r>
-    </w:p>
-    <w:p>
-      <w:pPr>
-        <w:spacing w:line="240" w:lineRule="auto" w:after="0"/>
-        <w:shd w:val="clear" w:color="auto" w:fill="F2F2F2"/>
-      </w:pPr>
-      <w:r>
-        <w:rPr>
-          <w:rFonts w:ascii="Courier New" w:hAnsi="Courier New"/>
-          <w:sz w:val="18"/>
-        </w:rPr>
-        <w:t xml:space="preserve">            ctx.stroke();</w:t>
-      </w:r>
-    </w:p>
-    <w:p>
-      <w:pPr>
-        <w:spacing w:line="240" w:lineRule="auto" w:after="0"/>
-        <w:shd w:val="clear" w:color="auto" w:fill="F2F2F2"/>
-      </w:pPr>
-      <w:r>
-        <w:rPr>
-          <w:rFonts w:ascii="Courier New" w:hAnsi="Courier New"/>
-          <w:sz w:val="18"/>
-        </w:rPr>
-        <w:t xml:space="preserve">        };</w:t>
-      </w:r>
-    </w:p>
-    <w:p>
-      <w:pPr>
-        <w:spacing w:line="240" w:lineRule="auto" w:after="0"/>
-        <w:shd w:val="clear" w:color="auto" w:fill="F2F2F2"/>
-      </w:pPr>
-      <w:r>
-        <w:rPr>
-          <w:rFonts w:ascii="Courier New" w:hAnsi="Courier New"/>
-          <w:sz w:val="18"/>
-        </w:rPr>
-        <w:t xml:space="preserve">        areas[i].onmouseout = function () {</w:t>
-      </w:r>
-    </w:p>
-    <w:p>
-      <w:pPr>
-        <w:spacing w:line="240" w:lineRule="auto" w:after="0"/>
-        <w:shd w:val="clear" w:color="auto" w:fill="F2F2F2"/>
-      </w:pPr>
-      <w:r>
-        <w:rPr>
-          <w:rFonts w:ascii="Courier New" w:hAnsi="Courier New"/>
-          <w:sz w:val="18"/>
-        </w:rPr>
-        <w:t xml:space="preserve">            ctx.clearRect(0, 0, canvas.width, canvas.height);</w:t>
-      </w:r>
-    </w:p>
-    <w:p>
-      <w:pPr>
-        <w:spacing w:line="240" w:lineRule="auto" w:after="0"/>
-        <w:shd w:val="clear" w:color="auto" w:fill="F2F2F2"/>
-      </w:pPr>
-      <w:r>
-        <w:rPr>
-          <w:rFonts w:ascii="Courier New" w:hAnsi="Courier New"/>
-          <w:sz w:val="18"/>
-        </w:rPr>
-        <w:t xml:space="preserve">        };</w:t>
-      </w:r>
-    </w:p>
-    <w:p>
-      <w:pPr>
-        <w:spacing w:line="240" w:lineRule="auto" w:after="0"/>
-        <w:shd w:val="clear" w:color="auto" w:fill="F2F2F2"/>
-      </w:pPr>
-      <w:r>
-        <w:rPr>
-          <w:rFonts w:ascii="Courier New" w:hAnsi="Courier New"/>
-          <w:sz w:val="18"/>
-        </w:rPr>
-        <w:t xml:space="preserve">    }</w:t>
-      </w:r>
-    </w:p>
-    <w:p>
-      <w:pPr>
-        <w:spacing w:line="240" w:lineRule="auto" w:after="0"/>
-        <w:shd w:val="clear" w:color="auto" w:fill="F2F2F2"/>
-      </w:pPr>
-      <w:r>
-        <w:rPr>
-          <w:rFonts w:ascii="Courier New" w:hAnsi="Courier New"/>
-          <w:sz w:val="18"/>
-        </w:rPr>
-        <w:t>&lt;/script&gt;</w:t>
       </w:r>
     </w:p>
     <w:p>
@@ -3304,7 +2904,7 @@
       <w:r>
         <w:drawing>
           <wp:inline xmlns:a="http://schemas.openxmlformats.org/drawingml/2006/main" xmlns:pic="http://schemas.openxmlformats.org/drawingml/2006/picture">
-            <wp:extent cx="5760000" cy="5057280"/>
+            <wp:extent cx="5760000" cy="4826880"/>
             <wp:docPr id="4" name="Picture 4"/>
             <wp:cNvGraphicFramePr>
               <a:graphicFrameLocks noChangeAspect="1"/>
@@ -3325,7 +2925,7 @@
                   <pic:spPr>
                     <a:xfrm>
                       <a:off x="0" y="0"/>
-                      <a:ext cx="5760000" cy="5057280"/>
+                      <a:ext cx="5760000" cy="4826880"/>
                     </a:xfrm>
                     <a:prstGeom prst="rect"/>
                   </pic:spPr>
@@ -3524,7 +3124,7 @@
       <w:r>
         <w:drawing>
           <wp:inline xmlns:a="http://schemas.openxmlformats.org/drawingml/2006/main" xmlns:pic="http://schemas.openxmlformats.org/drawingml/2006/picture">
-            <wp:extent cx="5760000" cy="4711680"/>
+            <wp:extent cx="5760000" cy="4049280"/>
             <wp:docPr id="8" name="Picture 8"/>
             <wp:cNvGraphicFramePr>
               <a:graphicFrameLocks noChangeAspect="1"/>
@@ -3545,7 +3145,7 @@
                   <pic:spPr>
                     <a:xfrm>
                       <a:off x="0" y="0"/>
-                      <a:ext cx="5760000" cy="4711680"/>
+                      <a:ext cx="5760000" cy="4049280"/>
                     </a:xfrm>
                     <a:prstGeom prst="rect"/>
                   </pic:spPr>
@@ -3623,62 +3223,7 @@
           <w:i/>
           <w:sz w:val="24"/>
         </w:rPr>
-        <w:t>Рисунок 9 – Задание 6. Выделение Чуйской области при наведении указателя мыши</w:t>
-      </w:r>
-    </w:p>
-    <w:p>
-      <w:pPr>
-        <w:keepNext/>
-        <w:jc w:val="center"/>
-      </w:pPr>
-      <w:r>
-        <w:drawing>
-          <wp:inline xmlns:a="http://schemas.openxmlformats.org/drawingml/2006/main" xmlns:pic="http://schemas.openxmlformats.org/drawingml/2006/picture">
-            <wp:extent cx="5760000" cy="3041280"/>
-            <wp:docPr id="10" name="Picture 10"/>
-            <wp:cNvGraphicFramePr>
-              <a:graphicFrameLocks noChangeAspect="1"/>
-            </wp:cNvGraphicFramePr>
-            <a:graphic>
-              <a:graphicData uri="http://schemas.openxmlformats.org/drawingml/2006/picture">
-                <pic:pic>
-                  <pic:nvPicPr>
-                    <pic:cNvPr id="0" name="lab2_karta_oblast2.jpg"/>
-                    <pic:cNvPicPr/>
-                  </pic:nvPicPr>
-                  <pic:blipFill>
-                    <a:blip r:embed="rId18"/>
-                    <a:stretch>
-                      <a:fillRect/>
-                    </a:stretch>
-                  </pic:blipFill>
-                  <pic:spPr>
-                    <a:xfrm>
-                      <a:off x="0" y="0"/>
-                      <a:ext cx="5760000" cy="3041280"/>
-                    </a:xfrm>
-                    <a:prstGeom prst="rect"/>
-                  </pic:spPr>
-                </pic:pic>
-              </a:graphicData>
-            </a:graphic>
-          </wp:inline>
-        </w:drawing>
-      </w:r>
-    </w:p>
-    <w:p>
-      <w:pPr>
-        <w:spacing w:after="160"/>
-        <w:ind/>
-        <w:jc w:val="center"/>
-      </w:pPr>
-      <w:r>
-        <w:rPr>
-          <w:b w:val="0"/>
-          <w:i/>
-          <w:sz w:val="24"/>
-        </w:rPr>
-        <w:t>Рисунок 10 – Задание 6. Выделение Баткенской области при наведении указателя мыши</w:t>
+        <w:t>Рисунок 9 – Задание 6. Контуры областей по координатам coords (обведены линией для проверки) – не выходят за границы областей</w:t>
       </w:r>
     </w:p>
     <w:p>
@@ -4649,7 +4194,7 @@
           <w:rFonts w:ascii="Courier New" w:hAnsi="Courier New"/>
           <w:sz w:val="16"/>
         </w:rPr>
-        <w:t xml:space="preserve">        &lt;h1 align="center"&gt;&lt;font color="red" face="Arial"&gt;Сайт авиакассы «Асман»&lt;/font&gt;&lt;/h1&gt;</w:t>
+        <w:t xml:space="preserve">        &lt;h1&gt;&lt;font color="red" face="Arial"&gt;Сайт авиакассы «Асман»&lt;/font&gt;&lt;/h1&gt;</w:t>
       </w:r>
     </w:p>
     <w:p>
@@ -4662,7 +4207,7 @@
           <w:rFonts w:ascii="Courier New" w:hAnsi="Courier New"/>
           <w:sz w:val="16"/>
         </w:rPr>
-        <w:t xml:space="preserve">        &lt;h2 align="center"&gt;&lt;font size="4" color="#1E4FA0" face="Georgia"&gt;&lt;i&gt;Авиабилеты из Бишкека по всему миру&lt;/i&gt;&lt;/font&gt;&lt;/h2&gt;</w:t>
+        <w:t xml:space="preserve">        &lt;h2&gt;&lt;font size="4" color="#1E4FA0" face="Georgia"&gt;&lt;i&gt;Авиабилеты из Бишкека по всему миру&lt;/i&gt;&lt;/font&gt;&lt;/h2&gt;</w:t>
       </w:r>
     </w:p>
     <w:p>
@@ -4844,7 +4389,7 @@
           <w:rFonts w:ascii="Courier New" w:hAnsi="Courier New"/>
           <w:sz w:val="16"/>
         </w:rPr>
-        <w:t xml:space="preserve">            &lt;div&gt;Мы хотим, чтобы покупка &lt;strong&gt;авиабилета&lt;/strong&gt; занимала пять минут: выбрали рейс, сравнили тарифы,</w:t>
+        <w:t xml:space="preserve">            &lt;div&gt;Мы хотим, чтобы покупка &lt;b&gt;авиабилета&lt;/b&gt; занимала пять минут: выбрали рейс, сравнили тарифы,</w:t>
       </w:r>
     </w:p>
     <w:p>
@@ -5344,7 +4889,7 @@
           <w:rFonts w:ascii="Courier New" w:hAnsi="Courier New"/>
           <w:sz w:val="16"/>
         </w:rPr>
-        <w:t xml:space="preserve">    &lt;body background="images/fon.jpg" text="#1A1A2E" link="#1E4FA0" vlink="#8E44AD"&gt;</w:t>
+        <w:t xml:space="preserve">    &lt;body background="images/fon.jpg" text="#1A1A2E" link="#1E4FA0"&gt;</w:t>
       </w:r>
     </w:p>
     <w:p>
@@ -5357,7 +4902,7 @@
           <w:rFonts w:ascii="Courier New" w:hAnsi="Courier New"/>
           <w:sz w:val="16"/>
         </w:rPr>
-        <w:t xml:space="preserve">        &lt;h1 align="center"&gt;&lt;font color="#C0392B" face="Arial"&gt;Авиакасса «Асман»&lt;/font&gt;&lt;/h1&gt;</w:t>
+        <w:t xml:space="preserve">        &lt;h1&gt;&lt;font color="#C0392B" face="Arial"&gt;Авиакасса «Асман»&lt;/font&gt;&lt;/h1&gt;</w:t>
       </w:r>
     </w:p>
     <w:p>
@@ -5578,7 +5123,7 @@
           <w:rFonts w:ascii="Courier New" w:hAnsi="Courier New"/>
           <w:sz w:val="16"/>
         </w:rPr>
-        <w:t xml:space="preserve">            &lt;a href="bilety.html"&gt;&lt;img src="images/samolet.jpg" width="480" height="270" border="2" alt="Купить билет — нажмите на самолёт" title="Нажмите, чтобы купить билет"&gt;&lt;/a&gt;&lt;br&gt;</w:t>
+        <w:t xml:space="preserve">            &lt;a href="bilety.html"&gt;&lt;img src="images/samolet.jpg" width="480" height="270" border="2" alt="Купить билет — нажмите на самолёт"&gt;&lt;/a&gt;&lt;br&gt;</w:t>
       </w:r>
     </w:p>
     <w:p>
@@ -5656,7 +5201,7 @@
           <w:rFonts w:ascii="Courier New" w:hAnsi="Courier New"/>
           <w:sz w:val="16"/>
         </w:rPr>
-        <w:t xml:space="preserve">            &lt;img src="images/aeroport.jpg" width="300" height="225" align="left" hspace="15" vspace="5" alt="Международный аэропорт «Манас»"&gt;</w:t>
+        <w:t xml:space="preserve">            &lt;img src="images/aeroport.jpg" width="240" height="180" align="left" hspace="15" vspace="5" alt="Международный аэропорт «Манас»"&gt;</w:t>
       </w:r>
     </w:p>
     <w:p>
@@ -5838,7 +5383,7 @@
           <w:rFonts w:ascii="Courier New" w:hAnsi="Courier New"/>
           <w:sz w:val="16"/>
         </w:rPr>
-        <w:t xml:space="preserve">        &lt;br clear="all"&gt;</w:t>
+        <w:t xml:space="preserve">        &lt;br&gt;</w:t>
       </w:r>
     </w:p>
     <w:p>
@@ -6072,7 +5617,7 @@
           <w:rFonts w:ascii="Courier New" w:hAnsi="Courier New"/>
           <w:sz w:val="16"/>
         </w:rPr>
-        <w:t xml:space="preserve">        &lt;br clear="all"&gt;</w:t>
+        <w:t xml:space="preserve">        &lt;br&gt;</w:t>
       </w:r>
     </w:p>
     <w:p>
@@ -6234,7 +5779,7 @@
           <w:rFonts w:ascii="Courier New" w:hAnsi="Courier New"/>
           <w:sz w:val="16"/>
         </w:rPr>
-        <w:t xml:space="preserve">        &lt;h1 align="center"&gt;&lt;font color="#C0392B" face="Arial"&gt;Расписание рейсов&lt;/font&gt;&lt;/h1&gt;</w:t>
+        <w:t xml:space="preserve">        &lt;h1&gt;&lt;font color="#C0392B" face="Arial"&gt;Расписание рейсов&lt;/font&gt;&lt;/h1&gt;</w:t>
       </w:r>
     </w:p>
     <w:p>
@@ -6520,7 +6065,7 @@
           <w:rFonts w:ascii="Courier New" w:hAnsi="Courier New"/>
           <w:sz w:val="16"/>
         </w:rPr>
-        <w:t xml:space="preserve">        &lt;br clear="all"&gt;</w:t>
+        <w:t xml:space="preserve">        &lt;br&gt;</w:t>
       </w:r>
     </w:p>
     <w:p>
@@ -6533,7 +6078,7 @@
           <w:rFonts w:ascii="Courier New" w:hAnsi="Courier New"/>
           <w:sz w:val="16"/>
         </w:rPr>
-        <w:t xml:space="preserve">        &lt;p align="center"&gt;&lt;a href="home.html"&gt;&lt;img src="images/polet.jpg" width="180" height="135" border="1" alt="На главную" title="Вернуться на главную"&gt;&lt;/a&gt;&lt;br&gt;</w:t>
+        <w:t xml:space="preserve">        &lt;p align="center"&gt;&lt;a href="home.html"&gt;&lt;img src="images/polet.jpg" width="180" height="135" border="1" alt="На главную"&gt;&lt;/a&gt;&lt;br&gt;</w:t>
       </w:r>
     </w:p>
     <w:p>
@@ -6669,7 +6214,7 @@
           <w:rFonts w:ascii="Courier New" w:hAnsi="Courier New"/>
           <w:sz w:val="16"/>
         </w:rPr>
-        <w:t xml:space="preserve">        &lt;h1 align="center"&gt;&lt;font color="#C0392B" face="Arial"&gt;Покупка билетов&lt;/font&gt;&lt;/h1&gt;</w:t>
+        <w:t xml:space="preserve">        &lt;h1&gt;&lt;font color="#C0392B" face="Arial"&gt;Покупка билетов&lt;/font&gt;&lt;/h1&gt;</w:t>
       </w:r>
     </w:p>
     <w:p>
@@ -6734,7 +6279,7 @@
           <w:rFonts w:ascii="Courier New" w:hAnsi="Courier New"/>
           <w:sz w:val="16"/>
         </w:rPr>
-        <w:t xml:space="preserve">            &lt;img src="images/kassa.jpg" width="320" height="240" align="left" hspace="15" vspace="5" alt="Стойки кассы и регистрации"&gt;</w:t>
+        <w:t xml:space="preserve">            &lt;img src="images/kassa.jpg" width="320" height="240" align="right" hspace="15" vspace="5" alt="Стойки кассы и регистрации"&gt;</w:t>
       </w:r>
     </w:p>
     <w:p>
@@ -6903,7 +6448,7 @@
           <w:rFonts w:ascii="Courier New" w:hAnsi="Courier New"/>
           <w:sz w:val="16"/>
         </w:rPr>
-        <w:t xml:space="preserve">        &lt;br clear="all"&gt;</w:t>
+        <w:t xml:space="preserve">        &lt;br&gt;</w:t>
       </w:r>
     </w:p>
     <w:p>
@@ -7078,7 +6623,7 @@
           <w:rFonts w:ascii="Courier New" w:hAnsi="Courier New"/>
           <w:sz w:val="16"/>
         </w:rPr>
-        <w:t xml:space="preserve">        &lt;h2 align="center"&gt;&lt;font color="#1E4FA0" face="Arial"&gt;Выберите раздел: нажмите на кнопку&lt;/font&gt;&lt;/h2&gt;</w:t>
+        <w:t xml:space="preserve">        &lt;h2&gt;&lt;font color="#1E4FA0" face="Arial"&gt;Выберите раздел: нажмите на кнопку&lt;/font&gt;&lt;/h2&gt;</w:t>
       </w:r>
     </w:p>
     <w:p>
@@ -7130,7 +6675,7 @@
           <w:rFonts w:ascii="Courier New" w:hAnsi="Courier New"/>
           <w:sz w:val="16"/>
         </w:rPr>
-        <w:t xml:space="preserve">                &lt;area shape="rect" coords="60,270,300,340" href="raspisanie.html" title="Расписание рейсов" alt="Расписание"&gt;</w:t>
+        <w:t xml:space="preserve">                &lt;area shape="rect" coords="60,270,300,340" href="raspisanie.html" title="Расписание рейсов"&gt;</w:t>
       </w:r>
     </w:p>
     <w:p>
@@ -7143,7 +6688,7 @@
           <w:rFonts w:ascii="Courier New" w:hAnsi="Courier New"/>
           <w:sz w:val="16"/>
         </w:rPr>
-        <w:t xml:space="preserve">                &lt;area shape="circle" coords="500,290,75" href="bilety.html" title="Покупка билетов" alt="Билеты"&gt;</w:t>
+        <w:t xml:space="preserve">                &lt;area shape="circle" coords="500,290,75" href="bilety.html" title="Покупка билетов"&gt;</w:t>
       </w:r>
     </w:p>
     <w:p>
@@ -7156,7 +6701,7 @@
           <w:rFonts w:ascii="Courier New" w:hAnsi="Courier New"/>
           <w:sz w:val="16"/>
         </w:rPr>
-        <w:t xml:space="preserve">                &lt;area shape="poly" coords="820,200,720,360,920,360" href="home.html" title="Главная страница" alt="Главная"&gt;</w:t>
+        <w:t xml:space="preserve">                &lt;area shape="poly" coords="820,200,720,360,920,360" href="home.html" title="Главная страница"&gt;</w:t>
       </w:r>
     </w:p>
     <w:p>
@@ -7318,7 +6863,7 @@
           <w:rFonts w:ascii="Courier New" w:hAnsi="Courier New"/>
           <w:sz w:val="14"/>
         </w:rPr>
-        <w:t xml:space="preserve">        &lt;h2 align="center"&gt;&lt;font color="#1E4FA0" face="Arial"&gt;Карта Кыргызской Республики: кликабельные области&lt;/font&gt;&lt;/h2&gt;</w:t>
+        <w:t xml:space="preserve">        &lt;h2&gt;&lt;font color="#1E4FA0" face="Arial"&gt;Карта Кыргызской Республики&lt;/font&gt;&lt;/h2&gt;</w:t>
       </w:r>
     </w:p>
     <w:p>
@@ -7344,7 +6889,7 @@
           <w:rFonts w:ascii="Courier New" w:hAnsi="Courier New"/>
           <w:sz w:val="14"/>
         </w:rPr>
-        <w:t xml:space="preserve">        &lt;span style="position: relative; display: inline-block;"&gt;</w:t>
+        <w:t xml:space="preserve">            &lt;img src="images/karta.jpg" width="1000" height="528" usemap="#oblasti" border="0"</w:t>
       </w:r>
     </w:p>
     <w:p>
@@ -7357,7 +6902,7 @@
           <w:rFonts w:ascii="Courier New" w:hAnsi="Courier New"/>
           <w:sz w:val="14"/>
         </w:rPr>
-        <w:t xml:space="preserve">            &lt;img src="images/karta.jpg" width="1000" height="528" usemap="#oblasti" border="0"</w:t>
+        <w:t xml:space="preserve">                alt="Карта Кыргызстана с областями"&gt;</w:t>
       </w:r>
     </w:p>
     <w:p>
@@ -7370,7 +6915,7 @@
           <w:rFonts w:ascii="Courier New" w:hAnsi="Courier New"/>
           <w:sz w:val="14"/>
         </w:rPr>
-        <w:t xml:space="preserve">                alt="Карта Кыргызстана с областями" title="Карта Кыргызстана"&gt;</w:t>
+        <w:t xml:space="preserve">            &lt;map name="oblasti"&gt;</w:t>
       </w:r>
     </w:p>
     <w:p>
@@ -7383,7 +6928,7 @@
           <w:rFonts w:ascii="Courier New" w:hAnsi="Courier New"/>
           <w:sz w:val="14"/>
         </w:rPr>
-        <w:t xml:space="preserve">            &lt;map name="oblasti"&gt;</w:t>
+        <w:t xml:space="preserve">                &lt;area shape="poly" coords="</w:t>
       </w:r>
     </w:p>
     <w:p>
@@ -7396,6 +6941,58 @@
           <w:rFonts w:ascii="Courier New" w:hAnsi="Courier New"/>
           <w:sz w:val="14"/>
         </w:rPr>
+        <w:t xml:space="preserve">        174,392,175,399,173,404,174,407,177,410,182,411,182,412,181,412,180,414,182,416,183,417,180,419,</w:t>
+      </w:r>
+    </w:p>
+    <w:p>
+      <w:pPr>
+        <w:spacing w:line="240" w:lineRule="auto" w:after="0"/>
+        <w:shd w:val="clear" w:color="auto" w:fill="F2F2F2"/>
+      </w:pPr>
+      <w:r>
+        <w:rPr>
+          <w:rFonts w:ascii="Courier New" w:hAnsi="Courier New"/>
+          <w:sz w:val="14"/>
+        </w:rPr>
+        <w:t xml:space="preserve">        180,422,177,424,182,426,183,422,184,426,190,424,190,423,192,423,193,421,191,419,192,418,186,417,</w:t>
+      </w:r>
+    </w:p>
+    <w:p>
+      <w:pPr>
+        <w:spacing w:line="240" w:lineRule="auto" w:after="0"/>
+        <w:shd w:val="clear" w:color="auto" w:fill="F2F2F2"/>
+      </w:pPr>
+      <w:r>
+        <w:rPr>
+          <w:rFonts w:ascii="Courier New" w:hAnsi="Courier New"/>
+          <w:sz w:val="14"/>
+        </w:rPr>
+        <w:t xml:space="preserve">        188,416,188,414,187,413,189,413,191,408,185,409,184,410,180,395,177,392,175,392</w:t>
+      </w:r>
+    </w:p>
+    <w:p>
+      <w:pPr>
+        <w:spacing w:line="240" w:lineRule="auto" w:after="0"/>
+        <w:shd w:val="clear" w:color="auto" w:fill="F2F2F2"/>
+      </w:pPr>
+      <w:r>
+        <w:rPr>
+          <w:rFonts w:ascii="Courier New" w:hAnsi="Courier New"/>
+          <w:sz w:val="14"/>
+        </w:rPr>
+        <w:t xml:space="preserve">    " nohref title="Анклав (Узбекистан)"&gt;</w:t>
+      </w:r>
+    </w:p>
+    <w:p>
+      <w:pPr>
+        <w:spacing w:line="240" w:lineRule="auto" w:after="0"/>
+        <w:shd w:val="clear" w:color="auto" w:fill="F2F2F2"/>
+      </w:pPr>
+      <w:r>
+        <w:rPr>
+          <w:rFonts w:ascii="Courier New" w:hAnsi="Courier New"/>
+          <w:sz w:val="14"/>
+        </w:rPr>
         <w:t xml:space="preserve">                &lt;area shape="poly" coords="</w:t>
       </w:r>
     </w:p>
@@ -7409,7 +7006,7 @@
           <w:rFonts w:ascii="Courier New" w:hAnsi="Courier New"/>
           <w:sz w:val="14"/>
         </w:rPr>
-        <w:t xml:space="preserve">        174,392,175,399,173,404,174,407,177,410,182,411,182,412,181,412,180,414,182,416,183,417,180,419,</w:t>
+        <w:t xml:space="preserve">        232,416,233,418,235,418,235,420,238,418,239,417,243,419,245,414,242,413,241,412,238,410,238,413</w:t>
       </w:r>
     </w:p>
     <w:p>
@@ -7422,7 +7019,7 @@
           <w:rFonts w:ascii="Courier New" w:hAnsi="Courier New"/>
           <w:sz w:val="14"/>
         </w:rPr>
-        <w:t xml:space="preserve">        180,422,177,424,182,426,183,422,184,426,190,424,190,423,192,423,193,421,191,419,192,418,186,417,</w:t>
+        <w:t xml:space="preserve">    " nohref title="Анклав (Узбекистан)"&gt;</w:t>
       </w:r>
     </w:p>
     <w:p>
@@ -7435,7 +7032,7 @@
           <w:rFonts w:ascii="Courier New" w:hAnsi="Courier New"/>
           <w:sz w:val="14"/>
         </w:rPr>
-        <w:t xml:space="preserve">        188,416,188,414,187,413,189,413,191,408,185,409,184,410,180,395,177,392,175,392</w:t>
+        <w:t xml:space="preserve">                &lt;area shape="poly" coords="</w:t>
       </w:r>
     </w:p>
     <w:p>
@@ -7448,7 +7045,7 @@
           <w:rFonts w:ascii="Courier New" w:hAnsi="Courier New"/>
           <w:sz w:val="14"/>
         </w:rPr>
-        <w:t xml:space="preserve">    " nohref title="Анклав (Узбекистан)" alt="Анклав (Узбекистан)"&gt;</w:t>
+        <w:t xml:space="preserve">        134,426,135,429,140,431,141,433,141,435,142,437,145,436,146,433,148,433,150,430,151,431,152,430,</w:t>
       </w:r>
     </w:p>
     <w:p>
@@ -7461,6 +7058,32 @@
           <w:rFonts w:ascii="Courier New" w:hAnsi="Courier New"/>
           <w:sz w:val="14"/>
         </w:rPr>
+        <w:t xml:space="preserve">        153,427,151,427,150,426,148,427,138,426,135,424</w:t>
+      </w:r>
+    </w:p>
+    <w:p>
+      <w:pPr>
+        <w:spacing w:line="240" w:lineRule="auto" w:after="0"/>
+        <w:shd w:val="clear" w:color="auto" w:fill="F2F2F2"/>
+      </w:pPr>
+      <w:r>
+        <w:rPr>
+          <w:rFonts w:ascii="Courier New" w:hAnsi="Courier New"/>
+          <w:sz w:val="14"/>
+        </w:rPr>
+        <w:t xml:space="preserve">    " nohref title="Анклав (Таджикистан)"&gt;</w:t>
+      </w:r>
+    </w:p>
+    <w:p>
+      <w:pPr>
+        <w:spacing w:line="240" w:lineRule="auto" w:after="0"/>
+        <w:shd w:val="clear" w:color="auto" w:fill="F2F2F2"/>
+      </w:pPr>
+      <w:r>
+        <w:rPr>
+          <w:rFonts w:ascii="Courier New" w:hAnsi="Courier New"/>
+          <w:sz w:val="14"/>
+        </w:rPr>
         <w:t xml:space="preserve">                &lt;area shape="poly" coords="</w:t>
       </w:r>
     </w:p>
@@ -7474,7 +7097,7 @@
           <w:rFonts w:ascii="Courier New" w:hAnsi="Courier New"/>
           <w:sz w:val="14"/>
         </w:rPr>
-        <w:t xml:space="preserve">        232,416,233,418,235,418,235,420,238,418,239,417,243,419,245,414,242,413,241,412,238,410,238,413</w:t>
+        <w:t xml:space="preserve">        350,178,363,180,366,183,368,188,380,191,383,193,386,192,389,193,395,191,401,191,403,193,405,198,</w:t>
       </w:r>
     </w:p>
     <w:p>
@@ -7487,7 +7110,7 @@
           <w:rFonts w:ascii="Courier New" w:hAnsi="Courier New"/>
           <w:sz w:val="14"/>
         </w:rPr>
-        <w:t xml:space="preserve">    " nohref title="Анклав (Узбекистан)" alt="Анклав (Узбекистан)"&gt;</w:t>
+        <w:t xml:space="preserve">        408,197,414,198,421,195,427,203,430,202,433,202,433,205,431,209,432,210,436,202,443,202,443,197,</w:t>
       </w:r>
     </w:p>
     <w:p>
@@ -7500,6 +7123,188 @@
           <w:rFonts w:ascii="Courier New" w:hAnsi="Courier New"/>
           <w:sz w:val="14"/>
         </w:rPr>
+        <w:t xml:space="preserve">        447,194,447,187,452,183,447,180,448,175,450,169,454,169,460,168,463,168,474,166,478,166,484,160,</w:t>
+      </w:r>
+    </w:p>
+    <w:p>
+      <w:pPr>
+        <w:spacing w:line="240" w:lineRule="auto" w:after="0"/>
+        <w:shd w:val="clear" w:color="auto" w:fill="F2F2F2"/>
+      </w:pPr>
+      <w:r>
+        <w:rPr>
+          <w:rFonts w:ascii="Courier New" w:hAnsi="Courier New"/>
+          <w:sz w:val="14"/>
+        </w:rPr>
+        <w:t xml:space="preserve">        492,159,493,158,491,154,486,148,488,145,494,144,495,145,497,144,502,145,505,143,507,143,508,146,</w:t>
+      </w:r>
+    </w:p>
+    <w:p>
+      <w:pPr>
+        <w:spacing w:line="240" w:lineRule="auto" w:after="0"/>
+        <w:shd w:val="clear" w:color="auto" w:fill="F2F2F2"/>
+      </w:pPr>
+      <w:r>
+        <w:rPr>
+          <w:rFonts w:ascii="Courier New" w:hAnsi="Courier New"/>
+          <w:sz w:val="14"/>
+        </w:rPr>
+        <w:t xml:space="preserve">        510,145,513,143,517,145,521,144,527,146,533,144,535,142,538,145,539,144,541,144,544,144,547,142,</w:t>
+      </w:r>
+    </w:p>
+    <w:p>
+      <w:pPr>
+        <w:spacing w:line="240" w:lineRule="auto" w:after="0"/>
+        <w:shd w:val="clear" w:color="auto" w:fill="F2F2F2"/>
+      </w:pPr>
+      <w:r>
+        <w:rPr>
+          <w:rFonts w:ascii="Courier New" w:hAnsi="Courier New"/>
+          <w:sz w:val="14"/>
+        </w:rPr>
+        <w:t xml:space="preserve">        548,143,548,145,552,145,560,140,562,137,562,135,570,133,570,128,571,127,577,129,584,128,595,124,</w:t>
+      </w:r>
+    </w:p>
+    <w:p>
+      <w:pPr>
+        <w:spacing w:line="240" w:lineRule="auto" w:after="0"/>
+        <w:shd w:val="clear" w:color="auto" w:fill="F2F2F2"/>
+      </w:pPr>
+      <w:r>
+        <w:rPr>
+          <w:rFonts w:ascii="Courier New" w:hAnsi="Courier New"/>
+          <w:sz w:val="14"/>
+        </w:rPr>
+        <w:t xml:space="preserve">        601,125,602,121,610,115,617,110,624,109,624,107,625,106,634,107,636,106,653,108,654,105,664,104,</w:t>
+      </w:r>
+    </w:p>
+    <w:p>
+      <w:pPr>
+        <w:spacing w:line="240" w:lineRule="auto" w:after="0"/>
+        <w:shd w:val="clear" w:color="auto" w:fill="F2F2F2"/>
+      </w:pPr>
+      <w:r>
+        <w:rPr>
+          <w:rFonts w:ascii="Courier New" w:hAnsi="Courier New"/>
+          <w:sz w:val="14"/>
+        </w:rPr>
+        <w:t xml:space="preserve">        676,104,679,103,687,96,686,93,687,91,684,89,682,89,681,86,676,86,672,89,669,85,665,85,</w:t>
+      </w:r>
+    </w:p>
+    <w:p>
+      <w:pPr>
+        <w:spacing w:line="240" w:lineRule="auto" w:after="0"/>
+        <w:shd w:val="clear" w:color="auto" w:fill="F2F2F2"/>
+      </w:pPr>
+      <w:r>
+        <w:rPr>
+          <w:rFonts w:ascii="Courier New" w:hAnsi="Courier New"/>
+          <w:sz w:val="14"/>
+        </w:rPr>
+        <w:t xml:space="preserve">        663,87,657,86,653,89,651,88,650,89,649,92,646,94,639,94,637,93,634,94,630,92,627,96,</w:t>
+      </w:r>
+    </w:p>
+    <w:p>
+      <w:pPr>
+        <w:spacing w:line="240" w:lineRule="auto" w:after="0"/>
+        <w:shd w:val="clear" w:color="auto" w:fill="F2F2F2"/>
+      </w:pPr>
+      <w:r>
+        <w:rPr>
+          <w:rFonts w:ascii="Courier New" w:hAnsi="Courier New"/>
+          <w:sz w:val="14"/>
+        </w:rPr>
+        <w:t xml:space="preserve">        615,99,611,97,611,93,609,93,603,92,602,91,589,93,586,91,582,91,581,88,573,90,570,94,</w:t>
+      </w:r>
+    </w:p>
+    <w:p>
+      <w:pPr>
+        <w:spacing w:line="240" w:lineRule="auto" w:after="0"/>
+        <w:shd w:val="clear" w:color="auto" w:fill="F2F2F2"/>
+      </w:pPr>
+      <w:r>
+        <w:rPr>
+          <w:rFonts w:ascii="Courier New" w:hAnsi="Courier New"/>
+          <w:sz w:val="14"/>
+        </w:rPr>
+        <w:t xml:space="preserve">        568,101,563,106,544,101,542,101,529,99,523,99,511,93,506,92,497,87,493,84,487,83,483,84,</w:t>
+      </w:r>
+    </w:p>
+    <w:p>
+      <w:pPr>
+        <w:spacing w:line="240" w:lineRule="auto" w:after="0"/>
+        <w:shd w:val="clear" w:color="auto" w:fill="F2F2F2"/>
+      </w:pPr>
+      <w:r>
+        <w:rPr>
+          <w:rFonts w:ascii="Courier New" w:hAnsi="Courier New"/>
+          <w:sz w:val="14"/>
+        </w:rPr>
+        <w:t xml:space="preserve">        479,79,474,77,469,69,455,64,453,62,446,59,445,56,443,56,439,54,441,60,439,62,428,63,</w:t>
+      </w:r>
+    </w:p>
+    <w:p>
+      <w:pPr>
+        <w:spacing w:line="240" w:lineRule="auto" w:after="0"/>
+        <w:shd w:val="clear" w:color="auto" w:fill="F2F2F2"/>
+      </w:pPr>
+      <w:r>
+        <w:rPr>
+          <w:rFonts w:ascii="Courier New" w:hAnsi="Courier New"/>
+          <w:sz w:val="14"/>
+        </w:rPr>
+        <w:t xml:space="preserve">        425,64,419,59,419,63,415,70,412,70,408,69,385,81,386,85,382,91,383,95,382,107,378,112,</w:t>
+      </w:r>
+    </w:p>
+    <w:p>
+      <w:pPr>
+        <w:spacing w:line="240" w:lineRule="auto" w:after="0"/>
+        <w:shd w:val="clear" w:color="auto" w:fill="F2F2F2"/>
+      </w:pPr>
+      <w:r>
+        <w:rPr>
+          <w:rFonts w:ascii="Courier New" w:hAnsi="Courier New"/>
+          <w:sz w:val="14"/>
+        </w:rPr>
+        <w:t xml:space="preserve">        375,132,377,136,379,140,382,142,383,145,385,138,387,139,390,142,392,141,394,143,394,146,391,151,</w:t>
+      </w:r>
+    </w:p>
+    <w:p>
+      <w:pPr>
+        <w:spacing w:line="240" w:lineRule="auto" w:after="0"/>
+        <w:shd w:val="clear" w:color="auto" w:fill="F2F2F2"/>
+      </w:pPr>
+      <w:r>
+        <w:rPr>
+          <w:rFonts w:ascii="Courier New" w:hAnsi="Courier New"/>
+          <w:sz w:val="14"/>
+        </w:rPr>
+        <w:t xml:space="preserve">        391,156,389,157,380,160,371,159,367,161,362,160,359,161,355,161,350,165,345,163,344,170,350,173</w:t>
+      </w:r>
+    </w:p>
+    <w:p>
+      <w:pPr>
+        <w:spacing w:line="240" w:lineRule="auto" w:after="0"/>
+        <w:shd w:val="clear" w:color="auto" w:fill="F2F2F2"/>
+      </w:pPr>
+      <w:r>
+        <w:rPr>
+          <w:rFonts w:ascii="Courier New" w:hAnsi="Courier New"/>
+          <w:sz w:val="14"/>
+        </w:rPr>
+        <w:t xml:space="preserve">    " nohref title="Чуйская область"&gt;</w:t>
+      </w:r>
+    </w:p>
+    <w:p>
+      <w:pPr>
+        <w:spacing w:line="240" w:lineRule="auto" w:after="0"/>
+        <w:shd w:val="clear" w:color="auto" w:fill="F2F2F2"/>
+      </w:pPr>
+      <w:r>
+        <w:rPr>
+          <w:rFonts w:ascii="Courier New" w:hAnsi="Courier New"/>
+          <w:sz w:val="14"/>
+        </w:rPr>
         <w:t xml:space="preserve">                &lt;area shape="poly" coords="</w:t>
       </w:r>
     </w:p>
@@ -7513,7 +7318,7 @@
           <w:rFonts w:ascii="Courier New" w:hAnsi="Courier New"/>
           <w:sz w:val="14"/>
         </w:rPr>
-        <w:t xml:space="preserve">        134,426,135,429,140,431,141,433,141,435,142,437,145,436,146,433,148,433,150,430,151,431,152,430,</w:t>
+        <w:t xml:space="preserve">        163,159,165,161,166,163,168,162,173,164,176,159,179,159,183,162,185,161,191,166,191,167,194,167,</w:t>
       </w:r>
     </w:p>
     <w:p>
@@ -7526,7 +7331,7 @@
           <w:rFonts w:ascii="Courier New" w:hAnsi="Courier New"/>
           <w:sz w:val="14"/>
         </w:rPr>
-        <w:t xml:space="preserve">        153,427,151,427,150,426,148,427,138,426,135,424</w:t>
+        <w:t xml:space="preserve">        195,169,198,168,201,169,205,169,211,171,213,171,215,169,221,169,224,168,229,169,233,174,243,176,</w:t>
       </w:r>
     </w:p>
     <w:p>
@@ -7539,7 +7344,7 @@
           <w:rFonts w:ascii="Courier New" w:hAnsi="Courier New"/>
           <w:sz w:val="14"/>
         </w:rPr>
-        <w:t xml:space="preserve">    " nohref title="Анклав (Таджикистан)" alt="Анклав (Таджикистан)"&gt;</w:t>
+        <w:t xml:space="preserve">        268,185,270,184,271,175,274,171,274,169,276,168,279,168,281,169,283,168,289,171,289,173,294,174,</w:t>
       </w:r>
     </w:p>
     <w:p>
@@ -7552,6 +7357,110 @@
           <w:rFonts w:ascii="Courier New" w:hAnsi="Courier New"/>
           <w:sz w:val="14"/>
         </w:rPr>
+        <w:t xml:space="preserve">        303,175,305,177,313,177,323,185,328,185,329,184,329,182,333,180,336,177,339,178,342,177,344,179,</w:t>
+      </w:r>
+    </w:p>
+    <w:p>
+      <w:pPr>
+        <w:spacing w:line="240" w:lineRule="auto" w:after="0"/>
+        <w:shd w:val="clear" w:color="auto" w:fill="F2F2F2"/>
+      </w:pPr>
+      <w:r>
+        <w:rPr>
+          <w:rFonts w:ascii="Courier New" w:hAnsi="Courier New"/>
+          <w:sz w:val="14"/>
+        </w:rPr>
+        <w:t xml:space="preserve">        347,179,348,178,348,174,343,170,343,164,344,162,350,163,355,159,359,160,362,158,367,160,369,157,</w:t>
+      </w:r>
+    </w:p>
+    <w:p>
+      <w:pPr>
+        <w:spacing w:line="240" w:lineRule="auto" w:after="0"/>
+        <w:shd w:val="clear" w:color="auto" w:fill="F2F2F2"/>
+      </w:pPr>
+      <w:r>
+        <w:rPr>
+          <w:rFonts w:ascii="Courier New" w:hAnsi="Courier New"/>
+          <w:sz w:val="14"/>
+        </w:rPr>
+        <w:t xml:space="preserve">        373,157,380,159,388,156,393,144,391,142,389,143,386,140,385,144,383,147,381,146,378,147,368,145,</w:t>
+      </w:r>
+    </w:p>
+    <w:p>
+      <w:pPr>
+        <w:spacing w:line="240" w:lineRule="auto" w:after="0"/>
+        <w:shd w:val="clear" w:color="auto" w:fill="F2F2F2"/>
+      </w:pPr>
+      <w:r>
+        <w:rPr>
+          <w:rFonts w:ascii="Courier New" w:hAnsi="Courier New"/>
+          <w:sz w:val="14"/>
+        </w:rPr>
+        <w:t xml:space="preserve">        364,142,364,136,349,133,331,134,323,131,317,123,306,118,302,119,297,118,279,110,270,110,266,112,</w:t>
+      </w:r>
+    </w:p>
+    <w:p>
+      <w:pPr>
+        <w:spacing w:line="240" w:lineRule="auto" w:after="0"/>
+        <w:shd w:val="clear" w:color="auto" w:fill="F2F2F2"/>
+      </w:pPr>
+      <w:r>
+        <w:rPr>
+          <w:rFonts w:ascii="Courier New" w:hAnsi="Courier New"/>
+          <w:sz w:val="14"/>
+        </w:rPr>
+        <w:t xml:space="preserve">        263,111,260,109,255,107,251,104,245,102,241,102,230,106,226,109,220,108,218,105,212,107,206,106,</w:t>
+      </w:r>
+    </w:p>
+    <w:p>
+      <w:pPr>
+        <w:spacing w:line="240" w:lineRule="auto" w:after="0"/>
+        <w:shd w:val="clear" w:color="auto" w:fill="F2F2F2"/>
+      </w:pPr>
+      <w:r>
+        <w:rPr>
+          <w:rFonts w:ascii="Courier New" w:hAnsi="Courier New"/>
+          <w:sz w:val="14"/>
+        </w:rPr>
+        <w:t xml:space="preserve">        204,107,197,107,193,117,189,119,189,125,187,128,186,128,186,127,174,128,174,131,178,133,182,139,</w:t>
+      </w:r>
+    </w:p>
+    <w:p>
+      <w:pPr>
+        <w:spacing w:line="240" w:lineRule="auto" w:after="0"/>
+        <w:shd w:val="clear" w:color="auto" w:fill="F2F2F2"/>
+      </w:pPr>
+      <w:r>
+        <w:rPr>
+          <w:rFonts w:ascii="Courier New" w:hAnsi="Courier New"/>
+          <w:sz w:val="14"/>
+        </w:rPr>
+        <w:t xml:space="preserve">        180,141,173,139,170,145,169,147,171,149,165,153</w:t>
+      </w:r>
+    </w:p>
+    <w:p>
+      <w:pPr>
+        <w:spacing w:line="240" w:lineRule="auto" w:after="0"/>
+        <w:shd w:val="clear" w:color="auto" w:fill="F2F2F2"/>
+      </w:pPr>
+      <w:r>
+        <w:rPr>
+          <w:rFonts w:ascii="Courier New" w:hAnsi="Courier New"/>
+          <w:sz w:val="14"/>
+        </w:rPr>
+        <w:t xml:space="preserve">    " nohref title="Таласская область"&gt;</w:t>
+      </w:r>
+    </w:p>
+    <w:p>
+      <w:pPr>
+        <w:spacing w:line="240" w:lineRule="auto" w:after="0"/>
+        <w:shd w:val="clear" w:color="auto" w:fill="F2F2F2"/>
+      </w:pPr>
+      <w:r>
+        <w:rPr>
+          <w:rFonts w:ascii="Courier New" w:hAnsi="Courier New"/>
+          <w:sz w:val="14"/>
+        </w:rPr>
         <w:t xml:space="preserve">                &lt;area shape="poly" coords="</w:t>
       </w:r>
     </w:p>
@@ -7565,7 +7474,7 @@
           <w:rFonts w:ascii="Courier New" w:hAnsi="Courier New"/>
           <w:sz w:val="14"/>
         </w:rPr>
-        <w:t xml:space="preserve">        350,178,363,180,366,183,368,188,380,191,383,193,386,192,389,193,395,191,401,191,403,193,405,198,</w:t>
+        <w:t xml:space="preserve">        558,143,561,146,568,149,569,151,571,153,577,152,579,148,587,149,586,156,587,158,587,159,589,169,</w:t>
       </w:r>
     </w:p>
     <w:p>
@@ -7578,7 +7487,7 @@
           <w:rFonts w:ascii="Courier New" w:hAnsi="Courier New"/>
           <w:sz w:val="14"/>
         </w:rPr>
-        <w:t xml:space="preserve">        408,197,414,198,421,195,427,203,430,202,433,202,433,205,431,209,432,210,436,202,443,202,443,197,</w:t>
+        <w:t xml:space="preserve">        594,172,594,175,598,176,599,178,597,186,595,188,593,191,595,192,605,188,614,191,620,192,622,194,</w:t>
       </w:r>
     </w:p>
     <w:p>
@@ -7591,7 +7500,7 @@
           <w:rFonts w:ascii="Courier New" w:hAnsi="Courier New"/>
           <w:sz w:val="14"/>
         </w:rPr>
-        <w:t xml:space="preserve">        447,194,447,187,452,183,447,180,448,175,450,169,454,169,460,168,463,168,474,166,478,166,484,160,</w:t>
+        <w:t xml:space="preserve">        625,194,627,193,633,195,640,200,639,206,635,210,630,210,629,214,629,219,634,219,641,215,647,218,</w:t>
       </w:r>
     </w:p>
     <w:p>
@@ -7604,7 +7513,7 @@
           <w:rFonts w:ascii="Courier New" w:hAnsi="Courier New"/>
           <w:sz w:val="14"/>
         </w:rPr>
-        <w:t xml:space="preserve">        492,159,493,158,491,154,486,148,488,145,494,144,495,145,497,144,502,145,505,143,507,143,508,146,</w:t>
+        <w:t xml:space="preserve">        648,220,648,223,644,233,649,238,656,238,662,236,687,237,698,232,699,235,697,245,691,244,690,246,</w:t>
       </w:r>
     </w:p>
     <w:p>
@@ -7617,7 +7526,7 @@
           <w:rFonts w:ascii="Courier New" w:hAnsi="Courier New"/>
           <w:sz w:val="14"/>
         </w:rPr>
-        <w:t xml:space="preserve">        510,145,513,143,517,145,521,144,527,146,533,144,535,142,538,145,539,144,541,144,544,144,547,142,</w:t>
+        <w:t xml:space="preserve">        695,253,705,260,701,271,699,273,711,270,717,265,724,267,729,277,742,280,744,281,749,281,750,282,</w:t>
       </w:r>
     </w:p>
     <w:p>
@@ -7630,7 +7539,7 @@
           <w:rFonts w:ascii="Courier New" w:hAnsi="Courier New"/>
           <w:sz w:val="14"/>
         </w:rPr>
-        <w:t xml:space="preserve">        548,143,548,145,552,145,560,140,562,137,562,135,570,133,570,128,571,127,577,129,584,128,595,124,</w:t>
+        <w:t xml:space="preserve">        762,277,763,268,764,265,763,262,765,260,771,258,779,259,780,258,783,259,784,256,789,256,795,253,</w:t>
       </w:r>
     </w:p>
     <w:p>
@@ -7643,7 +7552,7 @@
           <w:rFonts w:ascii="Courier New" w:hAnsi="Courier New"/>
           <w:sz w:val="14"/>
         </w:rPr>
-        <w:t xml:space="preserve">        601,125,602,121,610,115,617,110,624,109,624,107,625,106,634,107,636,106,653,108,654,105,664,104,</w:t>
+        <w:t xml:space="preserve">        799,249,800,249,801,250,803,249,805,250,806,247,809,245,808,244,811,241,819,240,822,236,824,236,</w:t>
       </w:r>
     </w:p>
     <w:p>
@@ -7656,7 +7565,7 @@
           <w:rFonts w:ascii="Courier New" w:hAnsi="Courier New"/>
           <w:sz w:val="14"/>
         </w:rPr>
-        <w:t xml:space="preserve">        676,104,679,103,687,96,686,93,687,91,684,89,682,89,681,86,676,86,672,89,669,85,665,85,</w:t>
+        <w:t xml:space="preserve">        826,234,828,231,834,229,836,229,837,227,843,225,845,222,852,222,861,213,864,214,868,209,873,208,</w:t>
       </w:r>
     </w:p>
     <w:p>
@@ -7669,7 +7578,7 @@
           <w:rFonts w:ascii="Courier New" w:hAnsi="Courier New"/>
           <w:sz w:val="14"/>
         </w:rPr>
-        <w:t xml:space="preserve">        663,87,657,86,653,89,651,88,650,89,649,92,646,94,639,94,637,93,634,94,630,92,627,96,</w:t>
+        <w:t xml:space="preserve">        876,210,881,209,885,207,887,203,896,202,898,203,900,201,902,196,904,194,904,191,907,188,921,186,</w:t>
       </w:r>
     </w:p>
     <w:p>
@@ -7682,7 +7591,7 @@
           <w:rFonts w:ascii="Courier New" w:hAnsi="Courier New"/>
           <w:sz w:val="14"/>
         </w:rPr>
-        <w:t xml:space="preserve">        615,99,611,97,611,93,609,93,603,92,602,91,589,93,586,91,582,91,581,88,573,90,570,94,</w:t>
+        <w:t xml:space="preserve">        929,188,933,188,935,186,929,180,927,174,930,173,931,169,926,162,928,161,924,158,923,156,918,155,</w:t>
       </w:r>
     </w:p>
     <w:p>
@@ -7695,7 +7604,7 @@
           <w:rFonts w:ascii="Courier New" w:hAnsi="Courier New"/>
           <w:sz w:val="14"/>
         </w:rPr>
-        <w:t xml:space="preserve">        568,101,563,106,544,101,542,101,529,99,523,99,511,93,506,92,497,87,493,84,487,83,483,84,</w:t>
+        <w:t xml:space="preserve">        917,152,915,151,914,146,897,144,896,142,890,141,887,143,876,143,875,139,870,136,869,134,863,127,</w:t>
       </w:r>
     </w:p>
     <w:p>
@@ -7708,7 +7617,7 @@
           <w:rFonts w:ascii="Courier New" w:hAnsi="Courier New"/>
           <w:sz w:val="14"/>
         </w:rPr>
-        <w:t xml:space="preserve">        479,79,474,77,469,69,455,64,453,62,446,59,445,56,443,56,439,54,441,60,439,62,428,63,</w:t>
+        <w:t xml:space="preserve">        861,127,859,125,856,124,851,120,848,112,848,109,850,105,840,108,838,110,836,108,829,108,825,106,</w:t>
       </w:r>
     </w:p>
     <w:p>
@@ -7721,7 +7630,7 @@
           <w:rFonts w:ascii="Courier New" w:hAnsi="Courier New"/>
           <w:sz w:val="14"/>
         </w:rPr>
-        <w:t xml:space="preserve">        425,64,419,59,419,63,415,70,412,70,408,69,385,81,386,85,382,91,383,95,382,107,378,112,</w:t>
+        <w:t xml:space="preserve">        819,104,817,105,816,104,812,104,811,103,810,104,807,104,803,99,800,100,793,94,788,97,783,96,</w:t>
       </w:r>
     </w:p>
     <w:p>
@@ -7734,7 +7643,7 @@
           <w:rFonts w:ascii="Courier New" w:hAnsi="Courier New"/>
           <w:sz w:val="14"/>
         </w:rPr>
-        <w:t xml:space="preserve">        375,132,377,136,379,140,382,142,383,145,385,138,387,139,390,142,392,141,394,143,394,146,391,151,</w:t>
+        <w:t xml:space="preserve">        781,99,772,97,770,98,768,96,766,99,762,98,760,100,756,100,753,98,749,100,747,98,747,97,</w:t>
       </w:r>
     </w:p>
     <w:p>
@@ -7747,7 +7656,7 @@
           <w:rFonts w:ascii="Courier New" w:hAnsi="Courier New"/>
           <w:sz w:val="14"/>
         </w:rPr>
-        <w:t xml:space="preserve">        391,156,389,157,380,160,371,159,367,161,362,160,359,161,355,161,350,165,345,163,344,170,350,173</w:t>
+        <w:t xml:space="preserve">        745,98,741,96,737,96,734,93,733,94,727,94,725,93,717,93,715,90,711,92,708,90,704,91,</w:t>
       </w:r>
     </w:p>
     <w:p>
@@ -7760,7 +7669,7 @@
           <w:rFonts w:ascii="Courier New" w:hAnsi="Courier New"/>
           <w:sz w:val="14"/>
         </w:rPr>
-        <w:t xml:space="preserve">    " nohref title="Чуйская область" alt="Чуйская область"&gt;</w:t>
+        <w:t xml:space="preserve">        698,94,695,93,694,93,688,93,688,97,681,104,677,105,664,105,655,107,653,109,636,108,634,109,</w:t>
       </w:r>
     </w:p>
     <w:p>
@@ -7773,6 +7682,45 @@
           <w:rFonts w:ascii="Courier New" w:hAnsi="Courier New"/>
           <w:sz w:val="14"/>
         </w:rPr>
+        <w:t xml:space="preserve">        626,107,625,110,618,111,611,116,604,122,602,126,596,125,584,129,577,130,571,128,571,135,563,136,</w:t>
+      </w:r>
+    </w:p>
+    <w:p>
+      <w:pPr>
+        <w:spacing w:line="240" w:lineRule="auto" w:after="0"/>
+        <w:shd w:val="clear" w:color="auto" w:fill="F2F2F2"/>
+      </w:pPr>
+      <w:r>
+        <w:rPr>
+          <w:rFonts w:ascii="Courier New" w:hAnsi="Courier New"/>
+          <w:sz w:val="14"/>
+        </w:rPr>
+        <w:t xml:space="preserve">        563,138</w:t>
+      </w:r>
+    </w:p>
+    <w:p>
+      <w:pPr>
+        <w:spacing w:line="240" w:lineRule="auto" w:after="0"/>
+        <w:shd w:val="clear" w:color="auto" w:fill="F2F2F2"/>
+      </w:pPr>
+      <w:r>
+        <w:rPr>
+          <w:rFonts w:ascii="Courier New" w:hAnsi="Courier New"/>
+          <w:sz w:val="14"/>
+        </w:rPr>
+        <w:t xml:space="preserve">    " nohref title="Иссык-Кульская область"&gt;</w:t>
+      </w:r>
+    </w:p>
+    <w:p>
+      <w:pPr>
+        <w:spacing w:line="240" w:lineRule="auto" w:after="0"/>
+        <w:shd w:val="clear" w:color="auto" w:fill="F2F2F2"/>
+      </w:pPr>
+      <w:r>
+        <w:rPr>
+          <w:rFonts w:ascii="Courier New" w:hAnsi="Courier New"/>
+          <w:sz w:val="14"/>
+        </w:rPr>
         <w:t xml:space="preserve">                &lt;area shape="poly" coords="</w:t>
       </w:r>
     </w:p>
@@ -7786,7 +7734,7 @@
           <w:rFonts w:ascii="Courier New" w:hAnsi="Courier New"/>
           <w:sz w:val="14"/>
         </w:rPr>
-        <w:t xml:space="preserve">        163,159,165,161,166,163,168,162,173,164,176,159,179,159,183,162,185,161,191,166,191,167,194,167,</w:t>
+        <w:t xml:space="preserve">        372,250,381,256,381,266,387,269,392,267,399,273,408,284,414,298,439,317,440,320,452,335,456,338,</w:t>
       </w:r>
     </w:p>
     <w:p>
@@ -7799,7 +7747,7 @@
           <w:rFonts w:ascii="Courier New" w:hAnsi="Courier New"/>
           <w:sz w:val="14"/>
         </w:rPr>
-        <w:t xml:space="preserve">        195,169,198,168,201,169,205,169,211,171,213,171,215,169,221,169,224,168,229,169,233,174,243,176,</w:t>
+        <w:t xml:space="preserve">        470,344,471,347,470,352,480,355,489,356,491,354,497,357,502,362,506,360,512,364,516,361,523,363,</w:t>
       </w:r>
     </w:p>
     <w:p>
@@ -7812,7 +7760,7 @@
           <w:rFonts w:ascii="Courier New" w:hAnsi="Courier New"/>
           <w:sz w:val="14"/>
         </w:rPr>
-        <w:t xml:space="preserve">        268,185,270,184,271,175,274,171,274,169,276,168,279,168,281,169,283,168,289,171,289,173,294,174,</w:t>
+        <w:t xml:space="preserve">        525,359,528,358,531,353,538,351,542,346,548,341,554,339,554,341,557,344,556,352,558,356,561,357,</w:t>
       </w:r>
     </w:p>
     <w:p>
@@ -7825,7 +7773,7 @@
           <w:rFonts w:ascii="Courier New" w:hAnsi="Courier New"/>
           <w:sz w:val="14"/>
         </w:rPr>
-        <w:t xml:space="preserve">        303,175,305,177,313,177,323,185,328,185,329,184,329,182,333,180,336,177,339,178,342,177,344,179,</w:t>
+        <w:t xml:space="preserve">        565,360,564,364,561,367,560,373,563,379,562,381,564,378,568,379,572,376,574,377,577,377,580,379,</w:t>
       </w:r>
     </w:p>
     <w:p>
@@ -7838,7 +7786,7 @@
           <w:rFonts w:ascii="Courier New" w:hAnsi="Courier New"/>
           <w:sz w:val="14"/>
         </w:rPr>
-        <w:t xml:space="preserve">        347,179,348,178,348,174,343,170,343,164,344,162,350,163,355,159,359,160,362,158,367,160,369,157,</w:t>
+        <w:t xml:space="preserve">        580,376,583,372,583,371,586,370,589,373,592,370,600,371,609,363,611,365,611,367,613,367,615,370,</w:t>
       </w:r>
     </w:p>
     <w:p>
@@ -7851,7 +7799,7 @@
           <w:rFonts w:ascii="Courier New" w:hAnsi="Courier New"/>
           <w:sz w:val="14"/>
         </w:rPr>
-        <w:t xml:space="preserve">        373,157,380,159,388,156,393,144,391,142,389,143,386,140,385,144,383,147,381,146,378,147,368,145,</w:t>
+        <w:t xml:space="preserve">        614,373,617,369,618,369,619,370,623,369,624,367,628,365,630,361,630,356,632,351,635,348,637,345,</w:t>
       </w:r>
     </w:p>
     <w:p>
@@ -7864,7 +7812,7 @@
           <w:rFonts w:ascii="Courier New" w:hAnsi="Courier New"/>
           <w:sz w:val="14"/>
         </w:rPr>
-        <w:t xml:space="preserve">        364,142,364,136,349,133,331,134,323,131,317,123,306,118,302,119,297,118,279,110,270,110,266,112,</w:t>
+        <w:t xml:space="preserve">        640,344,640,338,641,336,639,333,639,329,642,326,644,326,646,322,645,320,647,316,646,313,648,307,</w:t>
       </w:r>
     </w:p>
     <w:p>
@@ -7877,7 +7825,7 @@
           <w:rFonts w:ascii="Courier New" w:hAnsi="Courier New"/>
           <w:sz w:val="14"/>
         </w:rPr>
-        <w:t xml:space="preserve">        263,111,260,109,255,107,251,104,245,102,241,102,230,106,226,109,220,108,218,105,212,107,206,106,</w:t>
+        <w:t xml:space="preserve">        654,304,656,304,656,302,658,299,663,299,666,295,669,294,671,295,677,295,679,297,679,298,684,300,</w:t>
       </w:r>
     </w:p>
     <w:p>
@@ -7890,7 +7838,7 @@
           <w:rFonts w:ascii="Courier New" w:hAnsi="Courier New"/>
           <w:sz w:val="14"/>
         </w:rPr>
-        <w:t xml:space="preserve">        204,107,197,107,193,117,189,119,189,125,187,128,186,128,186,127,174,128,174,131,178,133,182,139,</w:t>
+        <w:t xml:space="preserve">        684,299,688,298,693,301,699,297,701,298,703,297,705,299,709,299,709,302,715,301,717,302,723,300,</w:t>
       </w:r>
     </w:p>
     <w:p>
@@ -7903,7 +7851,7 @@
           <w:rFonts w:ascii="Courier New" w:hAnsi="Courier New"/>
           <w:sz w:val="14"/>
         </w:rPr>
-        <w:t xml:space="preserve">        180,141,173,139,170,145,169,147,171,149,165,153</w:t>
+        <w:t xml:space="preserve">        724,301,726,301,730,298,732,300,735,297,736,297,735,293,735,288,738,285,743,282,728,278,723,269,</w:t>
       </w:r>
     </w:p>
     <w:p>
@@ -7916,7 +7864,7 @@
           <w:rFonts w:ascii="Courier New" w:hAnsi="Courier New"/>
           <w:sz w:val="14"/>
         </w:rPr>
-        <w:t xml:space="preserve">    " nohref title="Таласская область" alt="Таласская область"&gt;</w:t>
+        <w:t xml:space="preserve">        717,267,712,271,697,274,703,261,694,254,688,246,689,244,690,243,696,244,698,234,688,239,662,237,</w:t>
       </w:r>
     </w:p>
     <w:p>
@@ -7929,6 +7877,136 @@
           <w:rFonts w:ascii="Courier New" w:hAnsi="Courier New"/>
           <w:sz w:val="14"/>
         </w:rPr>
+        <w:t xml:space="preserve">        655,240,648,239,642,233,646,222,646,219,641,216,634,221,629,221,628,219,627,213,629,209,630,208,</w:t>
+      </w:r>
+    </w:p>
+    <w:p>
+      <w:pPr>
+        <w:spacing w:line="240" w:lineRule="auto" w:after="0"/>
+        <w:shd w:val="clear" w:color="auto" w:fill="F2F2F2"/>
+      </w:pPr>
+      <w:r>
+        <w:rPr>
+          <w:rFonts w:ascii="Courier New" w:hAnsi="Courier New"/>
+          <w:sz w:val="14"/>
+        </w:rPr>
+        <w:t xml:space="preserve">        634,208,638,204,638,201,632,197,627,195,625,196,622,195,620,193,613,193,605,190,596,193,591,192,</w:t>
+      </w:r>
+    </w:p>
+    <w:p>
+      <w:pPr>
+        <w:spacing w:line="240" w:lineRule="auto" w:after="0"/>
+        <w:shd w:val="clear" w:color="auto" w:fill="F2F2F2"/>
+      </w:pPr>
+      <w:r>
+        <w:rPr>
+          <w:rFonts w:ascii="Courier New" w:hAnsi="Courier New"/>
+          <w:sz w:val="14"/>
+        </w:rPr>
+        <w:t xml:space="preserve">        591,190,593,186,595,185,598,179,593,176,592,173,588,170,585,157,586,150,580,149,578,153,571,154,</w:t>
+      </w:r>
+    </w:p>
+    <w:p>
+      <w:pPr>
+        <w:spacing w:line="240" w:lineRule="auto" w:after="0"/>
+        <w:shd w:val="clear" w:color="auto" w:fill="F2F2F2"/>
+      </w:pPr>
+      <w:r>
+        <w:rPr>
+          <w:rFonts w:ascii="Courier New" w:hAnsi="Courier New"/>
+          <w:sz w:val="14"/>
+        </w:rPr>
+        <w:t xml:space="preserve">        568,152,567,150,560,147,557,144,551,147,548,147,546,144,545,146,540,145,538,147,535,144,533,146,</w:t>
+      </w:r>
+    </w:p>
+    <w:p>
+      <w:pPr>
+        <w:spacing w:line="240" w:lineRule="auto" w:after="0"/>
+        <w:shd w:val="clear" w:color="auto" w:fill="F2F2F2"/>
+      </w:pPr>
+      <w:r>
+        <w:rPr>
+          <w:rFonts w:ascii="Courier New" w:hAnsi="Courier New"/>
+          <w:sz w:val="14"/>
+        </w:rPr>
+        <w:t xml:space="preserve">        527,147,520,145,517,146,514,145,511,147,508,147,505,144,502,147,497,146,495,147,494,146,488,147,</w:t>
+      </w:r>
+    </w:p>
+    <w:p>
+      <w:pPr>
+        <w:spacing w:line="240" w:lineRule="auto" w:after="0"/>
+        <w:shd w:val="clear" w:color="auto" w:fill="F2F2F2"/>
+      </w:pPr>
+      <w:r>
+        <w:rPr>
+          <w:rFonts w:ascii="Courier New" w:hAnsi="Courier New"/>
+          <w:sz w:val="14"/>
+        </w:rPr>
+        <w:t xml:space="preserve">        494,158,493,160,485,161,479,168,475,167,463,170,460,169,454,171,451,170,449,180,453,182,454,184,</w:t>
+      </w:r>
+    </w:p>
+    <w:p>
+      <w:pPr>
+        <w:spacing w:line="240" w:lineRule="auto" w:after="0"/>
+        <w:shd w:val="clear" w:color="auto" w:fill="F2F2F2"/>
+      </w:pPr>
+      <w:r>
+        <w:rPr>
+          <w:rFonts w:ascii="Courier New" w:hAnsi="Courier New"/>
+          <w:sz w:val="14"/>
+        </w:rPr>
+        <w:t xml:space="preserve">        449,188,449,194,445,198,444,203,442,204,437,203,433,212,430,211,431,203,426,204,420,197,418,199,</w:t>
+      </w:r>
+    </w:p>
+    <w:p>
+      <w:pPr>
+        <w:spacing w:line="240" w:lineRule="auto" w:after="0"/>
+        <w:shd w:val="clear" w:color="auto" w:fill="F2F2F2"/>
+      </w:pPr>
+      <w:r>
+        <w:rPr>
+          <w:rFonts w:ascii="Courier New" w:hAnsi="Courier New"/>
+          <w:sz w:val="14"/>
+        </w:rPr>
+        <w:t xml:space="preserve">        414,200,407,199,405,200,397,210,390,210,390,214,398,220,402,221,408,221,409,223,412,223,417,236,</w:t>
+      </w:r>
+    </w:p>
+    <w:p>
+      <w:pPr>
+        <w:spacing w:line="240" w:lineRule="auto" w:after="0"/>
+        <w:shd w:val="clear" w:color="auto" w:fill="F2F2F2"/>
+      </w:pPr>
+      <w:r>
+        <w:rPr>
+          <w:rFonts w:ascii="Courier New" w:hAnsi="Courier New"/>
+          <w:sz w:val="14"/>
+        </w:rPr>
+        <w:t xml:space="preserve">        418,239,416,241,406,244,394,238,379,244,374,250</w:t>
+      </w:r>
+    </w:p>
+    <w:p>
+      <w:pPr>
+        <w:spacing w:line="240" w:lineRule="auto" w:after="0"/>
+        <w:shd w:val="clear" w:color="auto" w:fill="F2F2F2"/>
+      </w:pPr>
+      <w:r>
+        <w:rPr>
+          <w:rFonts w:ascii="Courier New" w:hAnsi="Courier New"/>
+          <w:sz w:val="14"/>
+        </w:rPr>
+        <w:t xml:space="preserve">    " nohref title="Нарынская область"&gt;</w:t>
+      </w:r>
+    </w:p>
+    <w:p>
+      <w:pPr>
+        <w:spacing w:line="240" w:lineRule="auto" w:after="0"/>
+        <w:shd w:val="clear" w:color="auto" w:fill="F2F2F2"/>
+      </w:pPr>
+      <w:r>
+        <w:rPr>
+          <w:rFonts w:ascii="Courier New" w:hAnsi="Courier New"/>
+          <w:sz w:val="14"/>
+        </w:rPr>
         <w:t xml:space="preserve">                &lt;area shape="poly" coords="</w:t>
       </w:r>
     </w:p>
@@ -7942,7 +8020,7 @@
           <w:rFonts w:ascii="Courier New" w:hAnsi="Courier New"/>
           <w:sz w:val="14"/>
         </w:rPr>
-        <w:t xml:space="preserve">        558,143,561,146,568,149,569,151,571,153,577,152,579,148,587,149,586,156,587,158,587,159,589,169,</w:t>
+        <w:t xml:space="preserve">        106,245,111,248,116,245,118,247,121,248,123,250,125,250,132,258,136,257,137,253,140,252,144,251,</w:t>
       </w:r>
     </w:p>
     <w:p>
@@ -7955,7 +8033,7 @@
           <w:rFonts w:ascii="Courier New" w:hAnsi="Courier New"/>
           <w:sz w:val="14"/>
         </w:rPr>
-        <w:t xml:space="preserve">        594,172,594,175,598,176,599,178,597,186,595,188,593,191,595,192,605,188,614,191,620,192,622,194,</w:t>
+        <w:t xml:space="preserve">        147,250,151,251,151,253,156,260,157,267,155,273,156,279,156,277,160,274,162,274,170,283,176,280,</w:t>
       </w:r>
     </w:p>
     <w:p>
@@ -7968,7 +8046,7 @@
           <w:rFonts w:ascii="Courier New" w:hAnsi="Courier New"/>
           <w:sz w:val="14"/>
         </w:rPr>
-        <w:t xml:space="preserve">        625,194,627,193,633,195,640,200,639,206,635,210,630,210,629,214,629,219,634,219,641,215,647,218,</w:t>
+        <w:t xml:space="preserve">        180,282,184,286,189,281,191,282,192,281,194,281,197,283,197,290,199,289,201,284,203,283,206,286,</w:t>
       </w:r>
     </w:p>
     <w:p>
@@ -7981,7 +8059,7 @@
           <w:rFonts w:ascii="Courier New" w:hAnsi="Courier New"/>
           <w:sz w:val="14"/>
         </w:rPr>
-        <w:t xml:space="preserve">        648,220,648,223,644,233,649,238,656,238,662,236,687,237,698,232,699,235,697,245,691,244,690,246,</w:t>
+        <w:t xml:space="preserve">        207,290,209,288,210,285,209,281,211,279,210,276,210,271,214,267,218,269,222,269,224,264,226,263,</w:t>
       </w:r>
     </w:p>
     <w:p>
@@ -7994,7 +8072,7 @@
           <w:rFonts w:ascii="Courier New" w:hAnsi="Courier New"/>
           <w:sz w:val="14"/>
         </w:rPr>
-        <w:t xml:space="preserve">        695,253,705,260,701,271,699,273,711,270,717,265,724,267,729,277,742,280,744,281,749,281,750,282,</w:t>
+        <w:t xml:space="preserve">        229,256,228,253,228,251,226,248,228,247,232,242,234,242,235,244,234,246,234,250,232,253,232,254,</w:t>
       </w:r>
     </w:p>
     <w:p>
@@ -8007,7 +8085,7 @@
           <w:rFonts w:ascii="Courier New" w:hAnsi="Courier New"/>
           <w:sz w:val="14"/>
         </w:rPr>
-        <w:t xml:space="preserve">        762,277,763,268,764,265,763,262,765,260,771,258,779,259,780,258,783,259,784,256,789,256,795,253,</w:t>
+        <w:t xml:space="preserve">        233,255,232,254,234,252,240,254,240,257,243,260,243,263,247,262,248,264,248,266,251,270,246,280,</w:t>
       </w:r>
     </w:p>
     <w:p>
@@ -8020,7 +8098,7 @@
           <w:rFonts w:ascii="Courier New" w:hAnsi="Courier New"/>
           <w:sz w:val="14"/>
         </w:rPr>
-        <w:t xml:space="preserve">        799,249,800,249,801,250,803,249,805,250,806,247,809,245,808,244,811,241,819,240,822,236,824,236,</w:t>
+        <w:t xml:space="preserve">        247,281,248,284,252,286,253,284,257,285,258,286,262,288,265,285,270,284,272,285,269,288,273,291,</w:t>
       </w:r>
     </w:p>
     <w:p>
@@ -8033,7 +8111,7 @@
           <w:rFonts w:ascii="Courier New" w:hAnsi="Courier New"/>
           <w:sz w:val="14"/>
         </w:rPr>
-        <w:t xml:space="preserve">        826,234,828,231,834,229,836,229,837,227,843,225,845,222,852,222,861,213,864,214,868,209,873,208,</w:t>
+        <w:t xml:space="preserve">        274,297,274,300,272,301,272,302,278,300,285,295,289,299,291,298,294,299,298,304,298,305,302,306,</w:t>
       </w:r>
     </w:p>
     <w:p>
@@ -8046,7 +8124,7 @@
           <w:rFonts w:ascii="Courier New" w:hAnsi="Courier New"/>
           <w:sz w:val="14"/>
         </w:rPr>
-        <w:t xml:space="preserve">        876,210,881,209,885,207,887,203,896,202,898,203,900,201,902,196,904,194,904,191,907,188,921,186,</w:t>
+        <w:t xml:space="preserve">        306,313,306,316,315,318,325,318,334,324,340,319,346,318,348,320,349,319,351,321,354,321,355,315,</w:t>
       </w:r>
     </w:p>
     <w:p>
@@ -8059,7 +8137,7 @@
           <w:rFonts w:ascii="Courier New" w:hAnsi="Courier New"/>
           <w:sz w:val="14"/>
         </w:rPr>
-        <w:t xml:space="preserve">        929,188,933,188,935,186,929,180,927,174,930,173,931,169,926,162,928,161,924,158,923,156,918,155,</w:t>
+        <w:t xml:space="preserve">        362,307,366,305,370,308,373,300,375,298,377,300,379,298,382,297,390,287,392,287,393,288,396,295,</w:t>
       </w:r>
     </w:p>
     <w:p>
@@ -8072,7 +8150,7 @@
           <w:rFonts w:ascii="Courier New" w:hAnsi="Courier New"/>
           <w:sz w:val="14"/>
         </w:rPr>
-        <w:t xml:space="preserve">        917,152,915,151,914,146,897,144,896,142,890,141,887,143,876,143,875,139,870,136,869,134,863,127,</w:t>
+        <w:t xml:space="preserve">        393,297,390,295,386,299,385,303,387,307,395,312,395,305,397,301,404,292,409,291,406,285,392,269,</w:t>
       </w:r>
     </w:p>
     <w:p>
@@ -8085,7 +8163,7 @@
           <w:rFonts w:ascii="Courier New" w:hAnsi="Courier New"/>
           <w:sz w:val="14"/>
         </w:rPr>
-        <w:t xml:space="preserve">        861,127,859,125,856,124,851,120,848,112,848,109,850,105,840,108,838,110,836,108,829,108,825,106,</w:t>
+        <w:t xml:space="preserve">        391,269,387,270,380,267,379,266,379,257,371,252,370,250,373,248,378,242,394,236,399,238,407,242,</w:t>
       </w:r>
     </w:p>
     <w:p>
@@ -8098,7 +8176,7 @@
           <w:rFonts w:ascii="Courier New" w:hAnsi="Courier New"/>
           <w:sz w:val="14"/>
         </w:rPr>
-        <w:t xml:space="preserve">        819,104,817,105,816,104,812,104,811,103,810,104,807,104,803,99,800,100,793,94,788,97,783,96,</w:t>
+        <w:t xml:space="preserve">        414,240,416,239,411,224,408,224,407,223,401,223,388,215,388,211,389,209,390,208,396,209,403,200,</w:t>
       </w:r>
     </w:p>
     <w:p>
@@ -8111,7 +8189,7 @@
           <w:rFonts w:ascii="Courier New" w:hAnsi="Courier New"/>
           <w:sz w:val="14"/>
         </w:rPr>
-        <w:t xml:space="preserve">        781,99,772,97,770,98,768,96,766,99,762,98,760,100,756,100,753,98,749,100,747,98,747,97,</w:t>
+        <w:t xml:space="preserve">        402,194,400,193,394,193,389,195,386,193,383,194,380,192,367,190,366,188,365,183,363,182,349,179,</w:t>
       </w:r>
     </w:p>
     <w:p>
@@ -8124,7 +8202,7 @@
           <w:rFonts w:ascii="Courier New" w:hAnsi="Courier New"/>
           <w:sz w:val="14"/>
         </w:rPr>
-        <w:t xml:space="preserve">        745,98,741,96,737,96,734,93,733,94,727,94,725,93,717,93,715,90,711,92,708,90,704,91,</w:t>
+        <w:t xml:space="preserve">        348,180,344,181,342,179,339,180,337,179,334,182,331,183,331,185,329,187,322,187,312,179,304,178,</w:t>
       </w:r>
     </w:p>
     <w:p>
@@ -8137,7 +8215,7 @@
           <w:rFonts w:ascii="Courier New" w:hAnsi="Courier New"/>
           <w:sz w:val="14"/>
         </w:rPr>
-        <w:t xml:space="preserve">        698,94,695,93,694,93,688,93,688,97,681,104,677,105,664,105,655,107,653,109,636,108,634,109,</w:t>
+        <w:t xml:space="preserve">        302,177,294,175,288,175,288,172,283,170,280,171,278,169,276,170,276,172,273,176,273,181,272,184,</w:t>
       </w:r>
     </w:p>
     <w:p>
@@ -8150,7 +8228,7 @@
           <w:rFonts w:ascii="Courier New" w:hAnsi="Courier New"/>
           <w:sz w:val="14"/>
         </w:rPr>
-        <w:t xml:space="preserve">        626,107,625,110,618,111,611,116,604,122,602,126,596,125,584,129,577,130,571,128,571,135,563,136,</w:t>
+        <w:t xml:space="preserve">        267,187,243,177,233,175,229,171,224,169,222,171,215,171,214,173,211,173,205,171,198,170,196,172,</w:t>
       </w:r>
     </w:p>
     <w:p>
@@ -8163,7 +8241,7 @@
           <w:rFonts w:ascii="Courier New" w:hAnsi="Courier New"/>
           <w:sz w:val="14"/>
         </w:rPr>
-        <w:t xml:space="preserve">        563,138</w:t>
+        <w:t xml:space="preserve">        196,174,192,178,188,178,186,179,183,181,182,183,175,187,173,190,169,190,163,188,161,192,162,194,</w:t>
       </w:r>
     </w:p>
     <w:p>
@@ -8176,7 +8254,7 @@
           <w:rFonts w:ascii="Courier New" w:hAnsi="Courier New"/>
           <w:sz w:val="14"/>
         </w:rPr>
-        <w:t xml:space="preserve">    " nohref title="Иссык-Кульская область" alt="Иссык-Кульская область"&gt;</w:t>
+        <w:t xml:space="preserve">        162,199,160,202,158,202,154,201,153,203,150,202,146,203,144,209,141,210,141,213,135,216,132,224,</w:t>
       </w:r>
     </w:p>
     <w:p>
@@ -8189,6 +8267,32 @@
           <w:rFonts w:ascii="Courier New" w:hAnsi="Courier New"/>
           <w:sz w:val="14"/>
         </w:rPr>
+        <w:t xml:space="preserve">        130,224,129,226,124,228,122,232,116,234,113,236,111,236,109,236,109,240,107,241</w:t>
+      </w:r>
+    </w:p>
+    <w:p>
+      <w:pPr>
+        <w:spacing w:line="240" w:lineRule="auto" w:after="0"/>
+        <w:shd w:val="clear" w:color="auto" w:fill="F2F2F2"/>
+      </w:pPr>
+      <w:r>
+        <w:rPr>
+          <w:rFonts w:ascii="Courier New" w:hAnsi="Courier New"/>
+          <w:sz w:val="14"/>
+        </w:rPr>
+        <w:t xml:space="preserve">    " nohref title="Джалал-Абадская область"&gt;</w:t>
+      </w:r>
+    </w:p>
+    <w:p>
+      <w:pPr>
+        <w:spacing w:line="240" w:lineRule="auto" w:after="0"/>
+        <w:shd w:val="clear" w:color="auto" w:fill="F2F2F2"/>
+      </w:pPr>
+      <w:r>
+        <w:rPr>
+          <w:rFonts w:ascii="Courier New" w:hAnsi="Courier New"/>
+          <w:sz w:val="14"/>
+        </w:rPr>
         <w:t xml:space="preserve">                &lt;area shape="poly" coords="</w:t>
       </w:r>
     </w:p>
@@ -8202,7 +8306,7 @@
           <w:rFonts w:ascii="Courier New" w:hAnsi="Courier New"/>
           <w:sz w:val="14"/>
         </w:rPr>
-        <w:t xml:space="preserve">        372,250,381,256,381,266,387,269,392,267,399,273,408,284,414,298,439,317,440,320,452,335,456,338,</w:t>
+        <w:t xml:space="preserve">        216,455,221,459,219,466,221,472,226,473,232,472,236,472,239,473,241,478,240,481,237,484,237,487,</w:t>
       </w:r>
     </w:p>
     <w:p>
@@ -8215,7 +8319,7 @@
           <w:rFonts w:ascii="Courier New" w:hAnsi="Courier New"/>
           <w:sz w:val="14"/>
         </w:rPr>
-        <w:t xml:space="preserve">        470,344,471,347,470,352,480,355,489,356,491,354,497,357,502,362,506,360,512,364,516,361,523,363,</w:t>
+        <w:t xml:space="preserve">        239,491,243,491,249,491,252,485,259,481,262,483,265,492,271,492,272,496,275,498,275,502,276,503,</w:t>
       </w:r>
     </w:p>
     <w:p>
@@ -8228,7 +8332,7 @@
           <w:rFonts w:ascii="Courier New" w:hAnsi="Courier New"/>
           <w:sz w:val="14"/>
         </w:rPr>
-        <w:t xml:space="preserve">        525,359,528,358,531,353,538,351,542,346,548,341,554,339,554,341,557,344,556,352,558,356,561,357,</w:t>
+        <w:t xml:space="preserve">        282,488,284,485,287,485,294,483,297,480,301,480,303,483,305,482,308,478,312,479,314,478,322,483,</w:t>
       </w:r>
     </w:p>
     <w:p>
@@ -8241,7 +8345,7 @@
           <w:rFonts w:ascii="Courier New" w:hAnsi="Courier New"/>
           <w:sz w:val="14"/>
         </w:rPr>
-        <w:t xml:space="preserve">        565,360,564,364,561,367,560,373,563,379,562,381,564,378,568,379,572,376,574,377,577,377,580,379,</w:t>
+        <w:t xml:space="preserve">        324,482,328,484,333,481,335,483,339,482,342,483,348,480,352,483,355,483,358,482,360,480,367,479,</w:t>
       </w:r>
     </w:p>
     <w:p>
@@ -8254,7 +8358,7 @@
           <w:rFonts w:ascii="Courier New" w:hAnsi="Courier New"/>
           <w:sz w:val="14"/>
         </w:rPr>
-        <w:t xml:space="preserve">        580,376,583,372,583,371,586,370,589,373,592,370,600,371,609,363,611,365,611,367,613,367,615,370,</w:t>
+        <w:t xml:space="preserve">        368,474,369,474,371,472,374,472,378,470,381,470,385,472,392,470,399,471,407,470,410,469,410,466,</w:t>
       </w:r>
     </w:p>
     <w:p>
@@ -8267,7 +8371,7 @@
           <w:rFonts w:ascii="Courier New" w:hAnsi="Courier New"/>
           <w:sz w:val="14"/>
         </w:rPr>
-        <w:t xml:space="preserve">        614,373,617,369,618,369,619,370,623,369,624,367,628,365,630,361,630,356,632,351,635,348,637,345,</w:t>
+        <w:t xml:space="preserve">        412,464,411,462,414,460,414,457,416,456,413,442,413,441,408,440,407,437,408,430,413,426,414,423,</w:t>
       </w:r>
     </w:p>
     <w:p>
@@ -8280,7 +8384,7 @@
           <w:rFonts w:ascii="Courier New" w:hAnsi="Courier New"/>
           <w:sz w:val="14"/>
         </w:rPr>
-        <w:t xml:space="preserve">        640,344,640,338,641,336,639,333,639,329,642,326,644,326,646,322,645,320,647,316,646,313,648,307,</w:t>
+        <w:t xml:space="preserve">        413,421,418,412,415,410,416,408,421,407,422,403,425,401,428,403,430,402,431,400,433,400,443,397,</w:t>
       </w:r>
     </w:p>
     <w:p>
@@ -8293,7 +8397,7 @@
           <w:rFonts w:ascii="Courier New" w:hAnsi="Courier New"/>
           <w:sz w:val="14"/>
         </w:rPr>
-        <w:t xml:space="preserve">        654,304,656,304,656,302,658,299,663,299,666,295,669,294,671,295,677,295,679,297,679,298,684,300,</w:t>
+        <w:t xml:space="preserve">        445,400,447,399,450,401,458,395,462,389,465,388,470,381,476,381,479,377,478,373,487,373,492,376,</w:t>
       </w:r>
     </w:p>
     <w:p>
@@ -8306,7 +8410,7 @@
           <w:rFonts w:ascii="Courier New" w:hAnsi="Courier New"/>
           <w:sz w:val="14"/>
         </w:rPr>
-        <w:t xml:space="preserve">        684,299,688,298,693,301,699,297,701,298,703,297,705,299,709,299,709,302,715,301,717,302,723,300,</w:t>
+        <w:t xml:space="preserve">        495,374,487,365,486,363,488,362,488,358,480,357,469,353,470,347,469,345,455,340,452,337,439,321,</w:t>
       </w:r>
     </w:p>
     <w:p>
@@ -8319,7 +8423,7 @@
           <w:rFonts w:ascii="Courier New" w:hAnsi="Courier New"/>
           <w:sz w:val="14"/>
         </w:rPr>
-        <w:t xml:space="preserve">        724,301,726,301,730,298,732,300,735,297,736,297,735,293,735,288,738,285,743,282,728,278,723,269,</w:t>
+        <w:t xml:space="preserve">        438,318,413,299,410,292,405,293,398,302,397,305,397,313,393,312,386,308,384,305,383,301,389,294,</w:t>
       </w:r>
     </w:p>
     <w:p>
@@ -8332,7 +8436,7 @@
           <w:rFonts w:ascii="Courier New" w:hAnsi="Courier New"/>
           <w:sz w:val="14"/>
         </w:rPr>
-        <w:t xml:space="preserve">        717,267,712,271,697,274,703,261,694,254,688,246,689,244,690,243,696,244,698,234,688,239,662,237,</w:t>
+        <w:t xml:space="preserve">        391,294,393,296,394,294,392,289,390,288,383,299,380,299,377,301,375,300,374,301,371,309,369,309,</w:t>
       </w:r>
     </w:p>
     <w:p>
@@ -8345,7 +8449,7 @@
           <w:rFonts w:ascii="Courier New" w:hAnsi="Courier New"/>
           <w:sz w:val="14"/>
         </w:rPr>
-        <w:t xml:space="preserve">        655,240,648,239,642,233,646,222,646,219,641,216,634,221,629,221,628,219,627,213,629,209,630,208,</w:t>
+        <w:t xml:space="preserve">        366,307,363,308,357,316,356,320,355,322,351,322,351,327,343,329,338,329,335,333,328,335,327,339,</w:t>
       </w:r>
     </w:p>
     <w:p>
@@ -8358,7 +8462,7 @@
           <w:rFonts w:ascii="Courier New" w:hAnsi="Courier New"/>
           <w:sz w:val="14"/>
         </w:rPr>
-        <w:t xml:space="preserve">        634,208,638,204,638,201,632,197,627,195,625,196,622,195,620,193,613,193,605,190,596,193,591,192,</w:t>
+        <w:t xml:space="preserve">        323,339,319,346,320,350,318,350,313,348,312,348,312,355,311,357,307,357,298,352,295,353,289,345,</w:t>
       </w:r>
     </w:p>
     <w:p>
@@ -8371,7 +8475,7 @@
           <w:rFonts w:ascii="Courier New" w:hAnsi="Courier New"/>
           <w:sz w:val="14"/>
         </w:rPr>
-        <w:t xml:space="preserve">        591,190,593,186,595,185,598,179,593,176,592,173,588,170,585,157,586,150,580,149,578,153,571,154,</w:t>
+        <w:t xml:space="preserve">        288,347,287,347,292,351,292,354,289,356,291,356,293,360,291,365,292,369,287,368,282,364,281,365,</w:t>
       </w:r>
     </w:p>
     <w:p>
@@ -8384,7 +8488,7 @@
           <w:rFonts w:ascii="Courier New" w:hAnsi="Courier New"/>
           <w:sz w:val="14"/>
         </w:rPr>
-        <w:t xml:space="preserve">        568,152,567,150,560,147,557,144,551,147,548,147,546,144,545,146,540,145,538,147,535,144,533,146,</w:t>
+        <w:t xml:space="preserve">        276,363,276,360,271,360,267,363,264,363,264,368,254,377,261,380,261,382,259,384,261,383,266,379,</w:t>
       </w:r>
     </w:p>
     <w:p>
@@ -8397,7 +8501,7 @@
           <w:rFonts w:ascii="Courier New" w:hAnsi="Courier New"/>
           <w:sz w:val="14"/>
         </w:rPr>
-        <w:t xml:space="preserve">        527,147,520,145,517,146,514,145,511,147,508,147,505,144,502,147,497,146,495,147,494,146,488,147,</w:t>
+        <w:t xml:space="preserve">        272,378,274,380,274,385,270,388,272,393,275,394,279,399,280,403,280,413,279,419,283,421,287,425,</w:t>
       </w:r>
     </w:p>
     <w:p>
@@ -8410,7 +8514,7 @@
           <w:rFonts w:ascii="Courier New" w:hAnsi="Courier New"/>
           <w:sz w:val="14"/>
         </w:rPr>
-        <w:t xml:space="preserve">        494,158,493,160,485,161,479,168,475,167,463,170,460,169,454,171,451,170,449,180,453,182,454,184,</w:t>
+        <w:t xml:space="preserve">        290,431,292,431,295,428,298,430,303,440,301,444,293,450,288,452,280,454,278,456,275,456,271,454,</w:t>
       </w:r>
     </w:p>
     <w:p>
@@ -8423,7 +8527,7 @@
           <w:rFonts w:ascii="Courier New" w:hAnsi="Courier New"/>
           <w:sz w:val="14"/>
         </w:rPr>
-        <w:t xml:space="preserve">        449,188,449,194,445,198,444,203,442,204,437,203,433,212,430,211,431,203,426,204,420,197,418,199,</w:t>
+        <w:t xml:space="preserve">        269,456,265,456,257,456,249,451,237,450,233,444,229,443,225,448,218,451</w:t>
       </w:r>
     </w:p>
     <w:p>
@@ -8436,7 +8540,7 @@
           <w:rFonts w:ascii="Courier New" w:hAnsi="Courier New"/>
           <w:sz w:val="14"/>
         </w:rPr>
-        <w:t xml:space="preserve">        414,200,407,199,405,200,397,210,390,210,390,214,398,220,402,221,408,221,409,223,412,223,417,236,</w:t>
+        <w:t xml:space="preserve">    " nohref title="Ошская область"&gt;</w:t>
       </w:r>
     </w:p>
     <w:p>
@@ -8449,7 +8553,7 @@
           <w:rFonts w:ascii="Courier New" w:hAnsi="Courier New"/>
           <w:sz w:val="14"/>
         </w:rPr>
-        <w:t xml:space="preserve">        418,239,416,241,406,244,394,238,379,244,374,250</w:t>
+        <w:t xml:space="preserve">                &lt;area shape="poly" coords="</w:t>
       </w:r>
     </w:p>
     <w:p>
@@ -8462,7 +8566,7 @@
           <w:rFonts w:ascii="Courier New" w:hAnsi="Courier New"/>
           <w:sz w:val="14"/>
         </w:rPr>
-        <w:t xml:space="preserve">    " nohref title="Нарынская область" alt="Нарынская область"&gt;</w:t>
+        <w:t xml:space="preserve">        31,433,33,436,33,439,37,445,35,449,38,454,37,456,39,457,37,462,39,464,41,460,45,463,</w:t>
       </w:r>
     </w:p>
     <w:p>
@@ -8475,7 +8579,7 @@
           <w:rFonts w:ascii="Courier New" w:hAnsi="Courier New"/>
           <w:sz w:val="14"/>
         </w:rPr>
-        <w:t xml:space="preserve">                &lt;area shape="poly" coords="</w:t>
+        <w:t xml:space="preserve">        47,462,48,463,53,462,54,460,55,461,58,457,60,457,63,458,66,456,73,458,80,463,83,458,</w:t>
       </w:r>
     </w:p>
     <w:p>
@@ -8488,7 +8592,7 @@
           <w:rFonts w:ascii="Courier New" w:hAnsi="Courier New"/>
           <w:sz w:val="14"/>
         </w:rPr>
-        <w:t xml:space="preserve">        106,245,111,248,116,245,118,247,121,248,123,250,125,250,132,258,136,257,137,253,140,252,144,251,</w:t>
+        <w:t xml:space="preserve">        85,458,86,460,89,459,91,462,93,461,94,459,96,459,101,457,105,461,108,458,109,458,112,460,</w:t>
       </w:r>
     </w:p>
     <w:p>
@@ -8501,7 +8605,7 @@
           <w:rFonts w:ascii="Courier New" w:hAnsi="Courier New"/>
           <w:sz w:val="14"/>
         </w:rPr>
-        <w:t xml:space="preserve">        147,250,151,251,151,253,156,260,157,267,155,273,156,279,156,277,160,274,162,274,170,283,176,280,</w:t>
+        <w:t xml:space="preserve">        112,463,115,464,122,456,126,458,127,456,129,457,135,453,138,456,145,458,149,465,154,470,155,478,</w:t>
       </w:r>
     </w:p>
     <w:p>
@@ -8514,7 +8618,7 @@
           <w:rFonts w:ascii="Courier New" w:hAnsi="Courier New"/>
           <w:sz w:val="14"/>
         </w:rPr>
-        <w:t xml:space="preserve">        180,282,184,286,189,281,191,282,192,281,194,281,197,283,197,290,199,289,201,284,203,283,206,286,</w:t>
+        <w:t xml:space="preserve">        163,478,165,480,166,479,168,474,171,475,173,477,179,476,179,469,181,466,189,466,194,461,198,465,</w:t>
       </w:r>
     </w:p>
     <w:p>
@@ -8527,7 +8631,7 @@
           <w:rFonts w:ascii="Courier New" w:hAnsi="Courier New"/>
           <w:sz w:val="14"/>
         </w:rPr>
-        <w:t xml:space="preserve">        207,290,209,288,210,285,209,281,211,279,210,276,210,271,214,267,218,269,222,269,224,264,226,263,</w:t>
+        <w:t xml:space="preserve">        200,462,201,459,209,458,213,454,215,454,217,450,224,447,229,441,232,442,238,448,250,449,258,454,</w:t>
       </w:r>
     </w:p>
     <w:p>
@@ -8540,7 +8644,7 @@
           <w:rFonts w:ascii="Courier New" w:hAnsi="Courier New"/>
           <w:sz w:val="14"/>
         </w:rPr>
-        <w:t xml:space="preserve">        229,256,228,253,228,251,226,248,228,247,232,242,234,242,235,244,234,246,234,250,232,253,232,254,</w:t>
+        <w:t xml:space="preserve">        268,454,270,452,278,454,280,453,287,451,300,443,301,440,296,430,292,433,289,432,286,426,282,422,</w:t>
       </w:r>
     </w:p>
     <w:p>
@@ -8553,7 +8657,7 @@
           <w:rFonts w:ascii="Courier New" w:hAnsi="Courier New"/>
           <w:sz w:val="14"/>
         </w:rPr>
-        <w:t xml:space="preserve">        233,255,232,254,234,252,240,254,240,257,243,260,243,263,247,262,248,264,248,266,251,270,246,280,</w:t>
+        <w:t xml:space="preserve">        278,420,278,404,277,400,274,396,271,394,268,388,273,384,273,381,271,380,266,380,263,383,262,385,</w:t>
       </w:r>
     </w:p>
     <w:p>
@@ -8566,7 +8670,7 @@
           <w:rFonts w:ascii="Courier New" w:hAnsi="Courier New"/>
           <w:sz w:val="14"/>
         </w:rPr>
-        <w:t xml:space="preserve">        247,281,248,284,252,286,253,284,257,285,258,286,262,288,265,285,270,284,272,285,269,288,273,291,</w:t>
+        <w:t xml:space="preserve">        258,386,251,387,249,385,246,385,244,385,243,389,239,391,234,397,232,394,229,391,231,389,231,387,</w:t>
       </w:r>
     </w:p>
     <w:p>
@@ -8579,7 +8683,7 @@
           <w:rFonts w:ascii="Courier New" w:hAnsi="Courier New"/>
           <w:sz w:val="14"/>
         </w:rPr>
-        <w:t xml:space="preserve">        274,297,274,300,272,301,272,302,278,300,285,295,289,299,291,298,294,299,298,304,298,305,302,306,</w:t>
+        <w:t xml:space="preserve">        229,384,226,384,226,389,224,391,216,388,215,383,209,382,203,378,199,379,197,376,193,378,193,377,</w:t>
       </w:r>
     </w:p>
     <w:p>
@@ -8592,7 +8696,7 @@
           <w:rFonts w:ascii="Courier New" w:hAnsi="Courier New"/>
           <w:sz w:val="14"/>
         </w:rPr>
-        <w:t xml:space="preserve">        306,313,306,316,315,318,325,318,334,324,340,319,346,318,348,320,349,319,351,321,354,321,355,315,</w:t>
+        <w:t xml:space="preserve">        193,376,190,375,184,376,180,381,177,383,175,381,171,382,172,384,173,389,164,393,162,395,159,396,</w:t>
       </w:r>
     </w:p>
     <w:p>
@@ -8605,7 +8709,7 @@
           <w:rFonts w:ascii="Courier New" w:hAnsi="Courier New"/>
           <w:sz w:val="14"/>
         </w:rPr>
-        <w:t xml:space="preserve">        362,307,366,305,370,308,373,300,375,298,377,300,379,298,382,297,390,287,392,287,393,288,396,295,</w:t>
+        <w:t xml:space="preserve">        158,393,157,399,154,401,147,402,146,414,144,415,144,417,142,418,136,417,132,421,131,418,138,412,</w:t>
       </w:r>
     </w:p>
     <w:p>
@@ -8618,7 +8722,7 @@
           <w:rFonts w:ascii="Courier New" w:hAnsi="Courier New"/>
           <w:sz w:val="14"/>
         </w:rPr>
-        <w:t xml:space="preserve">        393,297,390,295,386,299,385,303,387,307,395,312,395,305,397,301,404,292,409,291,406,285,392,269,</w:t>
+        <w:t xml:space="preserve">        136,409,135,410,134,408,126,407,123,405,120,404,119,402,115,399,108,399,106,397,105,398,93,388,</w:t>
       </w:r>
     </w:p>
     <w:p>
@@ -8631,7 +8735,7 @@
           <w:rFonts w:ascii="Courier New" w:hAnsi="Courier New"/>
           <w:sz w:val="14"/>
         </w:rPr>
-        <w:t xml:space="preserve">        391,269,387,270,380,267,379,266,379,257,371,252,370,250,373,248,378,242,394,236,399,238,407,242,</w:t>
+        <w:t xml:space="preserve">        90,388,74,394,67,398,64,401,62,400,56,402,53,400,54,403,52,404,51,409,53,413,53,420,</w:t>
       </w:r>
     </w:p>
     <w:p>
@@ -8644,7 +8748,7 @@
           <w:rFonts w:ascii="Courier New" w:hAnsi="Courier New"/>
           <w:sz w:val="14"/>
         </w:rPr>
-        <w:t xml:space="preserve">        414,240,416,239,411,224,408,224,407,223,401,223,388,215,388,211,389,209,390,208,396,209,403,200,</w:t>
+        <w:t xml:space="preserve">        52,421,50,419,50,421,47,423,45,421,44,422,43,414,41,413,39,414,38,416,34,421,36,426,</w:t>
       </w:r>
     </w:p>
     <w:p>
@@ -8657,7 +8761,7 @@
           <w:rFonts w:ascii="Courier New" w:hAnsi="Courier New"/>
           <w:sz w:val="14"/>
         </w:rPr>
-        <w:t xml:space="preserve">        402,194,400,193,394,193,389,195,386,193,383,194,380,192,367,190,366,188,365,183,363,182,349,179,</w:t>
+        <w:t xml:space="preserve">        34,427,34,430</w:t>
       </w:r>
     </w:p>
     <w:p>
@@ -8670,7 +8774,7 @@
           <w:rFonts w:ascii="Courier New" w:hAnsi="Courier New"/>
           <w:sz w:val="14"/>
         </w:rPr>
-        <w:t xml:space="preserve">        348,180,344,181,342,179,339,180,337,179,334,182,331,183,331,185,329,187,322,187,312,179,304,178,</w:t>
+        <w:t xml:space="preserve">    " nohref title="Баткенская область"&gt;</w:t>
       </w:r>
     </w:p>
     <w:p>
@@ -8683,7 +8787,7 @@
           <w:rFonts w:ascii="Courier New" w:hAnsi="Courier New"/>
           <w:sz w:val="14"/>
         </w:rPr>
-        <w:t xml:space="preserve">        302,177,294,175,288,175,288,172,283,170,280,171,278,169,276,170,276,172,273,176,273,181,272,184,</w:t>
+        <w:t xml:space="preserve">            &lt;/map&gt;</w:t>
       </w:r>
     </w:p>
     <w:p>
@@ -8696,7 +8800,7 @@
           <w:rFonts w:ascii="Courier New" w:hAnsi="Courier New"/>
           <w:sz w:val="14"/>
         </w:rPr>
-        <w:t xml:space="preserve">        267,187,243,177,233,175,229,171,224,169,222,171,215,171,214,173,211,173,205,171,198,170,196,172,</w:t>
+        <w:t xml:space="preserve">        &lt;/p&gt;</w:t>
       </w:r>
     </w:p>
     <w:p>
@@ -8709,7 +8813,7 @@
           <w:rFonts w:ascii="Courier New" w:hAnsi="Courier New"/>
           <w:sz w:val="14"/>
         </w:rPr>
-        <w:t xml:space="preserve">        196,174,192,178,188,178,186,179,183,181,182,183,175,187,173,190,169,190,163,188,161,192,162,194,</w:t>
+        <w:t xml:space="preserve"> </w:t>
       </w:r>
     </w:p>
     <w:p>
@@ -8722,7 +8826,7 @@
           <w:rFonts w:ascii="Courier New" w:hAnsi="Courier New"/>
           <w:sz w:val="14"/>
         </w:rPr>
-        <w:t xml:space="preserve">        162,199,160,202,158,202,154,201,153,203,150,202,146,203,144,209,141,210,141,213,135,216,132,224,</w:t>
+        <w:t xml:space="preserve">        &lt;h3&gt;Области на карте&lt;/h3&gt;</w:t>
       </w:r>
     </w:p>
     <w:p>
@@ -8735,7 +8839,7 @@
           <w:rFonts w:ascii="Courier New" w:hAnsi="Courier New"/>
           <w:sz w:val="14"/>
         </w:rPr>
-        <w:t xml:space="preserve">        130,224,129,226,124,228,122,232,116,234,113,236,111,236,109,236,109,240,107,241</w:t>
+        <w:t xml:space="preserve">        &lt;ol&gt;</w:t>
       </w:r>
     </w:p>
     <w:p>
@@ -8748,7 +8852,7 @@
           <w:rFonts w:ascii="Courier New" w:hAnsi="Courier New"/>
           <w:sz w:val="14"/>
         </w:rPr>
-        <w:t xml:space="preserve">    " nohref title="Джалал-Абадская область" alt="Джалал-Абадская область"&gt;</w:t>
+        <w:t xml:space="preserve">            &lt;li&gt;Чуйская область &amp;mdash; центр г. Бишкек&lt;/li&gt;</w:t>
       </w:r>
     </w:p>
     <w:p>
@@ -8761,7 +8865,7 @@
           <w:rFonts w:ascii="Courier New" w:hAnsi="Courier New"/>
           <w:sz w:val="14"/>
         </w:rPr>
-        <w:t xml:space="preserve">                &lt;area shape="poly" coords="</w:t>
+        <w:t xml:space="preserve">            &lt;li&gt;Таласская область &amp;mdash; центр г. Талас&lt;/li&gt;</w:t>
       </w:r>
     </w:p>
     <w:p>
@@ -8774,7 +8878,7 @@
           <w:rFonts w:ascii="Courier New" w:hAnsi="Courier New"/>
           <w:sz w:val="14"/>
         </w:rPr>
-        <w:t xml:space="preserve">        216,455,221,459,219,466,221,472,226,473,232,472,236,472,239,473,241,478,240,481,237,484,237,487,</w:t>
+        <w:t xml:space="preserve">            &lt;li&gt;Иссык-Кульская область &amp;mdash; центр г. Каракол&lt;/li&gt;</w:t>
       </w:r>
     </w:p>
     <w:p>
@@ -8787,7 +8891,7 @@
           <w:rFonts w:ascii="Courier New" w:hAnsi="Courier New"/>
           <w:sz w:val="14"/>
         </w:rPr>
-        <w:t xml:space="preserve">        239,491,243,491,249,491,252,485,259,481,262,483,265,492,271,492,272,496,275,498,275,502,276,503,</w:t>
+        <w:t xml:space="preserve">            &lt;li&gt;Нарынская область &amp;mdash; центр г. Нарын&lt;/li&gt;</w:t>
       </w:r>
     </w:p>
     <w:p>
@@ -8800,7 +8904,7 @@
           <w:rFonts w:ascii="Courier New" w:hAnsi="Courier New"/>
           <w:sz w:val="14"/>
         </w:rPr>
-        <w:t xml:space="preserve">        282,488,284,485,287,485,294,483,297,480,301,480,303,483,305,482,308,478,312,479,314,478,322,483,</w:t>
+        <w:t xml:space="preserve">            &lt;li&gt;Джалал-Абадская область &amp;mdash; центр г. Джалал-Абад&lt;/li&gt;</w:t>
       </w:r>
     </w:p>
     <w:p>
@@ -8813,7 +8917,7 @@
           <w:rFonts w:ascii="Courier New" w:hAnsi="Courier New"/>
           <w:sz w:val="14"/>
         </w:rPr>
-        <w:t xml:space="preserve">        324,482,328,484,333,481,335,483,339,482,342,483,348,480,352,483,355,483,358,482,360,480,367,479,</w:t>
+        <w:t xml:space="preserve">            &lt;li&gt;Ошская область &amp;mdash; центр г. Ош&lt;/li&gt;</w:t>
       </w:r>
     </w:p>
     <w:p>
@@ -8826,7 +8930,7 @@
           <w:rFonts w:ascii="Courier New" w:hAnsi="Courier New"/>
           <w:sz w:val="14"/>
         </w:rPr>
-        <w:t xml:space="preserve">        368,474,369,474,371,472,374,472,378,470,381,470,385,472,392,470,399,471,407,470,410,469,410,466,</w:t>
+        <w:t xml:space="preserve">            &lt;li&gt;Баткенская область &amp;mdash; центр г. Баткен&lt;/li&gt;</w:t>
       </w:r>
     </w:p>
     <w:p>
@@ -8839,7 +8943,7 @@
           <w:rFonts w:ascii="Courier New" w:hAnsi="Courier New"/>
           <w:sz w:val="14"/>
         </w:rPr>
-        <w:t xml:space="preserve">        412,464,411,462,414,460,414,457,416,456,413,442,413,441,408,440,407,437,408,430,413,426,414,423,</w:t>
+        <w:t xml:space="preserve">        &lt;/ol&gt;</w:t>
       </w:r>
     </w:p>
     <w:p>
@@ -8852,7 +8956,7 @@
           <w:rFonts w:ascii="Courier New" w:hAnsi="Courier New"/>
           <w:sz w:val="14"/>
         </w:rPr>
-        <w:t xml:space="preserve">        413,421,418,412,415,410,416,408,421,407,422,403,425,401,428,403,430,402,431,400,433,400,443,397,</w:t>
+        <w:t xml:space="preserve"> </w:t>
       </w:r>
     </w:p>
     <w:p>
@@ -8865,943 +8969,7 @@
           <w:rFonts w:ascii="Courier New" w:hAnsi="Courier New"/>
           <w:sz w:val="14"/>
         </w:rPr>
-        <w:t xml:space="preserve">        445,400,447,399,450,401,458,395,462,389,465,388,470,381,476,381,479,377,478,373,487,373,492,376,</w:t>
-      </w:r>
-    </w:p>
-    <w:p>
-      <w:pPr>
-        <w:spacing w:line="240" w:lineRule="auto" w:after="0"/>
-        <w:shd w:val="clear" w:color="auto" w:fill="F2F2F2"/>
-      </w:pPr>
-      <w:r>
-        <w:rPr>
-          <w:rFonts w:ascii="Courier New" w:hAnsi="Courier New"/>
-          <w:sz w:val="14"/>
-        </w:rPr>
-        <w:t xml:space="preserve">        495,374,487,365,486,363,488,362,488,358,480,357,469,353,470,347,469,345,455,340,452,337,439,321,</w:t>
-      </w:r>
-    </w:p>
-    <w:p>
-      <w:pPr>
-        <w:spacing w:line="240" w:lineRule="auto" w:after="0"/>
-        <w:shd w:val="clear" w:color="auto" w:fill="F2F2F2"/>
-      </w:pPr>
-      <w:r>
-        <w:rPr>
-          <w:rFonts w:ascii="Courier New" w:hAnsi="Courier New"/>
-          <w:sz w:val="14"/>
-        </w:rPr>
-        <w:t xml:space="preserve">        438,318,413,299,410,292,405,293,398,302,397,305,397,313,393,312,386,308,384,305,383,301,389,294,</w:t>
-      </w:r>
-    </w:p>
-    <w:p>
-      <w:pPr>
-        <w:spacing w:line="240" w:lineRule="auto" w:after="0"/>
-        <w:shd w:val="clear" w:color="auto" w:fill="F2F2F2"/>
-      </w:pPr>
-      <w:r>
-        <w:rPr>
-          <w:rFonts w:ascii="Courier New" w:hAnsi="Courier New"/>
-          <w:sz w:val="14"/>
-        </w:rPr>
-        <w:t xml:space="preserve">        391,294,393,296,394,294,392,289,390,288,383,299,380,299,377,301,375,300,374,301,371,309,369,309,</w:t>
-      </w:r>
-    </w:p>
-    <w:p>
-      <w:pPr>
-        <w:spacing w:line="240" w:lineRule="auto" w:after="0"/>
-        <w:shd w:val="clear" w:color="auto" w:fill="F2F2F2"/>
-      </w:pPr>
-      <w:r>
-        <w:rPr>
-          <w:rFonts w:ascii="Courier New" w:hAnsi="Courier New"/>
-          <w:sz w:val="14"/>
-        </w:rPr>
-        <w:t xml:space="preserve">        366,307,363,308,357,316,356,320,355,322,351,322,351,327,343,329,338,329,335,333,328,335,327,339,</w:t>
-      </w:r>
-    </w:p>
-    <w:p>
-      <w:pPr>
-        <w:spacing w:line="240" w:lineRule="auto" w:after="0"/>
-        <w:shd w:val="clear" w:color="auto" w:fill="F2F2F2"/>
-      </w:pPr>
-      <w:r>
-        <w:rPr>
-          <w:rFonts w:ascii="Courier New" w:hAnsi="Courier New"/>
-          <w:sz w:val="14"/>
-        </w:rPr>
-        <w:t xml:space="preserve">        323,339,319,346,320,350,318,350,313,348,312,348,312,355,311,357,307,357,298,352,295,353,289,345,</w:t>
-      </w:r>
-    </w:p>
-    <w:p>
-      <w:pPr>
-        <w:spacing w:line="240" w:lineRule="auto" w:after="0"/>
-        <w:shd w:val="clear" w:color="auto" w:fill="F2F2F2"/>
-      </w:pPr>
-      <w:r>
-        <w:rPr>
-          <w:rFonts w:ascii="Courier New" w:hAnsi="Courier New"/>
-          <w:sz w:val="14"/>
-        </w:rPr>
-        <w:t xml:space="preserve">        288,347,287,347,292,351,292,354,289,356,291,356,293,360,291,365,292,369,287,368,282,364,281,365,</w:t>
-      </w:r>
-    </w:p>
-    <w:p>
-      <w:pPr>
-        <w:spacing w:line="240" w:lineRule="auto" w:after="0"/>
-        <w:shd w:val="clear" w:color="auto" w:fill="F2F2F2"/>
-      </w:pPr>
-      <w:r>
-        <w:rPr>
-          <w:rFonts w:ascii="Courier New" w:hAnsi="Courier New"/>
-          <w:sz w:val="14"/>
-        </w:rPr>
-        <w:t xml:space="preserve">        276,363,276,360,271,360,267,363,264,363,264,368,254,377,261,380,261,382,259,384,261,383,266,379,</w:t>
-      </w:r>
-    </w:p>
-    <w:p>
-      <w:pPr>
-        <w:spacing w:line="240" w:lineRule="auto" w:after="0"/>
-        <w:shd w:val="clear" w:color="auto" w:fill="F2F2F2"/>
-      </w:pPr>
-      <w:r>
-        <w:rPr>
-          <w:rFonts w:ascii="Courier New" w:hAnsi="Courier New"/>
-          <w:sz w:val="14"/>
-        </w:rPr>
-        <w:t xml:space="preserve">        272,378,274,380,274,385,270,388,272,393,275,394,279,399,280,403,280,413,279,419,283,421,287,425,</w:t>
-      </w:r>
-    </w:p>
-    <w:p>
-      <w:pPr>
-        <w:spacing w:line="240" w:lineRule="auto" w:after="0"/>
-        <w:shd w:val="clear" w:color="auto" w:fill="F2F2F2"/>
-      </w:pPr>
-      <w:r>
-        <w:rPr>
-          <w:rFonts w:ascii="Courier New" w:hAnsi="Courier New"/>
-          <w:sz w:val="14"/>
-        </w:rPr>
-        <w:t xml:space="preserve">        290,431,292,431,295,428,298,430,303,440,301,444,293,450,288,452,280,454,278,456,275,456,271,454,</w:t>
-      </w:r>
-    </w:p>
-    <w:p>
-      <w:pPr>
-        <w:spacing w:line="240" w:lineRule="auto" w:after="0"/>
-        <w:shd w:val="clear" w:color="auto" w:fill="F2F2F2"/>
-      </w:pPr>
-      <w:r>
-        <w:rPr>
-          <w:rFonts w:ascii="Courier New" w:hAnsi="Courier New"/>
-          <w:sz w:val="14"/>
-        </w:rPr>
-        <w:t xml:space="preserve">        269,456,265,456,257,456,249,451,237,450,233,444,229,443,225,448,218,451</w:t>
-      </w:r>
-    </w:p>
-    <w:p>
-      <w:pPr>
-        <w:spacing w:line="240" w:lineRule="auto" w:after="0"/>
-        <w:shd w:val="clear" w:color="auto" w:fill="F2F2F2"/>
-      </w:pPr>
-      <w:r>
-        <w:rPr>
-          <w:rFonts w:ascii="Courier New" w:hAnsi="Courier New"/>
-          <w:sz w:val="14"/>
-        </w:rPr>
-        <w:t xml:space="preserve">    " nohref title="Ошская область" alt="Ошская область"&gt;</w:t>
-      </w:r>
-    </w:p>
-    <w:p>
-      <w:pPr>
-        <w:spacing w:line="240" w:lineRule="auto" w:after="0"/>
-        <w:shd w:val="clear" w:color="auto" w:fill="F2F2F2"/>
-      </w:pPr>
-      <w:r>
-        <w:rPr>
-          <w:rFonts w:ascii="Courier New" w:hAnsi="Courier New"/>
-          <w:sz w:val="14"/>
-        </w:rPr>
-        <w:t xml:space="preserve">                &lt;area shape="poly" coords="</w:t>
-      </w:r>
-    </w:p>
-    <w:p>
-      <w:pPr>
-        <w:spacing w:line="240" w:lineRule="auto" w:after="0"/>
-        <w:shd w:val="clear" w:color="auto" w:fill="F2F2F2"/>
-      </w:pPr>
-      <w:r>
-        <w:rPr>
-          <w:rFonts w:ascii="Courier New" w:hAnsi="Courier New"/>
-          <w:sz w:val="14"/>
-        </w:rPr>
-        <w:t xml:space="preserve">        31,433,33,436,33,439,37,445,35,449,38,454,37,456,39,457,37,462,39,464,41,460,45,463,</w:t>
-      </w:r>
-    </w:p>
-    <w:p>
-      <w:pPr>
-        <w:spacing w:line="240" w:lineRule="auto" w:after="0"/>
-        <w:shd w:val="clear" w:color="auto" w:fill="F2F2F2"/>
-      </w:pPr>
-      <w:r>
-        <w:rPr>
-          <w:rFonts w:ascii="Courier New" w:hAnsi="Courier New"/>
-          <w:sz w:val="14"/>
-        </w:rPr>
-        <w:t xml:space="preserve">        47,462,48,463,53,462,54,460,55,461,58,457,60,457,63,458,66,456,73,458,80,463,83,458,</w:t>
-      </w:r>
-    </w:p>
-    <w:p>
-      <w:pPr>
-        <w:spacing w:line="240" w:lineRule="auto" w:after="0"/>
-        <w:shd w:val="clear" w:color="auto" w:fill="F2F2F2"/>
-      </w:pPr>
-      <w:r>
-        <w:rPr>
-          <w:rFonts w:ascii="Courier New" w:hAnsi="Courier New"/>
-          <w:sz w:val="14"/>
-        </w:rPr>
-        <w:t xml:space="preserve">        85,458,86,460,89,459,91,462,93,461,94,459,96,459,101,457,105,461,108,458,109,458,112,460,</w:t>
-      </w:r>
-    </w:p>
-    <w:p>
-      <w:pPr>
-        <w:spacing w:line="240" w:lineRule="auto" w:after="0"/>
-        <w:shd w:val="clear" w:color="auto" w:fill="F2F2F2"/>
-      </w:pPr>
-      <w:r>
-        <w:rPr>
-          <w:rFonts w:ascii="Courier New" w:hAnsi="Courier New"/>
-          <w:sz w:val="14"/>
-        </w:rPr>
-        <w:t xml:space="preserve">        112,463,115,464,122,456,126,458,127,456,129,457,135,453,138,456,145,458,149,465,154,470,155,478,</w:t>
-      </w:r>
-    </w:p>
-    <w:p>
-      <w:pPr>
-        <w:spacing w:line="240" w:lineRule="auto" w:after="0"/>
-        <w:shd w:val="clear" w:color="auto" w:fill="F2F2F2"/>
-      </w:pPr>
-      <w:r>
-        <w:rPr>
-          <w:rFonts w:ascii="Courier New" w:hAnsi="Courier New"/>
-          <w:sz w:val="14"/>
-        </w:rPr>
-        <w:t xml:space="preserve">        163,478,165,480,166,479,168,474,171,475,173,477,179,476,179,469,181,466,189,466,194,461,198,465,</w:t>
-      </w:r>
-    </w:p>
-    <w:p>
-      <w:pPr>
-        <w:spacing w:line="240" w:lineRule="auto" w:after="0"/>
-        <w:shd w:val="clear" w:color="auto" w:fill="F2F2F2"/>
-      </w:pPr>
-      <w:r>
-        <w:rPr>
-          <w:rFonts w:ascii="Courier New" w:hAnsi="Courier New"/>
-          <w:sz w:val="14"/>
-        </w:rPr>
-        <w:t xml:space="preserve">        200,462,201,459,209,458,213,454,215,454,217,450,224,447,229,441,232,442,238,448,250,449,258,454,</w:t>
-      </w:r>
-    </w:p>
-    <w:p>
-      <w:pPr>
-        <w:spacing w:line="240" w:lineRule="auto" w:after="0"/>
-        <w:shd w:val="clear" w:color="auto" w:fill="F2F2F2"/>
-      </w:pPr>
-      <w:r>
-        <w:rPr>
-          <w:rFonts w:ascii="Courier New" w:hAnsi="Courier New"/>
-          <w:sz w:val="14"/>
-        </w:rPr>
-        <w:t xml:space="preserve">        268,454,270,452,278,454,280,453,287,451,300,443,301,440,296,430,292,433,289,432,286,426,282,422,</w:t>
-      </w:r>
-    </w:p>
-    <w:p>
-      <w:pPr>
-        <w:spacing w:line="240" w:lineRule="auto" w:after="0"/>
-        <w:shd w:val="clear" w:color="auto" w:fill="F2F2F2"/>
-      </w:pPr>
-      <w:r>
-        <w:rPr>
-          <w:rFonts w:ascii="Courier New" w:hAnsi="Courier New"/>
-          <w:sz w:val="14"/>
-        </w:rPr>
-        <w:t xml:space="preserve">        278,420,278,404,277,400,274,396,271,394,268,388,273,384,273,381,271,380,266,380,263,383,262,385,</w:t>
-      </w:r>
-    </w:p>
-    <w:p>
-      <w:pPr>
-        <w:spacing w:line="240" w:lineRule="auto" w:after="0"/>
-        <w:shd w:val="clear" w:color="auto" w:fill="F2F2F2"/>
-      </w:pPr>
-      <w:r>
-        <w:rPr>
-          <w:rFonts w:ascii="Courier New" w:hAnsi="Courier New"/>
-          <w:sz w:val="14"/>
-        </w:rPr>
-        <w:t xml:space="preserve">        258,386,251,387,249,385,246,385,244,385,243,389,239,391,234,397,232,394,229,391,231,389,231,387,</w:t>
-      </w:r>
-    </w:p>
-    <w:p>
-      <w:pPr>
-        <w:spacing w:line="240" w:lineRule="auto" w:after="0"/>
-        <w:shd w:val="clear" w:color="auto" w:fill="F2F2F2"/>
-      </w:pPr>
-      <w:r>
-        <w:rPr>
-          <w:rFonts w:ascii="Courier New" w:hAnsi="Courier New"/>
-          <w:sz w:val="14"/>
-        </w:rPr>
-        <w:t xml:space="preserve">        229,384,226,384,226,389,224,391,216,388,215,383,209,382,203,378,199,379,197,376,193,378,193,377,</w:t>
-      </w:r>
-    </w:p>
-    <w:p>
-      <w:pPr>
-        <w:spacing w:line="240" w:lineRule="auto" w:after="0"/>
-        <w:shd w:val="clear" w:color="auto" w:fill="F2F2F2"/>
-      </w:pPr>
-      <w:r>
-        <w:rPr>
-          <w:rFonts w:ascii="Courier New" w:hAnsi="Courier New"/>
-          <w:sz w:val="14"/>
-        </w:rPr>
-        <w:t xml:space="preserve">        193,376,190,375,184,376,180,381,177,383,175,381,171,382,172,384,173,389,164,393,162,395,159,396,</w:t>
-      </w:r>
-    </w:p>
-    <w:p>
-      <w:pPr>
-        <w:spacing w:line="240" w:lineRule="auto" w:after="0"/>
-        <w:shd w:val="clear" w:color="auto" w:fill="F2F2F2"/>
-      </w:pPr>
-      <w:r>
-        <w:rPr>
-          <w:rFonts w:ascii="Courier New" w:hAnsi="Courier New"/>
-          <w:sz w:val="14"/>
-        </w:rPr>
-        <w:t xml:space="preserve">        158,393,157,399,154,401,147,402,146,414,144,415,144,417,142,418,136,417,132,421,131,418,138,412,</w:t>
-      </w:r>
-    </w:p>
-    <w:p>
-      <w:pPr>
-        <w:spacing w:line="240" w:lineRule="auto" w:after="0"/>
-        <w:shd w:val="clear" w:color="auto" w:fill="F2F2F2"/>
-      </w:pPr>
-      <w:r>
-        <w:rPr>
-          <w:rFonts w:ascii="Courier New" w:hAnsi="Courier New"/>
-          <w:sz w:val="14"/>
-        </w:rPr>
-        <w:t xml:space="preserve">        136,409,135,410,134,408,126,407,123,405,120,404,119,402,115,399,108,399,106,397,105,398,93,388,</w:t>
-      </w:r>
-    </w:p>
-    <w:p>
-      <w:pPr>
-        <w:spacing w:line="240" w:lineRule="auto" w:after="0"/>
-        <w:shd w:val="clear" w:color="auto" w:fill="F2F2F2"/>
-      </w:pPr>
-      <w:r>
-        <w:rPr>
-          <w:rFonts w:ascii="Courier New" w:hAnsi="Courier New"/>
-          <w:sz w:val="14"/>
-        </w:rPr>
-        <w:t xml:space="preserve">        90,388,74,394,67,398,64,401,62,400,56,402,53,400,54,403,52,404,51,409,53,413,53,420,</w:t>
-      </w:r>
-    </w:p>
-    <w:p>
-      <w:pPr>
-        <w:spacing w:line="240" w:lineRule="auto" w:after="0"/>
-        <w:shd w:val="clear" w:color="auto" w:fill="F2F2F2"/>
-      </w:pPr>
-      <w:r>
-        <w:rPr>
-          <w:rFonts w:ascii="Courier New" w:hAnsi="Courier New"/>
-          <w:sz w:val="14"/>
-        </w:rPr>
-        <w:t xml:space="preserve">        52,421,50,419,50,421,47,423,45,421,44,422,43,414,41,413,39,414,38,416,34,421,36,426,</w:t>
-      </w:r>
-    </w:p>
-    <w:p>
-      <w:pPr>
-        <w:spacing w:line="240" w:lineRule="auto" w:after="0"/>
-        <w:shd w:val="clear" w:color="auto" w:fill="F2F2F2"/>
-      </w:pPr>
-      <w:r>
-        <w:rPr>
-          <w:rFonts w:ascii="Courier New" w:hAnsi="Courier New"/>
-          <w:sz w:val="14"/>
-        </w:rPr>
-        <w:t xml:space="preserve">        34,427,34,430</w:t>
-      </w:r>
-    </w:p>
-    <w:p>
-      <w:pPr>
-        <w:spacing w:line="240" w:lineRule="auto" w:after="0"/>
-        <w:shd w:val="clear" w:color="auto" w:fill="F2F2F2"/>
-      </w:pPr>
-      <w:r>
-        <w:rPr>
-          <w:rFonts w:ascii="Courier New" w:hAnsi="Courier New"/>
-          <w:sz w:val="14"/>
-        </w:rPr>
-        <w:t xml:space="preserve">    " nohref title="Баткенская область" alt="Баткенская область"&gt;</w:t>
-      </w:r>
-    </w:p>
-    <w:p>
-      <w:pPr>
-        <w:spacing w:line="240" w:lineRule="auto" w:after="0"/>
-        <w:shd w:val="clear" w:color="auto" w:fill="F2F2F2"/>
-      </w:pPr>
-      <w:r>
-        <w:rPr>
-          <w:rFonts w:ascii="Courier New" w:hAnsi="Courier New"/>
-          <w:sz w:val="14"/>
-        </w:rPr>
-        <w:t xml:space="preserve">            &lt;/map&gt;</w:t>
-      </w:r>
-    </w:p>
-    <w:p>
-      <w:pPr>
-        <w:spacing w:line="240" w:lineRule="auto" w:after="0"/>
-        <w:shd w:val="clear" w:color="auto" w:fill="F2F2F2"/>
-      </w:pPr>
-      <w:r>
-        <w:rPr>
-          <w:rFonts w:ascii="Courier New" w:hAnsi="Courier New"/>
-          <w:sz w:val="14"/>
-        </w:rPr>
-        <w:t xml:space="preserve">            &lt;canvas id="podsvetka" width="1000" height="528" style="position: absolute; left: 0; top: 0; pointer-events: none;"&gt;&lt;/canvas&gt;</w:t>
-      </w:r>
-    </w:p>
-    <w:p>
-      <w:pPr>
-        <w:spacing w:line="240" w:lineRule="auto" w:after="0"/>
-        <w:shd w:val="clear" w:color="auto" w:fill="F2F2F2"/>
-      </w:pPr>
-      <w:r>
-        <w:rPr>
-          <w:rFonts w:ascii="Courier New" w:hAnsi="Courier New"/>
-          <w:sz w:val="14"/>
-        </w:rPr>
-        <w:t xml:space="preserve">        &lt;/span&gt;</w:t>
-      </w:r>
-    </w:p>
-    <w:p>
-      <w:pPr>
-        <w:spacing w:line="240" w:lineRule="auto" w:after="0"/>
-        <w:shd w:val="clear" w:color="auto" w:fill="F2F2F2"/>
-      </w:pPr>
-      <w:r>
-        <w:rPr>
-          <w:rFonts w:ascii="Courier New" w:hAnsi="Courier New"/>
-          <w:sz w:val="14"/>
-        </w:rPr>
-        <w:t xml:space="preserve">        &lt;/p&gt;</w:t>
-      </w:r>
-    </w:p>
-    <w:p>
-      <w:pPr>
-        <w:spacing w:line="240" w:lineRule="auto" w:after="0"/>
-        <w:shd w:val="clear" w:color="auto" w:fill="F2F2F2"/>
-      </w:pPr>
-      <w:r>
-        <w:rPr>
-          <w:rFonts w:ascii="Courier New" w:hAnsi="Courier New"/>
-          <w:sz w:val="14"/>
-        </w:rPr>
-        <w:t xml:space="preserve"> </w:t>
-      </w:r>
-    </w:p>
-    <w:p>
-      <w:pPr>
-        <w:spacing w:line="240" w:lineRule="auto" w:after="0"/>
-        <w:shd w:val="clear" w:color="auto" w:fill="F2F2F2"/>
-      </w:pPr>
-      <w:r>
-        <w:rPr>
-          <w:rFonts w:ascii="Courier New" w:hAnsi="Courier New"/>
-          <w:sz w:val="14"/>
-        </w:rPr>
-        <w:t xml:space="preserve">        &lt;h3&gt;Области на карте&lt;/h3&gt;</w:t>
-      </w:r>
-    </w:p>
-    <w:p>
-      <w:pPr>
-        <w:spacing w:line="240" w:lineRule="auto" w:after="0"/>
-        <w:shd w:val="clear" w:color="auto" w:fill="F2F2F2"/>
-      </w:pPr>
-      <w:r>
-        <w:rPr>
-          <w:rFonts w:ascii="Courier New" w:hAnsi="Courier New"/>
-          <w:sz w:val="14"/>
-        </w:rPr>
-        <w:t xml:space="preserve">        &lt;ol&gt;</w:t>
-      </w:r>
-    </w:p>
-    <w:p>
-      <w:pPr>
-        <w:spacing w:line="240" w:lineRule="auto" w:after="0"/>
-        <w:shd w:val="clear" w:color="auto" w:fill="F2F2F2"/>
-      </w:pPr>
-      <w:r>
-        <w:rPr>
-          <w:rFonts w:ascii="Courier New" w:hAnsi="Courier New"/>
-          <w:sz w:val="14"/>
-        </w:rPr>
-        <w:t xml:space="preserve">            &lt;li&gt;Чуйская область &amp;mdash; центр г. Бишкек&lt;/li&gt;</w:t>
-      </w:r>
-    </w:p>
-    <w:p>
-      <w:pPr>
-        <w:spacing w:line="240" w:lineRule="auto" w:after="0"/>
-        <w:shd w:val="clear" w:color="auto" w:fill="F2F2F2"/>
-      </w:pPr>
-      <w:r>
-        <w:rPr>
-          <w:rFonts w:ascii="Courier New" w:hAnsi="Courier New"/>
-          <w:sz w:val="14"/>
-        </w:rPr>
-        <w:t xml:space="preserve">            &lt;li&gt;Таласская область &amp;mdash; центр г. Талас&lt;/li&gt;</w:t>
-      </w:r>
-    </w:p>
-    <w:p>
-      <w:pPr>
-        <w:spacing w:line="240" w:lineRule="auto" w:after="0"/>
-        <w:shd w:val="clear" w:color="auto" w:fill="F2F2F2"/>
-      </w:pPr>
-      <w:r>
-        <w:rPr>
-          <w:rFonts w:ascii="Courier New" w:hAnsi="Courier New"/>
-          <w:sz w:val="14"/>
-        </w:rPr>
-        <w:t xml:space="preserve">            &lt;li&gt;Иссык-Кульская область &amp;mdash; центр г. Каракол&lt;/li&gt;</w:t>
-      </w:r>
-    </w:p>
-    <w:p>
-      <w:pPr>
-        <w:spacing w:line="240" w:lineRule="auto" w:after="0"/>
-        <w:shd w:val="clear" w:color="auto" w:fill="F2F2F2"/>
-      </w:pPr>
-      <w:r>
-        <w:rPr>
-          <w:rFonts w:ascii="Courier New" w:hAnsi="Courier New"/>
-          <w:sz w:val="14"/>
-        </w:rPr>
-        <w:t xml:space="preserve">            &lt;li&gt;Нарынская область &amp;mdash; центр г. Нарын&lt;/li&gt;</w:t>
-      </w:r>
-    </w:p>
-    <w:p>
-      <w:pPr>
-        <w:spacing w:line="240" w:lineRule="auto" w:after="0"/>
-        <w:shd w:val="clear" w:color="auto" w:fill="F2F2F2"/>
-      </w:pPr>
-      <w:r>
-        <w:rPr>
-          <w:rFonts w:ascii="Courier New" w:hAnsi="Courier New"/>
-          <w:sz w:val="14"/>
-        </w:rPr>
-        <w:t xml:space="preserve">            &lt;li&gt;Джалал-Абадская область &amp;mdash; центр г. Джалал-Абад&lt;/li&gt;</w:t>
-      </w:r>
-    </w:p>
-    <w:p>
-      <w:pPr>
-        <w:spacing w:line="240" w:lineRule="auto" w:after="0"/>
-        <w:shd w:val="clear" w:color="auto" w:fill="F2F2F2"/>
-      </w:pPr>
-      <w:r>
-        <w:rPr>
-          <w:rFonts w:ascii="Courier New" w:hAnsi="Courier New"/>
-          <w:sz w:val="14"/>
-        </w:rPr>
-        <w:t xml:space="preserve">            &lt;li&gt;Ошская область &amp;mdash; центр г. Ош&lt;/li&gt;</w:t>
-      </w:r>
-    </w:p>
-    <w:p>
-      <w:pPr>
-        <w:spacing w:line="240" w:lineRule="auto" w:after="0"/>
-        <w:shd w:val="clear" w:color="auto" w:fill="F2F2F2"/>
-      </w:pPr>
-      <w:r>
-        <w:rPr>
-          <w:rFonts w:ascii="Courier New" w:hAnsi="Courier New"/>
-          <w:sz w:val="14"/>
-        </w:rPr>
-        <w:t xml:space="preserve">            &lt;li&gt;Баткенская область &amp;mdash; центр г. Баткен&lt;/li&gt;</w:t>
-      </w:r>
-    </w:p>
-    <w:p>
-      <w:pPr>
-        <w:spacing w:line="240" w:lineRule="auto" w:after="0"/>
-        <w:shd w:val="clear" w:color="auto" w:fill="F2F2F2"/>
-      </w:pPr>
-      <w:r>
-        <w:rPr>
-          <w:rFonts w:ascii="Courier New" w:hAnsi="Courier New"/>
-          <w:sz w:val="14"/>
-        </w:rPr>
-        <w:t xml:space="preserve">        &lt;/ol&gt;</w:t>
-      </w:r>
-    </w:p>
-    <w:p>
-      <w:pPr>
-        <w:spacing w:line="240" w:lineRule="auto" w:after="0"/>
-        <w:shd w:val="clear" w:color="auto" w:fill="F2F2F2"/>
-      </w:pPr>
-      <w:r>
-        <w:rPr>
-          <w:rFonts w:ascii="Courier New" w:hAnsi="Courier New"/>
-          <w:sz w:val="14"/>
-        </w:rPr>
-        <w:t xml:space="preserve"> </w:t>
-      </w:r>
-    </w:p>
-    <w:p>
-      <w:pPr>
-        <w:spacing w:line="240" w:lineRule="auto" w:after="0"/>
-        <w:shd w:val="clear" w:color="auto" w:fill="F2F2F2"/>
-      </w:pPr>
-      <w:r>
-        <w:rPr>
-          <w:rFonts w:ascii="Courier New" w:hAnsi="Courier New"/>
-          <w:sz w:val="14"/>
-        </w:rPr>
         <w:t xml:space="preserve">        &lt;p align="center"&gt;&lt;a href="home.html"&gt;На главную&lt;/a&gt; | &lt;a href="menu.html"&gt;Картинка-меню&lt;/a&gt;&lt;/p&gt;</w:t>
-      </w:r>
-    </w:p>
-    <w:p>
-      <w:pPr>
-        <w:spacing w:line="240" w:lineRule="auto" w:after="0"/>
-        <w:shd w:val="clear" w:color="auto" w:fill="F2F2F2"/>
-      </w:pPr>
-      <w:r>
-        <w:rPr>
-          <w:rFonts w:ascii="Courier New" w:hAnsi="Courier New"/>
-          <w:sz w:val="14"/>
-        </w:rPr>
-        <w:t xml:space="preserve">        &lt;!-- Подсветка области при наведении --&gt;</w:t>
-      </w:r>
-    </w:p>
-    <w:p>
-      <w:pPr>
-        <w:spacing w:line="240" w:lineRule="auto" w:after="0"/>
-        <w:shd w:val="clear" w:color="auto" w:fill="F2F2F2"/>
-      </w:pPr>
-      <w:r>
-        <w:rPr>
-          <w:rFonts w:ascii="Courier New" w:hAnsi="Courier New"/>
-          <w:sz w:val="14"/>
-        </w:rPr>
-        <w:t xml:space="preserve">        &lt;script&gt;</w:t>
-      </w:r>
-    </w:p>
-    <w:p>
-      <w:pPr>
-        <w:spacing w:line="240" w:lineRule="auto" w:after="0"/>
-        <w:shd w:val="clear" w:color="auto" w:fill="F2F2F2"/>
-      </w:pPr>
-      <w:r>
-        <w:rPr>
-          <w:rFonts w:ascii="Courier New" w:hAnsi="Courier New"/>
-          <w:sz w:val="14"/>
-        </w:rPr>
-        <w:t xml:space="preserve">            var canvas = document.getElementById("podsvetka");</w:t>
-      </w:r>
-    </w:p>
-    <w:p>
-      <w:pPr>
-        <w:spacing w:line="240" w:lineRule="auto" w:after="0"/>
-        <w:shd w:val="clear" w:color="auto" w:fill="F2F2F2"/>
-      </w:pPr>
-      <w:r>
-        <w:rPr>
-          <w:rFonts w:ascii="Courier New" w:hAnsi="Courier New"/>
-          <w:sz w:val="14"/>
-        </w:rPr>
-        <w:t xml:space="preserve">            var ctx = canvas.getContext("2d");</w:t>
-      </w:r>
-    </w:p>
-    <w:p>
-      <w:pPr>
-        <w:spacing w:line="240" w:lineRule="auto" w:after="0"/>
-        <w:shd w:val="clear" w:color="auto" w:fill="F2F2F2"/>
-      </w:pPr>
-      <w:r>
-        <w:rPr>
-          <w:rFonts w:ascii="Courier New" w:hAnsi="Courier New"/>
-          <w:sz w:val="14"/>
-        </w:rPr>
-        <w:t xml:space="preserve">            var areas = document.getElementsByTagName("area");</w:t>
-      </w:r>
-    </w:p>
-    <w:p>
-      <w:pPr>
-        <w:spacing w:line="240" w:lineRule="auto" w:after="0"/>
-        <w:shd w:val="clear" w:color="auto" w:fill="F2F2F2"/>
-      </w:pPr>
-      <w:r>
-        <w:rPr>
-          <w:rFonts w:ascii="Courier New" w:hAnsi="Courier New"/>
-          <w:sz w:val="14"/>
-        </w:rPr>
-        <w:t xml:space="preserve">            for (var i = 0; i &lt; areas.length; i++) {</w:t>
-      </w:r>
-    </w:p>
-    <w:p>
-      <w:pPr>
-        <w:spacing w:line="240" w:lineRule="auto" w:after="0"/>
-        <w:shd w:val="clear" w:color="auto" w:fill="F2F2F2"/>
-      </w:pPr>
-      <w:r>
-        <w:rPr>
-          <w:rFonts w:ascii="Courier New" w:hAnsi="Courier New"/>
-          <w:sz w:val="14"/>
-        </w:rPr>
-        <w:t xml:space="preserve">                areas[i].onmouseover = function () {</w:t>
-      </w:r>
-    </w:p>
-    <w:p>
-      <w:pPr>
-        <w:spacing w:line="240" w:lineRule="auto" w:after="0"/>
-        <w:shd w:val="clear" w:color="auto" w:fill="F2F2F2"/>
-      </w:pPr>
-      <w:r>
-        <w:rPr>
-          <w:rFonts w:ascii="Courier New" w:hAnsi="Courier New"/>
-          <w:sz w:val="14"/>
-        </w:rPr>
-        <w:t xml:space="preserve">                    var c = this.coords.split(",");</w:t>
-      </w:r>
-    </w:p>
-    <w:p>
-      <w:pPr>
-        <w:spacing w:line="240" w:lineRule="auto" w:after="0"/>
-        <w:shd w:val="clear" w:color="auto" w:fill="F2F2F2"/>
-      </w:pPr>
-      <w:r>
-        <w:rPr>
-          <w:rFonts w:ascii="Courier New" w:hAnsi="Courier New"/>
-          <w:sz w:val="14"/>
-        </w:rPr>
-        <w:t xml:space="preserve">                    ctx.clearRect(0, 0, canvas.width, canvas.height);</w:t>
-      </w:r>
-    </w:p>
-    <w:p>
-      <w:pPr>
-        <w:spacing w:line="240" w:lineRule="auto" w:after="0"/>
-        <w:shd w:val="clear" w:color="auto" w:fill="F2F2F2"/>
-      </w:pPr>
-      <w:r>
-        <w:rPr>
-          <w:rFonts w:ascii="Courier New" w:hAnsi="Courier New"/>
-          <w:sz w:val="14"/>
-        </w:rPr>
-        <w:t xml:space="preserve">                    ctx.beginPath();</w:t>
-      </w:r>
-    </w:p>
-    <w:p>
-      <w:pPr>
-        <w:spacing w:line="240" w:lineRule="auto" w:after="0"/>
-        <w:shd w:val="clear" w:color="auto" w:fill="F2F2F2"/>
-      </w:pPr>
-      <w:r>
-        <w:rPr>
-          <w:rFonts w:ascii="Courier New" w:hAnsi="Courier New"/>
-          <w:sz w:val="14"/>
-        </w:rPr>
-        <w:t xml:space="preserve">                    ctx.moveTo(c[0], c[1]);</w:t>
-      </w:r>
-    </w:p>
-    <w:p>
-      <w:pPr>
-        <w:spacing w:line="240" w:lineRule="auto" w:after="0"/>
-        <w:shd w:val="clear" w:color="auto" w:fill="F2F2F2"/>
-      </w:pPr>
-      <w:r>
-        <w:rPr>
-          <w:rFonts w:ascii="Courier New" w:hAnsi="Courier New"/>
-          <w:sz w:val="14"/>
-        </w:rPr>
-        <w:t xml:space="preserve">                    for (var j = 2; j &lt; c.length; j += 2) {</w:t>
-      </w:r>
-    </w:p>
-    <w:p>
-      <w:pPr>
-        <w:spacing w:line="240" w:lineRule="auto" w:after="0"/>
-        <w:shd w:val="clear" w:color="auto" w:fill="F2F2F2"/>
-      </w:pPr>
-      <w:r>
-        <w:rPr>
-          <w:rFonts w:ascii="Courier New" w:hAnsi="Courier New"/>
-          <w:sz w:val="14"/>
-        </w:rPr>
-        <w:t xml:space="preserve">                        ctx.lineTo(c[j], c[j + 1]);</w:t>
-      </w:r>
-    </w:p>
-    <w:p>
-      <w:pPr>
-        <w:spacing w:line="240" w:lineRule="auto" w:after="0"/>
-        <w:shd w:val="clear" w:color="auto" w:fill="F2F2F2"/>
-      </w:pPr>
-      <w:r>
-        <w:rPr>
-          <w:rFonts w:ascii="Courier New" w:hAnsi="Courier New"/>
-          <w:sz w:val="14"/>
-        </w:rPr>
-        <w:t xml:space="preserve">                    }</w:t>
-      </w:r>
-    </w:p>
-    <w:p>
-      <w:pPr>
-        <w:spacing w:line="240" w:lineRule="auto" w:after="0"/>
-        <w:shd w:val="clear" w:color="auto" w:fill="F2F2F2"/>
-      </w:pPr>
-      <w:r>
-        <w:rPr>
-          <w:rFonts w:ascii="Courier New" w:hAnsi="Courier New"/>
-          <w:sz w:val="14"/>
-        </w:rPr>
-        <w:t xml:space="preserve">                    ctx.closePath();</w:t>
-      </w:r>
-    </w:p>
-    <w:p>
-      <w:pPr>
-        <w:spacing w:line="240" w:lineRule="auto" w:after="0"/>
-        <w:shd w:val="clear" w:color="auto" w:fill="F2F2F2"/>
-      </w:pPr>
-      <w:r>
-        <w:rPr>
-          <w:rFonts w:ascii="Courier New" w:hAnsi="Courier New"/>
-          <w:sz w:val="14"/>
-        </w:rPr>
-        <w:t xml:space="preserve">                    ctx.fillStyle = "rgba(255, 255, 255, 0.45)";</w:t>
-      </w:r>
-    </w:p>
-    <w:p>
-      <w:pPr>
-        <w:spacing w:line="240" w:lineRule="auto" w:after="0"/>
-        <w:shd w:val="clear" w:color="auto" w:fill="F2F2F2"/>
-      </w:pPr>
-      <w:r>
-        <w:rPr>
-          <w:rFonts w:ascii="Courier New" w:hAnsi="Courier New"/>
-          <w:sz w:val="14"/>
-        </w:rPr>
-        <w:t xml:space="preserve">                    ctx.fill();</w:t>
-      </w:r>
-    </w:p>
-    <w:p>
-      <w:pPr>
-        <w:spacing w:line="240" w:lineRule="auto" w:after="0"/>
-        <w:shd w:val="clear" w:color="auto" w:fill="F2F2F2"/>
-      </w:pPr>
-      <w:r>
-        <w:rPr>
-          <w:rFonts w:ascii="Courier New" w:hAnsi="Courier New"/>
-          <w:sz w:val="14"/>
-        </w:rPr>
-        <w:t xml:space="preserve">                    ctx.lineWidth = 3;</w:t>
-      </w:r>
-    </w:p>
-    <w:p>
-      <w:pPr>
-        <w:spacing w:line="240" w:lineRule="auto" w:after="0"/>
-        <w:shd w:val="clear" w:color="auto" w:fill="F2F2F2"/>
-      </w:pPr>
-      <w:r>
-        <w:rPr>
-          <w:rFonts w:ascii="Courier New" w:hAnsi="Courier New"/>
-          <w:sz w:val="14"/>
-        </w:rPr>
-        <w:t xml:space="preserve">                    ctx.strokeStyle = "#C00000";</w:t>
-      </w:r>
-    </w:p>
-    <w:p>
-      <w:pPr>
-        <w:spacing w:line="240" w:lineRule="auto" w:after="0"/>
-        <w:shd w:val="clear" w:color="auto" w:fill="F2F2F2"/>
-      </w:pPr>
-      <w:r>
-        <w:rPr>
-          <w:rFonts w:ascii="Courier New" w:hAnsi="Courier New"/>
-          <w:sz w:val="14"/>
-        </w:rPr>
-        <w:t xml:space="preserve">                    ctx.stroke();</w:t>
-      </w:r>
-    </w:p>
-    <w:p>
-      <w:pPr>
-        <w:spacing w:line="240" w:lineRule="auto" w:after="0"/>
-        <w:shd w:val="clear" w:color="auto" w:fill="F2F2F2"/>
-      </w:pPr>
-      <w:r>
-        <w:rPr>
-          <w:rFonts w:ascii="Courier New" w:hAnsi="Courier New"/>
-          <w:sz w:val="14"/>
-        </w:rPr>
-        <w:t xml:space="preserve">                };</w:t>
-      </w:r>
-    </w:p>
-    <w:p>
-      <w:pPr>
-        <w:spacing w:line="240" w:lineRule="auto" w:after="0"/>
-        <w:shd w:val="clear" w:color="auto" w:fill="F2F2F2"/>
-      </w:pPr>
-      <w:r>
-        <w:rPr>
-          <w:rFonts w:ascii="Courier New" w:hAnsi="Courier New"/>
-          <w:sz w:val="14"/>
-        </w:rPr>
-        <w:t xml:space="preserve">                areas[i].onmouseout = function () {</w:t>
-      </w:r>
-    </w:p>
-    <w:p>
-      <w:pPr>
-        <w:spacing w:line="240" w:lineRule="auto" w:after="0"/>
-        <w:shd w:val="clear" w:color="auto" w:fill="F2F2F2"/>
-      </w:pPr>
-      <w:r>
-        <w:rPr>
-          <w:rFonts w:ascii="Courier New" w:hAnsi="Courier New"/>
-          <w:sz w:val="14"/>
-        </w:rPr>
-        <w:t xml:space="preserve">                    ctx.clearRect(0, 0, canvas.width, canvas.height);</w:t>
-      </w:r>
-    </w:p>
-    <w:p>
-      <w:pPr>
-        <w:spacing w:line="240" w:lineRule="auto" w:after="0"/>
-        <w:shd w:val="clear" w:color="auto" w:fill="F2F2F2"/>
-      </w:pPr>
-      <w:r>
-        <w:rPr>
-          <w:rFonts w:ascii="Courier New" w:hAnsi="Courier New"/>
-          <w:sz w:val="14"/>
-        </w:rPr>
-        <w:t xml:space="preserve">                };</w:t>
-      </w:r>
-    </w:p>
-    <w:p>
-      <w:pPr>
-        <w:spacing w:line="240" w:lineRule="auto" w:after="0"/>
-        <w:shd w:val="clear" w:color="auto" w:fill="F2F2F2"/>
-      </w:pPr>
-      <w:r>
-        <w:rPr>
-          <w:rFonts w:ascii="Courier New" w:hAnsi="Courier New"/>
-          <w:sz w:val="14"/>
-        </w:rPr>
-        <w:t xml:space="preserve">            }</w:t>
-      </w:r>
-    </w:p>
-    <w:p>
-      <w:pPr>
-        <w:spacing w:line="240" w:lineRule="auto" w:after="0"/>
-        <w:shd w:val="clear" w:color="auto" w:fill="F2F2F2"/>
-      </w:pPr>
-      <w:r>
-        <w:rPr>
-          <w:rFonts w:ascii="Courier New" w:hAnsi="Courier New"/>
-          <w:sz w:val="14"/>
-        </w:rPr>
-        <w:t xml:space="preserve">        &lt;/script&gt;</w:t>
       </w:r>
     </w:p>
     <w:p>

</xml_diff>

<commit_message>
Report: title page faculty/department and ministry name as in previous report
</commit_message>
<xml_diff>
--- a/Отчет_ЛБ1_Суранбаев_Байтур.docx
+++ b/Отчет_ЛБ1_Суранбаев_Байтур.docx
@@ -13,7 +13,7 @@
           <w:b/>
           <w:i w:val="0"/>
         </w:rPr>
-        <w:t>МИНИСТЕРСТВО ОБРАЗОВАНИЯ И НАУКИ КЫРГЫЗСКОЙ РЕСПУБЛИКИ</w:t>
+        <w:t>МИНИСТЕРСТВО НАУКИ, ВЫСШЕГО ОБРАЗОВАНИЯ И ИННОВАЦИЙ КЫРГЫЗСКОЙ РЕСПУБЛИКИ</w:t>
       </w:r>
     </w:p>
     <w:p>
@@ -47,14 +47,30 @@
     <w:p>
       <w:pPr>
         <w:spacing w:after="0"/>
-        <w:jc w:val="both"/>
-      </w:pPr>
+        <w:ind/>
+        <w:jc w:val="center"/>
+      </w:pPr>
+      <w:r>
+        <w:rPr>
+          <w:b/>
+          <w:i w:val="0"/>
+        </w:rPr>
+        <w:t>Факультет информационных технологий</w:t>
+      </w:r>
     </w:p>
     <w:p>
       <w:pPr>
         <w:spacing w:after="0"/>
-        <w:jc w:val="both"/>
-      </w:pPr>
+        <w:ind/>
+        <w:jc w:val="center"/>
+      </w:pPr>
+      <w:r>
+        <w:rPr>
+          <w:b/>
+          <w:i w:val="0"/>
+        </w:rPr>
+        <w:t>Кафедра «Информатика и вычислительная техника»</w:t>
+      </w:r>
     </w:p>
     <w:p>
       <w:pPr>

</xml_diff>

<commit_message>
Task 6: hover highlight of oblasts (canvas+script, no methodology tag can do it); report updated
</commit_message>
<xml_diff>
--- a/Отчет_ЛБ1_Суранбаев_Байтур.docx
+++ b/Отчет_ЛБ1_Суранбаев_Байтур.docx
@@ -2497,7 +2497,7 @@
           <w:b w:val="0"/>
           <w:i w:val="0"/>
         </w:rPr>
-        <w:t>Для каждой области создан отдельный тег area с атрибутом shape="poly". Координаты coords подобраны точно по контуру области (от 110 до 240 вершин на область) так, чтобы охватывать всю область и не выходить за линию её границы (рисунок 9).</w:t>
+        <w:t>Для каждой области создан отдельный тег area с атрибутом shape="poly". Координаты coords подобраны точно по контуру области (от 110 до 240 вершин на область) так, чтобы охватывать всю область и не выходить за линию её границы (рисунки 9–10).</w:t>
       </w:r>
     </w:p>
     <w:p>
@@ -2524,6 +2524,19 @@
           <w:i w:val="0"/>
         </w:rPr>
         <w:t>Переход по областям не осуществляется – у каждого area указан атрибут nohref. Атрибут title содержит название области: при наведении указателя мыши появляется всплывающая подсказка с названием (рисунок 8).</w:t>
+      </w:r>
+    </w:p>
+    <w:p>
+      <w:pPr>
+        <w:pStyle w:val="ListBullet"/>
+        <w:jc w:val="both"/>
+      </w:pPr>
+      <w:r>
+        <w:rPr>
+          <w:b w:val="0"/>
+          <w:i w:val="0"/>
+        </w:rPr>
+        <w:t>Теги map и area сами по себе не выделяют область на картинке при наведении – браузер показывает только подсказку title. Других средств для этого в методичке нет, поэтому для выделения добавлен небольшой скрипт: поверх картинки размещён прозрачный элемент canvas, и при наведении на area (событие onmouseover) по координатам coords этой же области рисуется её контур красной линией с подсветкой; при уходе курсора (onmouseout) выделение убирается (рисунки 9–10). Сами области по-прежнему заданы только тегами area с shape="poly", coords, nohref и title.</w:t>
       </w:r>
     </w:p>
     <w:p>
@@ -2721,6 +2734,377 @@
           <w:sz w:val="18"/>
         </w:rPr>
         <w:t>&lt;/map&gt;</w:t>
+      </w:r>
+    </w:p>
+    <w:p>
+      <w:pPr>
+        <w:spacing w:after="80"/>
+      </w:pPr>
+    </w:p>
+    <w:p>
+      <w:pPr>
+        <w:keepNext/>
+        <w:spacing w:after="0"/>
+        <w:ind w:firstLine="709"/>
+        <w:jc w:val="both"/>
+      </w:pPr>
+      <w:r>
+        <w:rPr>
+          <w:b w:val="0"/>
+          <w:i/>
+        </w:rPr>
+        <w:t>Фрагмент кода (выделение области при наведении):</w:t>
+      </w:r>
+    </w:p>
+    <w:p>
+      <w:pPr>
+        <w:spacing w:line="240" w:lineRule="auto" w:after="0"/>
+        <w:shd w:val="clear" w:color="auto" w:fill="F2F2F2"/>
+      </w:pPr>
+      <w:r>
+        <w:rPr>
+          <w:rFonts w:ascii="Courier New" w:hAnsi="Courier New"/>
+          <w:sz w:val="18"/>
+        </w:rPr>
+        <w:t>&lt;canvas id="podsvetka" width="1000" height="528" style="position: absolute; left: 0; top: 0; pointer-events: none;"&gt;&lt;/canvas&gt;</w:t>
+      </w:r>
+    </w:p>
+    <w:p>
+      <w:pPr>
+        <w:spacing w:line="240" w:lineRule="auto" w:after="0"/>
+        <w:shd w:val="clear" w:color="auto" w:fill="F2F2F2"/>
+      </w:pPr>
+      <w:r>
+        <w:rPr>
+          <w:rFonts w:ascii="Courier New" w:hAnsi="Courier New"/>
+          <w:sz w:val="18"/>
+        </w:rPr>
+        <w:t>...</w:t>
+      </w:r>
+    </w:p>
+    <w:p>
+      <w:pPr>
+        <w:spacing w:line="240" w:lineRule="auto" w:after="0"/>
+        <w:shd w:val="clear" w:color="auto" w:fill="F2F2F2"/>
+      </w:pPr>
+      <w:r>
+        <w:rPr>
+          <w:rFonts w:ascii="Courier New" w:hAnsi="Courier New"/>
+          <w:sz w:val="18"/>
+        </w:rPr>
+        <w:t>&lt;script&gt;</w:t>
+      </w:r>
+    </w:p>
+    <w:p>
+      <w:pPr>
+        <w:spacing w:line="240" w:lineRule="auto" w:after="0"/>
+        <w:shd w:val="clear" w:color="auto" w:fill="F2F2F2"/>
+      </w:pPr>
+      <w:r>
+        <w:rPr>
+          <w:rFonts w:ascii="Courier New" w:hAnsi="Courier New"/>
+          <w:sz w:val="18"/>
+        </w:rPr>
+        <w:t xml:space="preserve">    var canvas = document.getElementById("podsvetka");</w:t>
+      </w:r>
+    </w:p>
+    <w:p>
+      <w:pPr>
+        <w:spacing w:line="240" w:lineRule="auto" w:after="0"/>
+        <w:shd w:val="clear" w:color="auto" w:fill="F2F2F2"/>
+      </w:pPr>
+      <w:r>
+        <w:rPr>
+          <w:rFonts w:ascii="Courier New" w:hAnsi="Courier New"/>
+          <w:sz w:val="18"/>
+        </w:rPr>
+        <w:t xml:space="preserve">    var ctx = canvas.getContext("2d");</w:t>
+      </w:r>
+    </w:p>
+    <w:p>
+      <w:pPr>
+        <w:spacing w:line="240" w:lineRule="auto" w:after="0"/>
+        <w:shd w:val="clear" w:color="auto" w:fill="F2F2F2"/>
+      </w:pPr>
+      <w:r>
+        <w:rPr>
+          <w:rFonts w:ascii="Courier New" w:hAnsi="Courier New"/>
+          <w:sz w:val="18"/>
+        </w:rPr>
+        <w:t xml:space="preserve">    var areas = document.getElementsByTagName("area");</w:t>
+      </w:r>
+    </w:p>
+    <w:p>
+      <w:pPr>
+        <w:spacing w:line="240" w:lineRule="auto" w:after="0"/>
+        <w:shd w:val="clear" w:color="auto" w:fill="F2F2F2"/>
+      </w:pPr>
+      <w:r>
+        <w:rPr>
+          <w:rFonts w:ascii="Courier New" w:hAnsi="Courier New"/>
+          <w:sz w:val="18"/>
+        </w:rPr>
+        <w:t xml:space="preserve">    for (var i = 0; i &lt; areas.length; i++) {</w:t>
+      </w:r>
+    </w:p>
+    <w:p>
+      <w:pPr>
+        <w:spacing w:line="240" w:lineRule="auto" w:after="0"/>
+        <w:shd w:val="clear" w:color="auto" w:fill="F2F2F2"/>
+      </w:pPr>
+      <w:r>
+        <w:rPr>
+          <w:rFonts w:ascii="Courier New" w:hAnsi="Courier New"/>
+          <w:sz w:val="18"/>
+        </w:rPr>
+        <w:t xml:space="preserve">        areas[i].onmouseover = function () {</w:t>
+      </w:r>
+    </w:p>
+    <w:p>
+      <w:pPr>
+        <w:spacing w:line="240" w:lineRule="auto" w:after="0"/>
+        <w:shd w:val="clear" w:color="auto" w:fill="F2F2F2"/>
+      </w:pPr>
+      <w:r>
+        <w:rPr>
+          <w:rFonts w:ascii="Courier New" w:hAnsi="Courier New"/>
+          <w:sz w:val="18"/>
+        </w:rPr>
+        <w:t xml:space="preserve">            var c = this.coords.split(",");</w:t>
+      </w:r>
+    </w:p>
+    <w:p>
+      <w:pPr>
+        <w:spacing w:line="240" w:lineRule="auto" w:after="0"/>
+        <w:shd w:val="clear" w:color="auto" w:fill="F2F2F2"/>
+      </w:pPr>
+      <w:r>
+        <w:rPr>
+          <w:rFonts w:ascii="Courier New" w:hAnsi="Courier New"/>
+          <w:sz w:val="18"/>
+        </w:rPr>
+        <w:t xml:space="preserve">            ctx.clearRect(0, 0, canvas.width, canvas.height);</w:t>
+      </w:r>
+    </w:p>
+    <w:p>
+      <w:pPr>
+        <w:spacing w:line="240" w:lineRule="auto" w:after="0"/>
+        <w:shd w:val="clear" w:color="auto" w:fill="F2F2F2"/>
+      </w:pPr>
+      <w:r>
+        <w:rPr>
+          <w:rFonts w:ascii="Courier New" w:hAnsi="Courier New"/>
+          <w:sz w:val="18"/>
+        </w:rPr>
+        <w:t xml:space="preserve">            ctx.beginPath();</w:t>
+      </w:r>
+    </w:p>
+    <w:p>
+      <w:pPr>
+        <w:spacing w:line="240" w:lineRule="auto" w:after="0"/>
+        <w:shd w:val="clear" w:color="auto" w:fill="F2F2F2"/>
+      </w:pPr>
+      <w:r>
+        <w:rPr>
+          <w:rFonts w:ascii="Courier New" w:hAnsi="Courier New"/>
+          <w:sz w:val="18"/>
+        </w:rPr>
+        <w:t xml:space="preserve">            ctx.moveTo(c[0], c[1]);</w:t>
+      </w:r>
+    </w:p>
+    <w:p>
+      <w:pPr>
+        <w:spacing w:line="240" w:lineRule="auto" w:after="0"/>
+        <w:shd w:val="clear" w:color="auto" w:fill="F2F2F2"/>
+      </w:pPr>
+      <w:r>
+        <w:rPr>
+          <w:rFonts w:ascii="Courier New" w:hAnsi="Courier New"/>
+          <w:sz w:val="18"/>
+        </w:rPr>
+        <w:t xml:space="preserve">            for (var j = 2; j &lt; c.length; j += 2) {</w:t>
+      </w:r>
+    </w:p>
+    <w:p>
+      <w:pPr>
+        <w:spacing w:line="240" w:lineRule="auto" w:after="0"/>
+        <w:shd w:val="clear" w:color="auto" w:fill="F2F2F2"/>
+      </w:pPr>
+      <w:r>
+        <w:rPr>
+          <w:rFonts w:ascii="Courier New" w:hAnsi="Courier New"/>
+          <w:sz w:val="18"/>
+        </w:rPr>
+        <w:t xml:space="preserve">                ctx.lineTo(c[j], c[j + 1]);</w:t>
+      </w:r>
+    </w:p>
+    <w:p>
+      <w:pPr>
+        <w:spacing w:line="240" w:lineRule="auto" w:after="0"/>
+        <w:shd w:val="clear" w:color="auto" w:fill="F2F2F2"/>
+      </w:pPr>
+      <w:r>
+        <w:rPr>
+          <w:rFonts w:ascii="Courier New" w:hAnsi="Courier New"/>
+          <w:sz w:val="18"/>
+        </w:rPr>
+        <w:t xml:space="preserve">            }</w:t>
+      </w:r>
+    </w:p>
+    <w:p>
+      <w:pPr>
+        <w:spacing w:line="240" w:lineRule="auto" w:after="0"/>
+        <w:shd w:val="clear" w:color="auto" w:fill="F2F2F2"/>
+      </w:pPr>
+      <w:r>
+        <w:rPr>
+          <w:rFonts w:ascii="Courier New" w:hAnsi="Courier New"/>
+          <w:sz w:val="18"/>
+        </w:rPr>
+        <w:t xml:space="preserve">            ctx.closePath();</w:t>
+      </w:r>
+    </w:p>
+    <w:p>
+      <w:pPr>
+        <w:spacing w:line="240" w:lineRule="auto" w:after="0"/>
+        <w:shd w:val="clear" w:color="auto" w:fill="F2F2F2"/>
+      </w:pPr>
+      <w:r>
+        <w:rPr>
+          <w:rFonts w:ascii="Courier New" w:hAnsi="Courier New"/>
+          <w:sz w:val="18"/>
+        </w:rPr>
+        <w:t xml:space="preserve">            ctx.fillStyle = "rgba(255, 255, 255, 0.45)";</w:t>
+      </w:r>
+    </w:p>
+    <w:p>
+      <w:pPr>
+        <w:spacing w:line="240" w:lineRule="auto" w:after="0"/>
+        <w:shd w:val="clear" w:color="auto" w:fill="F2F2F2"/>
+      </w:pPr>
+      <w:r>
+        <w:rPr>
+          <w:rFonts w:ascii="Courier New" w:hAnsi="Courier New"/>
+          <w:sz w:val="18"/>
+        </w:rPr>
+        <w:t xml:space="preserve">            ctx.fill();</w:t>
+      </w:r>
+    </w:p>
+    <w:p>
+      <w:pPr>
+        <w:spacing w:line="240" w:lineRule="auto" w:after="0"/>
+        <w:shd w:val="clear" w:color="auto" w:fill="F2F2F2"/>
+      </w:pPr>
+      <w:r>
+        <w:rPr>
+          <w:rFonts w:ascii="Courier New" w:hAnsi="Courier New"/>
+          <w:sz w:val="18"/>
+        </w:rPr>
+        <w:t xml:space="preserve">            ctx.lineWidth = 3;</w:t>
+      </w:r>
+    </w:p>
+    <w:p>
+      <w:pPr>
+        <w:spacing w:line="240" w:lineRule="auto" w:after="0"/>
+        <w:shd w:val="clear" w:color="auto" w:fill="F2F2F2"/>
+      </w:pPr>
+      <w:r>
+        <w:rPr>
+          <w:rFonts w:ascii="Courier New" w:hAnsi="Courier New"/>
+          <w:sz w:val="18"/>
+        </w:rPr>
+        <w:t xml:space="preserve">            ctx.strokeStyle = "#C00000";</w:t>
+      </w:r>
+    </w:p>
+    <w:p>
+      <w:pPr>
+        <w:spacing w:line="240" w:lineRule="auto" w:after="0"/>
+        <w:shd w:val="clear" w:color="auto" w:fill="F2F2F2"/>
+      </w:pPr>
+      <w:r>
+        <w:rPr>
+          <w:rFonts w:ascii="Courier New" w:hAnsi="Courier New"/>
+          <w:sz w:val="18"/>
+        </w:rPr>
+        <w:t xml:space="preserve">            ctx.stroke();</w:t>
+      </w:r>
+    </w:p>
+    <w:p>
+      <w:pPr>
+        <w:spacing w:line="240" w:lineRule="auto" w:after="0"/>
+        <w:shd w:val="clear" w:color="auto" w:fill="F2F2F2"/>
+      </w:pPr>
+      <w:r>
+        <w:rPr>
+          <w:rFonts w:ascii="Courier New" w:hAnsi="Courier New"/>
+          <w:sz w:val="18"/>
+        </w:rPr>
+        <w:t xml:space="preserve">        };</w:t>
+      </w:r>
+    </w:p>
+    <w:p>
+      <w:pPr>
+        <w:spacing w:line="240" w:lineRule="auto" w:after="0"/>
+        <w:shd w:val="clear" w:color="auto" w:fill="F2F2F2"/>
+      </w:pPr>
+      <w:r>
+        <w:rPr>
+          <w:rFonts w:ascii="Courier New" w:hAnsi="Courier New"/>
+          <w:sz w:val="18"/>
+        </w:rPr>
+        <w:t xml:space="preserve">        areas[i].onmouseout = function () {</w:t>
+      </w:r>
+    </w:p>
+    <w:p>
+      <w:pPr>
+        <w:spacing w:line="240" w:lineRule="auto" w:after="0"/>
+        <w:shd w:val="clear" w:color="auto" w:fill="F2F2F2"/>
+      </w:pPr>
+      <w:r>
+        <w:rPr>
+          <w:rFonts w:ascii="Courier New" w:hAnsi="Courier New"/>
+          <w:sz w:val="18"/>
+        </w:rPr>
+        <w:t xml:space="preserve">            ctx.clearRect(0, 0, canvas.width, canvas.height);</w:t>
+      </w:r>
+    </w:p>
+    <w:p>
+      <w:pPr>
+        <w:spacing w:line="240" w:lineRule="auto" w:after="0"/>
+        <w:shd w:val="clear" w:color="auto" w:fill="F2F2F2"/>
+      </w:pPr>
+      <w:r>
+        <w:rPr>
+          <w:rFonts w:ascii="Courier New" w:hAnsi="Courier New"/>
+          <w:sz w:val="18"/>
+        </w:rPr>
+        <w:t xml:space="preserve">        };</w:t>
+      </w:r>
+    </w:p>
+    <w:p>
+      <w:pPr>
+        <w:spacing w:line="240" w:lineRule="auto" w:after="0"/>
+        <w:shd w:val="clear" w:color="auto" w:fill="F2F2F2"/>
+      </w:pPr>
+      <w:r>
+        <w:rPr>
+          <w:rFonts w:ascii="Courier New" w:hAnsi="Courier New"/>
+          <w:sz w:val="18"/>
+        </w:rPr>
+        <w:t xml:space="preserve">    }</w:t>
+      </w:r>
+    </w:p>
+    <w:p>
+      <w:pPr>
+        <w:spacing w:line="240" w:lineRule="auto" w:after="0"/>
+        <w:shd w:val="clear" w:color="auto" w:fill="F2F2F2"/>
+      </w:pPr>
+      <w:r>
+        <w:rPr>
+          <w:rFonts w:ascii="Courier New" w:hAnsi="Courier New"/>
+          <w:sz w:val="18"/>
+        </w:rPr>
+        <w:t>&lt;/script&gt;</w:t>
       </w:r>
     </w:p>
     <w:p>
@@ -3239,7 +3623,62 @@
           <w:i/>
           <w:sz w:val="24"/>
         </w:rPr>
-        <w:t>Рисунок 9 – Задание 6. Контуры областей по координатам coords (обведены линией для проверки) – не выходят за границы областей</w:t>
+        <w:t>Рисунок 9 – Задание 6. Выделение Чуйской области при наведении указателя мыши</w:t>
+      </w:r>
+    </w:p>
+    <w:p>
+      <w:pPr>
+        <w:keepNext/>
+        <w:jc w:val="center"/>
+      </w:pPr>
+      <w:r>
+        <w:drawing>
+          <wp:inline xmlns:a="http://schemas.openxmlformats.org/drawingml/2006/main" xmlns:pic="http://schemas.openxmlformats.org/drawingml/2006/picture">
+            <wp:extent cx="5760000" cy="3041280"/>
+            <wp:docPr id="10" name="Picture 10"/>
+            <wp:cNvGraphicFramePr>
+              <a:graphicFrameLocks noChangeAspect="1"/>
+            </wp:cNvGraphicFramePr>
+            <a:graphic>
+              <a:graphicData uri="http://schemas.openxmlformats.org/drawingml/2006/picture">
+                <pic:pic>
+                  <pic:nvPicPr>
+                    <pic:cNvPr id="0" name="lab2_karta_oblast2.jpg"/>
+                    <pic:cNvPicPr/>
+                  </pic:nvPicPr>
+                  <pic:blipFill>
+                    <a:blip r:embed="rId18"/>
+                    <a:stretch>
+                      <a:fillRect/>
+                    </a:stretch>
+                  </pic:blipFill>
+                  <pic:spPr>
+                    <a:xfrm>
+                      <a:off x="0" y="0"/>
+                      <a:ext cx="5760000" cy="3041280"/>
+                    </a:xfrm>
+                    <a:prstGeom prst="rect"/>
+                  </pic:spPr>
+                </pic:pic>
+              </a:graphicData>
+            </a:graphic>
+          </wp:inline>
+        </w:drawing>
+      </w:r>
+    </w:p>
+    <w:p>
+      <w:pPr>
+        <w:spacing w:after="160"/>
+        <w:ind/>
+        <w:jc w:val="center"/>
+      </w:pPr>
+      <w:r>
+        <w:rPr>
+          <w:b w:val="0"/>
+          <w:i/>
+          <w:sz w:val="24"/>
+        </w:rPr>
+        <w:t>Рисунок 10 – Задание 6. Выделение Баткенской области при наведении указателя мыши</w:t>
       </w:r>
     </w:p>
     <w:p>
@@ -6905,6 +7344,19 @@
           <w:rFonts w:ascii="Courier New" w:hAnsi="Courier New"/>
           <w:sz w:val="14"/>
         </w:rPr>
+        <w:t xml:space="preserve">        &lt;span style="position: relative; display: inline-block;"&gt;</w:t>
+      </w:r>
+    </w:p>
+    <w:p>
+      <w:pPr>
+        <w:spacing w:line="240" w:lineRule="auto" w:after="0"/>
+        <w:shd w:val="clear" w:color="auto" w:fill="F2F2F2"/>
+      </w:pPr>
+      <w:r>
+        <w:rPr>
+          <w:rFonts w:ascii="Courier New" w:hAnsi="Courier New"/>
+          <w:sz w:val="14"/>
+        </w:rPr>
         <w:t xml:space="preserve">            &lt;img src="images/karta.jpg" width="1000" height="528" usemap="#oblasti" border="0"</w:t>
       </w:r>
     </w:p>
@@ -8816,6 +9268,32 @@
           <w:rFonts w:ascii="Courier New" w:hAnsi="Courier New"/>
           <w:sz w:val="14"/>
         </w:rPr>
+        <w:t xml:space="preserve">            &lt;canvas id="podsvetka" width="1000" height="528" style="position: absolute; left: 0; top: 0; pointer-events: none;"&gt;&lt;/canvas&gt;</w:t>
+      </w:r>
+    </w:p>
+    <w:p>
+      <w:pPr>
+        <w:spacing w:line="240" w:lineRule="auto" w:after="0"/>
+        <w:shd w:val="clear" w:color="auto" w:fill="F2F2F2"/>
+      </w:pPr>
+      <w:r>
+        <w:rPr>
+          <w:rFonts w:ascii="Courier New" w:hAnsi="Courier New"/>
+          <w:sz w:val="14"/>
+        </w:rPr>
+        <w:t xml:space="preserve">        &lt;/span&gt;</w:t>
+      </w:r>
+    </w:p>
+    <w:p>
+      <w:pPr>
+        <w:spacing w:line="240" w:lineRule="auto" w:after="0"/>
+        <w:shd w:val="clear" w:color="auto" w:fill="F2F2F2"/>
+      </w:pPr>
+      <w:r>
+        <w:rPr>
+          <w:rFonts w:ascii="Courier New" w:hAnsi="Courier New"/>
+          <w:sz w:val="14"/>
+        </w:rPr>
         <w:t xml:space="preserve">        &lt;/p&gt;</w:t>
       </w:r>
     </w:p>
@@ -8986,6 +9464,331 @@
           <w:sz w:val="14"/>
         </w:rPr>
         <w:t xml:space="preserve">        &lt;p align="center"&gt;&lt;a href="home.html"&gt;На главную&lt;/a&gt; | &lt;a href="menu.html"&gt;Картинка-меню&lt;/a&gt;&lt;/p&gt;</w:t>
+      </w:r>
+    </w:p>
+    <w:p>
+      <w:pPr>
+        <w:spacing w:line="240" w:lineRule="auto" w:after="0"/>
+        <w:shd w:val="clear" w:color="auto" w:fill="F2F2F2"/>
+      </w:pPr>
+      <w:r>
+        <w:rPr>
+          <w:rFonts w:ascii="Courier New" w:hAnsi="Courier New"/>
+          <w:sz w:val="14"/>
+        </w:rPr>
+        <w:t xml:space="preserve">        &lt;script&gt;</w:t>
+      </w:r>
+    </w:p>
+    <w:p>
+      <w:pPr>
+        <w:spacing w:line="240" w:lineRule="auto" w:after="0"/>
+        <w:shd w:val="clear" w:color="auto" w:fill="F2F2F2"/>
+      </w:pPr>
+      <w:r>
+        <w:rPr>
+          <w:rFonts w:ascii="Courier New" w:hAnsi="Courier New"/>
+          <w:sz w:val="14"/>
+        </w:rPr>
+        <w:t xml:space="preserve">            var canvas = document.getElementById("podsvetka");</w:t>
+      </w:r>
+    </w:p>
+    <w:p>
+      <w:pPr>
+        <w:spacing w:line="240" w:lineRule="auto" w:after="0"/>
+        <w:shd w:val="clear" w:color="auto" w:fill="F2F2F2"/>
+      </w:pPr>
+      <w:r>
+        <w:rPr>
+          <w:rFonts w:ascii="Courier New" w:hAnsi="Courier New"/>
+          <w:sz w:val="14"/>
+        </w:rPr>
+        <w:t xml:space="preserve">            var ctx = canvas.getContext("2d");</w:t>
+      </w:r>
+    </w:p>
+    <w:p>
+      <w:pPr>
+        <w:spacing w:line="240" w:lineRule="auto" w:after="0"/>
+        <w:shd w:val="clear" w:color="auto" w:fill="F2F2F2"/>
+      </w:pPr>
+      <w:r>
+        <w:rPr>
+          <w:rFonts w:ascii="Courier New" w:hAnsi="Courier New"/>
+          <w:sz w:val="14"/>
+        </w:rPr>
+        <w:t xml:space="preserve">            var areas = document.getElementsByTagName("area");</w:t>
+      </w:r>
+    </w:p>
+    <w:p>
+      <w:pPr>
+        <w:spacing w:line="240" w:lineRule="auto" w:after="0"/>
+        <w:shd w:val="clear" w:color="auto" w:fill="F2F2F2"/>
+      </w:pPr>
+      <w:r>
+        <w:rPr>
+          <w:rFonts w:ascii="Courier New" w:hAnsi="Courier New"/>
+          <w:sz w:val="14"/>
+        </w:rPr>
+        <w:t xml:space="preserve">            for (var i = 0; i &lt; areas.length; i++) {</w:t>
+      </w:r>
+    </w:p>
+    <w:p>
+      <w:pPr>
+        <w:spacing w:line="240" w:lineRule="auto" w:after="0"/>
+        <w:shd w:val="clear" w:color="auto" w:fill="F2F2F2"/>
+      </w:pPr>
+      <w:r>
+        <w:rPr>
+          <w:rFonts w:ascii="Courier New" w:hAnsi="Courier New"/>
+          <w:sz w:val="14"/>
+        </w:rPr>
+        <w:t xml:space="preserve">                areas[i].onmouseover = function () {</w:t>
+      </w:r>
+    </w:p>
+    <w:p>
+      <w:pPr>
+        <w:spacing w:line="240" w:lineRule="auto" w:after="0"/>
+        <w:shd w:val="clear" w:color="auto" w:fill="F2F2F2"/>
+      </w:pPr>
+      <w:r>
+        <w:rPr>
+          <w:rFonts w:ascii="Courier New" w:hAnsi="Courier New"/>
+          <w:sz w:val="14"/>
+        </w:rPr>
+        <w:t xml:space="preserve">                    var c = this.coords.split(",");</w:t>
+      </w:r>
+    </w:p>
+    <w:p>
+      <w:pPr>
+        <w:spacing w:line="240" w:lineRule="auto" w:after="0"/>
+        <w:shd w:val="clear" w:color="auto" w:fill="F2F2F2"/>
+      </w:pPr>
+      <w:r>
+        <w:rPr>
+          <w:rFonts w:ascii="Courier New" w:hAnsi="Courier New"/>
+          <w:sz w:val="14"/>
+        </w:rPr>
+        <w:t xml:space="preserve">                    ctx.clearRect(0, 0, canvas.width, canvas.height);</w:t>
+      </w:r>
+    </w:p>
+    <w:p>
+      <w:pPr>
+        <w:spacing w:line="240" w:lineRule="auto" w:after="0"/>
+        <w:shd w:val="clear" w:color="auto" w:fill="F2F2F2"/>
+      </w:pPr>
+      <w:r>
+        <w:rPr>
+          <w:rFonts w:ascii="Courier New" w:hAnsi="Courier New"/>
+          <w:sz w:val="14"/>
+        </w:rPr>
+        <w:t xml:space="preserve">                    ctx.beginPath();</w:t>
+      </w:r>
+    </w:p>
+    <w:p>
+      <w:pPr>
+        <w:spacing w:line="240" w:lineRule="auto" w:after="0"/>
+        <w:shd w:val="clear" w:color="auto" w:fill="F2F2F2"/>
+      </w:pPr>
+      <w:r>
+        <w:rPr>
+          <w:rFonts w:ascii="Courier New" w:hAnsi="Courier New"/>
+          <w:sz w:val="14"/>
+        </w:rPr>
+        <w:t xml:space="preserve">                    ctx.moveTo(c[0], c[1]);</w:t>
+      </w:r>
+    </w:p>
+    <w:p>
+      <w:pPr>
+        <w:spacing w:line="240" w:lineRule="auto" w:after="0"/>
+        <w:shd w:val="clear" w:color="auto" w:fill="F2F2F2"/>
+      </w:pPr>
+      <w:r>
+        <w:rPr>
+          <w:rFonts w:ascii="Courier New" w:hAnsi="Courier New"/>
+          <w:sz w:val="14"/>
+        </w:rPr>
+        <w:t xml:space="preserve">                    for (var j = 2; j &lt; c.length; j += 2) {</w:t>
+      </w:r>
+    </w:p>
+    <w:p>
+      <w:pPr>
+        <w:spacing w:line="240" w:lineRule="auto" w:after="0"/>
+        <w:shd w:val="clear" w:color="auto" w:fill="F2F2F2"/>
+      </w:pPr>
+      <w:r>
+        <w:rPr>
+          <w:rFonts w:ascii="Courier New" w:hAnsi="Courier New"/>
+          <w:sz w:val="14"/>
+        </w:rPr>
+        <w:t xml:space="preserve">                        ctx.lineTo(c[j], c[j + 1]);</w:t>
+      </w:r>
+    </w:p>
+    <w:p>
+      <w:pPr>
+        <w:spacing w:line="240" w:lineRule="auto" w:after="0"/>
+        <w:shd w:val="clear" w:color="auto" w:fill="F2F2F2"/>
+      </w:pPr>
+      <w:r>
+        <w:rPr>
+          <w:rFonts w:ascii="Courier New" w:hAnsi="Courier New"/>
+          <w:sz w:val="14"/>
+        </w:rPr>
+        <w:t xml:space="preserve">                    }</w:t>
+      </w:r>
+    </w:p>
+    <w:p>
+      <w:pPr>
+        <w:spacing w:line="240" w:lineRule="auto" w:after="0"/>
+        <w:shd w:val="clear" w:color="auto" w:fill="F2F2F2"/>
+      </w:pPr>
+      <w:r>
+        <w:rPr>
+          <w:rFonts w:ascii="Courier New" w:hAnsi="Courier New"/>
+          <w:sz w:val="14"/>
+        </w:rPr>
+        <w:t xml:space="preserve">                    ctx.closePath();</w:t>
+      </w:r>
+    </w:p>
+    <w:p>
+      <w:pPr>
+        <w:spacing w:line="240" w:lineRule="auto" w:after="0"/>
+        <w:shd w:val="clear" w:color="auto" w:fill="F2F2F2"/>
+      </w:pPr>
+      <w:r>
+        <w:rPr>
+          <w:rFonts w:ascii="Courier New" w:hAnsi="Courier New"/>
+          <w:sz w:val="14"/>
+        </w:rPr>
+        <w:t xml:space="preserve">                    ctx.fillStyle = "rgba(255, 255, 255, 0.45)";</w:t>
+      </w:r>
+    </w:p>
+    <w:p>
+      <w:pPr>
+        <w:spacing w:line="240" w:lineRule="auto" w:after="0"/>
+        <w:shd w:val="clear" w:color="auto" w:fill="F2F2F2"/>
+      </w:pPr>
+      <w:r>
+        <w:rPr>
+          <w:rFonts w:ascii="Courier New" w:hAnsi="Courier New"/>
+          <w:sz w:val="14"/>
+        </w:rPr>
+        <w:t xml:space="preserve">                    ctx.fill();</w:t>
+      </w:r>
+    </w:p>
+    <w:p>
+      <w:pPr>
+        <w:spacing w:line="240" w:lineRule="auto" w:after="0"/>
+        <w:shd w:val="clear" w:color="auto" w:fill="F2F2F2"/>
+      </w:pPr>
+      <w:r>
+        <w:rPr>
+          <w:rFonts w:ascii="Courier New" w:hAnsi="Courier New"/>
+          <w:sz w:val="14"/>
+        </w:rPr>
+        <w:t xml:space="preserve">                    ctx.lineWidth = 3;</w:t>
+      </w:r>
+    </w:p>
+    <w:p>
+      <w:pPr>
+        <w:spacing w:line="240" w:lineRule="auto" w:after="0"/>
+        <w:shd w:val="clear" w:color="auto" w:fill="F2F2F2"/>
+      </w:pPr>
+      <w:r>
+        <w:rPr>
+          <w:rFonts w:ascii="Courier New" w:hAnsi="Courier New"/>
+          <w:sz w:val="14"/>
+        </w:rPr>
+        <w:t xml:space="preserve">                    ctx.strokeStyle = "#C00000";</w:t>
+      </w:r>
+    </w:p>
+    <w:p>
+      <w:pPr>
+        <w:spacing w:line="240" w:lineRule="auto" w:after="0"/>
+        <w:shd w:val="clear" w:color="auto" w:fill="F2F2F2"/>
+      </w:pPr>
+      <w:r>
+        <w:rPr>
+          <w:rFonts w:ascii="Courier New" w:hAnsi="Courier New"/>
+          <w:sz w:val="14"/>
+        </w:rPr>
+        <w:t xml:space="preserve">                    ctx.stroke();</w:t>
+      </w:r>
+    </w:p>
+    <w:p>
+      <w:pPr>
+        <w:spacing w:line="240" w:lineRule="auto" w:after="0"/>
+        <w:shd w:val="clear" w:color="auto" w:fill="F2F2F2"/>
+      </w:pPr>
+      <w:r>
+        <w:rPr>
+          <w:rFonts w:ascii="Courier New" w:hAnsi="Courier New"/>
+          <w:sz w:val="14"/>
+        </w:rPr>
+        <w:t xml:space="preserve">                };</w:t>
+      </w:r>
+    </w:p>
+    <w:p>
+      <w:pPr>
+        <w:spacing w:line="240" w:lineRule="auto" w:after="0"/>
+        <w:shd w:val="clear" w:color="auto" w:fill="F2F2F2"/>
+      </w:pPr>
+      <w:r>
+        <w:rPr>
+          <w:rFonts w:ascii="Courier New" w:hAnsi="Courier New"/>
+          <w:sz w:val="14"/>
+        </w:rPr>
+        <w:t xml:space="preserve">                areas[i].onmouseout = function () {</w:t>
+      </w:r>
+    </w:p>
+    <w:p>
+      <w:pPr>
+        <w:spacing w:line="240" w:lineRule="auto" w:after="0"/>
+        <w:shd w:val="clear" w:color="auto" w:fill="F2F2F2"/>
+      </w:pPr>
+      <w:r>
+        <w:rPr>
+          <w:rFonts w:ascii="Courier New" w:hAnsi="Courier New"/>
+          <w:sz w:val="14"/>
+        </w:rPr>
+        <w:t xml:space="preserve">                    ctx.clearRect(0, 0, canvas.width, canvas.height);</w:t>
+      </w:r>
+    </w:p>
+    <w:p>
+      <w:pPr>
+        <w:spacing w:line="240" w:lineRule="auto" w:after="0"/>
+        <w:shd w:val="clear" w:color="auto" w:fill="F2F2F2"/>
+      </w:pPr>
+      <w:r>
+        <w:rPr>
+          <w:rFonts w:ascii="Courier New" w:hAnsi="Courier New"/>
+          <w:sz w:val="14"/>
+        </w:rPr>
+        <w:t xml:space="preserve">                };</w:t>
+      </w:r>
+    </w:p>
+    <w:p>
+      <w:pPr>
+        <w:spacing w:line="240" w:lineRule="auto" w:after="0"/>
+        <w:shd w:val="clear" w:color="auto" w:fill="F2F2F2"/>
+      </w:pPr>
+      <w:r>
+        <w:rPr>
+          <w:rFonts w:ascii="Courier New" w:hAnsi="Courier New"/>
+          <w:sz w:val="14"/>
+        </w:rPr>
+        <w:t xml:space="preserve">            }</w:t>
+      </w:r>
+    </w:p>
+    <w:p>
+      <w:pPr>
+        <w:spacing w:line="240" w:lineRule="auto" w:after="0"/>
+        <w:shd w:val="clear" w:color="auto" w:fill="F2F2F2"/>
+      </w:pPr>
+      <w:r>
+        <w:rPr>
+          <w:rFonts w:ascii="Courier New" w:hAnsi="Courier New"/>
+          <w:sz w:val="14"/>
+        </w:rPr>
+        <w:t xml:space="preserve">        &lt;/script&gt;</w:t>
       </w:r>
     </w:p>
     <w:p>

</xml_diff>